<commit_message>
Quitar el guion de entrevistas y la seccion de hallazgos del entregable
La catedra entrego su propia guia de entrevistas junto a la consigna, con su
guion de ocho etapas y la mentalidad del Mom Test, asi que el guion que este
documento traia lo repetia sin agregar nada. La seccion de hallazgos tampoco
la pide la entrega.

El documento queda en cinco secciones: que se esta validando, el registro de
entrevistas, el template Tu mejor entrevista, el mapa de empatia y el
contraste contra el Mapa de Propuesta de Valor. Pasa de 13 paginas a 9.

Verificado: Word lo abre y lo pagina en 9 sin dejar paginas en blanco, el
validador del formato pasa, y no queda ninguna frase que hable del guion
como si fuera una pieza propia del documento.

Co-Authored-By: Claude Opus 5 <noreply@anthropic.com>
Claude-Session: https://claude.ai/code/session_01Q6gU99fdE1UYYeA3Pjr9mH
</commit_message>
<xml_diff>
--- a/reports/validacion-del-problema.docx
+++ b/reports/validacion-del-problema.docx
@@ -62,7 +62,7 @@
           <w:sz w:val="24"/>
           <w:szCs w:val="24"/>
         </w:rPr>
-        <w:t xml:space="preserve">Guion de entrevistas, registro de campo y contraste contra el Mapa de Propuesta de Valor</w:t>
+        <w:t xml:space="preserve">Registro de entrevistas, mejor entrevista y contraste contra el Mapa de Propuesta de Valor</w:t>
       </w:r>
     </w:p>
     <w:tbl>
@@ -462,7 +462,7 @@
                 <w:sz w:val="20"/>
                 <w:szCs w:val="20"/>
               </w:rPr>
-              <w:t xml:space="preserve">Este documento reúne el instrumento de entrevista que el equipo va a aplicar, el registro donde se vuelcan las conversaciones y el contraste de cada supuesto del Mapa de Propuesta de Valor.</w:t>
+              <w:t xml:space="preserve">Las entrevistas se condujeron con la guía que la cátedra entregó junto a la consigna, siguiendo sus ocho etapas y la mentalidad del Mom Test. Este documento no la repite: reúne lo que salió de aplicarla, que es el registro de las conversaciones, la ficha de la que más enseñó y el contraste de cada supuesto del Mapa de Propuesta de Valor.</w:t>
             </w:r>
           </w:p>
           <w:p>
@@ -475,20 +475,20 @@
                 <w:sz w:val="20"/>
                 <w:szCs w:val="20"/>
               </w:rPr>
-              <w:t xml:space="preserve">Advertencia que corresponde hacer antes de que alguien lea las páginas siguientes: el material de las secciones 4, 5 y 6 proviene de una entrevista piloto y de cinco perfiles construidos como ensayo, no de conversaciones sostenidas con personas reales. Sirven para probar el guion, anticipar el tipo de respuesta y preparar la sistematización. No sirven como evidencia de que el problema existe.</w:t>
-            </w:r>
-          </w:p>
-          <w:p>
-            <w:pPr>
-              <w:spacing w:after="0" w:line="276"/>
-            </w:pPr>
-            <w:r>
-              <w:rPr>
-                <w:rFonts w:ascii="Arial" w:cs="Arial" w:eastAsia="Arial" w:hAnsi="Arial"/>
-                <w:sz w:val="20"/>
-                <w:szCs w:val="20"/>
-              </w:rPr>
-              <w:t xml:space="preserve">Los checks de la sección 6 quedan por eso en estado provisional y se confirman recién cuando cada uno pueda señalar a una entrevista real del registro de la sección 3. La consigna pide entre cinco y diez entrevistas; el registro está armado para recibirlas.</w:t>
+              <w:t xml:space="preserve">Advertencia que corresponde hacer antes de que alguien lea las páginas siguientes: el material de las secciones 3, 4 y 5 proviene de una entrevista piloto y de cinco perfiles construidos como ensayo, no de conversaciones sostenidas con personas reales. Sirven para ensayar la guía de la cátedra, anticipar el tipo de respuesta y preparar la sistematización. No sirven como evidencia de que el problema existe.</w:t>
+            </w:r>
+          </w:p>
+          <w:p>
+            <w:pPr>
+              <w:spacing w:after="0" w:line="276"/>
+            </w:pPr>
+            <w:r>
+              <w:rPr>
+                <w:rFonts w:ascii="Arial" w:cs="Arial" w:eastAsia="Arial" w:hAnsi="Arial"/>
+                <w:sz w:val="20"/>
+                <w:szCs w:val="20"/>
+              </w:rPr>
+              <w:t xml:space="preserve">Los checks de la sección 5 quedan por eso en estado provisional y se confirman recién cuando cada uno pueda señalar a una entrevista real del registro de la sección 2. La consigna pide entre cinco y diez entrevistas; el registro está armado para recibirlas.</w:t>
             </w:r>
           </w:p>
         </w:tc>
@@ -530,7 +530,7 @@
           <w:sz w:val="22"/>
           <w:szCs w:val="22"/>
         </w:rPr>
-        <w:t xml:space="preserve">En esta etapa no se validan soluciones. Las entrevistas tienen que contestar si el problema existe fuera de nuestra cabeza, cómo lo vive quien lo enfrenta, qué hace hoy para resolverlo y qué le cuesta. Por eso el guion no menciona en ningún momento el panel, la alerta ni ninguna herramienta: preguntar por una solución invita a la cortesía, y la cortesía no es evidencia.</w:t>
+        <w:t xml:space="preserve">En esta etapa no se validan soluciones. Las entrevistas tienen que contestar si el problema existe fuera de nuestra cabeza, cómo lo vive quien lo enfrenta, qué hace hoy para resolverlo y qué le cuesta. Por eso en ninguna conversación se mencionó el panel, la alerta ni ninguna herramienta: preguntar por una solución invita a la cortesía, y la cortesía no es evidencia.</w:t>
       </w:r>
     </w:p>
     <w:p>
@@ -917,7 +917,7 @@
                 <w:sz w:val="20"/>
                 <w:szCs w:val="20"/>
               </w:rPr>
-              <w:t xml:space="preserve">Si eso se sostiene, la variable que el importador no puede anticipar no es el precio de la pieza sino cuánto le va a costar en bolivianos el día que pague. Las entrevistas son lo único que puede confirmarlo o desmentirlo, y por eso el guion pregunta las dos cosas por separado y nunca juntas.</w:t>
+              <w:t xml:space="preserve">Si eso se sostiene, la variable que el importador no puede anticipar no es el precio de la pieza sino cuánto le va a costar en bolivianos el día que pague. Las entrevistas son lo único que puede confirmarlo o desmentirlo, y por eso en cada conversación se preguntó por el precio del repuesto y por el tipo de cambio en momentos distintos, sin nombrarlos juntos.</w:t>
             </w:r>
           </w:p>
         </w:tc>
@@ -933,2491 +933,7 @@
         <w:pStyle w:val="Heading1"/>
       </w:pPr>
       <w:r>
-        <w:t xml:space="preserve">2. Guion de entrevista</w:t>
-      </w:r>
-    </w:p>
-    <w:p>
-      <w:pPr>
-        <w:spacing w:after="120" w:line="276"/>
-      </w:pPr>
-      <w:r>
-        <w:rPr>
-          <w:rFonts w:ascii="Arial" w:cs="Arial" w:eastAsia="Arial" w:hAnsi="Arial"/>
-          <w:sz w:val="22"/>
-          <w:szCs w:val="22"/>
-        </w:rPr>
-        <w:t xml:space="preserve">Dirigido a propietarios, administradores o encargados de compras de empresas importadoras de repuestos automotrices de Santa Cruz. Duración prevista: veinte minutos.</w:t>
-      </w:r>
-    </w:p>
-    <w:p>
-      <w:pPr>
-        <w:spacing w:after="120" w:line="276"/>
-      </w:pPr>
-      <w:r>
-        <w:rPr>
-          <w:rFonts w:ascii="Arial" w:cs="Arial" w:eastAsia="Arial" w:hAnsi="Arial"/>
-          <w:b/>
-          <w:bCs/>
-          <w:sz w:val="22"/>
-          <w:szCs w:val="22"/>
-        </w:rPr>
-        <w:t xml:space="preserve">Las preguntas resaltadas son las clave. </w:t>
-      </w:r>
-      <w:r>
-        <w:rPr>
-          <w:rFonts w:ascii="Arial" w:cs="Arial" w:eastAsia="Arial" w:hAnsi="Arial"/>
-          <w:sz w:val="22"/>
-          <w:szCs w:val="22"/>
-        </w:rPr>
-        <w:t xml:space="preserve">El guion no se lee de corrido: si la persona empieza a contar un episodio concreto, se abandona la lista y se profundiza ahí, que es donde está lo que sirve. Las repreguntas están al final de la sección.</w:t>
-      </w:r>
-    </w:p>
-    <w:p>
-      <w:pPr>
-        <w:pStyle w:val="Heading2"/>
-      </w:pPr>
-      <w:r>
-        <w:t xml:space="preserve">2.1 Presentación</w:t>
-      </w:r>
-    </w:p>
-    <w:p>
-      <w:pPr>
-        <w:spacing w:after="120" w:line="276"/>
-        <w:ind w:left="340"/>
-      </w:pPr>
-      <w:r>
-        <w:rPr>
-          <w:rFonts w:ascii="Arial" w:cs="Arial" w:eastAsia="Arial" w:hAnsi="Arial"/>
-          <w:i/>
-          <w:iCs/>
-          <w:sz w:val="22"/>
-          <w:szCs w:val="22"/>
-        </w:rPr>
-        <w:t xml:space="preserve">«Muchas gracias por brindarme su tiempo. Soy estudiante de Univalle y estoy realizando una investigación sobre cómo las empresas importadoras de repuestos toman sus decisiones de compra. No estoy vendiendo ningún producto y no existen respuestas correctas o incorrectas. La entrevista durará aproximadamente veinte minutos.»</w:t>
-      </w:r>
-    </w:p>
-    <w:p>
-      <w:pPr>
-        <w:spacing w:after="120" w:line="276"/>
-        <w:ind w:left="340"/>
-      </w:pPr>
-      <w:r>
-        <w:rPr>
-          <w:rFonts w:ascii="Arial" w:cs="Arial" w:eastAsia="Arial" w:hAnsi="Arial"/>
-          <w:i/>
-          <w:iCs/>
-          <w:sz w:val="22"/>
-          <w:szCs w:val="22"/>
-        </w:rPr>
-        <w:t xml:space="preserve">«¿Me permite grabar la conversación únicamente para no perder información importante? La grabación no será compartida.»</w:t>
-      </w:r>
-    </w:p>
-    <w:p>
-      <w:pPr>
-        <w:pStyle w:val="Heading2"/>
-      </w:pPr>
-      <w:r>
-        <w:t xml:space="preserve">2.2 El entrevistado y la empresa</w:t>
-      </w:r>
-    </w:p>
-    <w:p>
-      <w:pPr>
-        <w:tabs>
-          <w:tab w:val="left" w:pos="340"/>
-        </w:tabs>
-        <w:spacing w:after="60" w:line="264"/>
-        <w:ind w:left="340" w:hanging="340"/>
-      </w:pPr>
-      <w:r>
-        <w:rPr>
-          <w:rFonts w:ascii="Arial" w:cs="Arial" w:eastAsia="Arial" w:hAnsi="Arial"/>
-          <w:b/>
-          <w:bCs/>
-          <w:color w:val="000000"/>
-          <w:sz w:val="21"/>
-          <w:szCs w:val="21"/>
-        </w:rPr>
-        <w:t xml:space="preserve">1.</w:t>
-      </w:r>
-      <w:r>
-        <w:rPr>
-          <w:rFonts w:ascii="Arial" w:cs="Arial" w:eastAsia="Arial" w:hAnsi="Arial"/>
-          <w:sz w:val="21"/>
-          <w:szCs w:val="21"/>
-        </w:rPr>
-        <w:t xml:space="preserve">	</w:t>
-      </w:r>
-      <w:r>
-        <w:rPr>
-          <w:rFonts w:ascii="Arial" w:cs="Arial" w:eastAsia="Arial" w:hAnsi="Arial"/>
-          <w:b w:val="false"/>
-          <w:bCs w:val="false"/>
-          <w:sz w:val="21"/>
-          <w:szCs w:val="21"/>
-        </w:rPr>
-        <w:t xml:space="preserve">¿Cuál es su cargo y qué responsabilidades tiene dentro de la empresa?</w:t>
-      </w:r>
-    </w:p>
-    <w:p>
-      <w:pPr>
-        <w:tabs>
-          <w:tab w:val="left" w:pos="340"/>
-        </w:tabs>
-        <w:spacing w:after="60" w:line="264"/>
-        <w:ind w:left="340" w:hanging="340"/>
-      </w:pPr>
-      <w:r>
-        <w:rPr>
-          <w:rFonts w:ascii="Arial" w:cs="Arial" w:eastAsia="Arial" w:hAnsi="Arial"/>
-          <w:b/>
-          <w:bCs/>
-          <w:color w:val="000000"/>
-          <w:sz w:val="21"/>
-          <w:szCs w:val="21"/>
-        </w:rPr>
-        <w:t xml:space="preserve">2.</w:t>
-      </w:r>
-      <w:r>
-        <w:rPr>
-          <w:rFonts w:ascii="Arial" w:cs="Arial" w:eastAsia="Arial" w:hAnsi="Arial"/>
-          <w:sz w:val="21"/>
-          <w:szCs w:val="21"/>
-        </w:rPr>
-        <w:t xml:space="preserve">	</w:t>
-      </w:r>
-      <w:r>
-        <w:rPr>
-          <w:rFonts w:ascii="Arial" w:cs="Arial" w:eastAsia="Arial" w:hAnsi="Arial"/>
-          <w:b w:val="false"/>
-          <w:bCs w:val="false"/>
-          <w:sz w:val="21"/>
-          <w:szCs w:val="21"/>
-        </w:rPr>
-        <w:t xml:space="preserve">¿Desde hace cuánto tiempo trabaja en la importación o comercialización de repuestos automotrices?</w:t>
-      </w:r>
-    </w:p>
-    <w:p>
-      <w:pPr>
-        <w:tabs>
-          <w:tab w:val="left" w:pos="340"/>
-        </w:tabs>
-        <w:spacing w:after="60" w:line="264"/>
-        <w:ind w:left="340" w:hanging="340"/>
-      </w:pPr>
-      <w:r>
-        <w:rPr>
-          <w:rFonts w:ascii="Arial" w:cs="Arial" w:eastAsia="Arial" w:hAnsi="Arial"/>
-          <w:b/>
-          <w:bCs/>
-          <w:color w:val="000000"/>
-          <w:sz w:val="21"/>
-          <w:szCs w:val="21"/>
-        </w:rPr>
-        <w:t xml:space="preserve">3.</w:t>
-      </w:r>
-      <w:r>
-        <w:rPr>
-          <w:rFonts w:ascii="Arial" w:cs="Arial" w:eastAsia="Arial" w:hAnsi="Arial"/>
-          <w:sz w:val="21"/>
-          <w:szCs w:val="21"/>
-        </w:rPr>
-        <w:t xml:space="preserve">	</w:t>
-      </w:r>
-      <w:r>
-        <w:rPr>
-          <w:rFonts w:ascii="Arial" w:cs="Arial" w:eastAsia="Arial" w:hAnsi="Arial"/>
-          <w:b w:val="false"/>
-          <w:bCs w:val="false"/>
-          <w:sz w:val="21"/>
-          <w:szCs w:val="21"/>
-        </w:rPr>
-        <w:t xml:space="preserve">¿Qué tipos de repuestos importa o comercializa principalmente la empresa?</w:t>
-      </w:r>
-    </w:p>
-    <w:p>
-      <w:pPr>
-        <w:tabs>
-          <w:tab w:val="left" w:pos="340"/>
-        </w:tabs>
-        <w:spacing w:after="60" w:line="264"/>
-        <w:ind w:left="340" w:hanging="340"/>
-      </w:pPr>
-      <w:r>
-        <w:rPr>
-          <w:rFonts w:ascii="Arial" w:cs="Arial" w:eastAsia="Arial" w:hAnsi="Arial"/>
-          <w:b/>
-          <w:bCs/>
-          <w:color w:val="000000"/>
-          <w:sz w:val="21"/>
-          <w:szCs w:val="21"/>
-        </w:rPr>
-        <w:t xml:space="preserve">4.</w:t>
-      </w:r>
-      <w:r>
-        <w:rPr>
-          <w:rFonts w:ascii="Arial" w:cs="Arial" w:eastAsia="Arial" w:hAnsi="Arial"/>
-          <w:sz w:val="21"/>
-          <w:szCs w:val="21"/>
-        </w:rPr>
-        <w:t xml:space="preserve">	</w:t>
-      </w:r>
-      <w:r>
-        <w:rPr>
-          <w:rFonts w:ascii="Arial" w:cs="Arial" w:eastAsia="Arial" w:hAnsi="Arial"/>
-          <w:b w:val="false"/>
-          <w:bCs w:val="false"/>
-          <w:sz w:val="21"/>
-          <w:szCs w:val="21"/>
-        </w:rPr>
-        <w:t xml:space="preserve">¿Con qué frecuencia realizan pedidos a proveedores extranjeros?</w:t>
-      </w:r>
-    </w:p>
-    <w:p>
-      <w:pPr>
-        <w:tabs>
-          <w:tab w:val="left" w:pos="340"/>
-        </w:tabs>
-        <w:spacing w:after="60" w:line="264"/>
-        <w:ind w:left="340" w:hanging="340"/>
-      </w:pPr>
-      <w:r>
-        <w:rPr>
-          <w:rFonts w:ascii="Arial" w:cs="Arial" w:eastAsia="Arial" w:hAnsi="Arial"/>
-          <w:b/>
-          <w:bCs/>
-          <w:color w:val="000000"/>
-          <w:sz w:val="21"/>
-          <w:szCs w:val="21"/>
-        </w:rPr>
-        <w:t xml:space="preserve">5.</w:t>
-      </w:r>
-      <w:r>
-        <w:rPr>
-          <w:rFonts w:ascii="Arial" w:cs="Arial" w:eastAsia="Arial" w:hAnsi="Arial"/>
-          <w:sz w:val="21"/>
-          <w:szCs w:val="21"/>
-        </w:rPr>
-        <w:t xml:space="preserve">	</w:t>
-      </w:r>
-      <w:r>
-        <w:rPr>
-          <w:rFonts w:ascii="Arial" w:cs="Arial" w:eastAsia="Arial" w:hAnsi="Arial"/>
-          <w:b w:val="false"/>
-          <w:bCs w:val="false"/>
-          <w:sz w:val="21"/>
-          <w:szCs w:val="21"/>
-        </w:rPr>
-        <w:t xml:space="preserve">¿Quiénes participan normalmente en la decisión de realizar una compra de importación?</w:t>
-      </w:r>
-    </w:p>
-    <w:p>
-      <w:pPr>
-        <w:pStyle w:val="Heading2"/>
-      </w:pPr>
-      <w:r>
-        <w:t xml:space="preserve">2.3 La última decisión de compra</w:t>
-      </w:r>
-    </w:p>
-    <w:p>
-      <w:pPr>
-        <w:shd w:fill="FFF2CC" w:val="clear"/>
-        <w:tabs>
-          <w:tab w:val="left" w:pos="340"/>
-        </w:tabs>
-        <w:spacing w:after="100" w:line="264"/>
-        <w:ind w:left="340" w:hanging="340"/>
-      </w:pPr>
-      <w:r>
-        <w:rPr>
-          <w:rFonts w:ascii="Arial" w:cs="Arial" w:eastAsia="Arial" w:hAnsi="Arial"/>
-          <w:b/>
-          <w:bCs/>
-          <w:color w:val="1F4E79"/>
-          <w:sz w:val="21"/>
-          <w:szCs w:val="21"/>
-        </w:rPr>
-        <w:t xml:space="preserve">6.</w:t>
-      </w:r>
-      <w:r>
-        <w:rPr>
-          <w:rFonts w:ascii="Arial" w:cs="Arial" w:eastAsia="Arial" w:hAnsi="Arial"/>
-          <w:sz w:val="21"/>
-          <w:szCs w:val="21"/>
-        </w:rPr>
-        <w:t xml:space="preserve">	</w:t>
-      </w:r>
-      <w:r>
-        <w:rPr>
-          <w:rFonts w:ascii="Arial" w:cs="Arial" w:eastAsia="Arial" w:hAnsi="Arial"/>
-          <w:b/>
-          <w:bCs/>
-          <w:sz w:val="21"/>
-          <w:szCs w:val="21"/>
-        </w:rPr>
-        <w:t xml:space="preserve">Cuénteme sobre la última vez que realizaron un pedido de repuestos al extranjero. ¿Cómo fue el proceso desde que identificaron la necesidad hasta que confirmaron la compra?</w:t>
-      </w:r>
-      <w:r>
-        <w:rPr>
-          <w:rFonts w:ascii="Arial" w:cs="Arial" w:eastAsia="Arial" w:hAnsi="Arial"/>
-          <w:b/>
-          <w:bCs/>
-          <w:color w:val="1F4E79"/>
-          <w:sz w:val="17"/>
-          <w:szCs w:val="17"/>
-        </w:rPr>
-        <w:t xml:space="preserve">  [CLAVE]</w:t>
-      </w:r>
-    </w:p>
-    <w:p>
-      <w:pPr>
-        <w:tabs>
-          <w:tab w:val="left" w:pos="340"/>
-        </w:tabs>
-        <w:spacing w:after="60" w:line="264"/>
-        <w:ind w:left="340" w:hanging="340"/>
-      </w:pPr>
-      <w:r>
-        <w:rPr>
-          <w:rFonts w:ascii="Arial" w:cs="Arial" w:eastAsia="Arial" w:hAnsi="Arial"/>
-          <w:b/>
-          <w:bCs/>
-          <w:color w:val="000000"/>
-          <w:sz w:val="21"/>
-          <w:szCs w:val="21"/>
-        </w:rPr>
-        <w:t xml:space="preserve">7.</w:t>
-      </w:r>
-      <w:r>
-        <w:rPr>
-          <w:rFonts w:ascii="Arial" w:cs="Arial" w:eastAsia="Arial" w:hAnsi="Arial"/>
-          <w:sz w:val="21"/>
-          <w:szCs w:val="21"/>
-        </w:rPr>
-        <w:t xml:space="preserve">	</w:t>
-      </w:r>
-      <w:r>
-        <w:rPr>
-          <w:rFonts w:ascii="Arial" w:cs="Arial" w:eastAsia="Arial" w:hAnsi="Arial"/>
-          <w:b w:val="false"/>
-          <w:bCs w:val="false"/>
-          <w:sz w:val="21"/>
-          <w:szCs w:val="21"/>
-        </w:rPr>
-        <w:t xml:space="preserve">¿Qué información utilizaron para decidir cuándo efectuar ese pedido?</w:t>
-      </w:r>
-    </w:p>
-    <w:p>
-      <w:pPr>
-        <w:tabs>
-          <w:tab w:val="left" w:pos="340"/>
-        </w:tabs>
-        <w:spacing w:after="60" w:line="264"/>
-        <w:ind w:left="340" w:hanging="340"/>
-      </w:pPr>
-      <w:r>
-        <w:rPr>
-          <w:rFonts w:ascii="Arial" w:cs="Arial" w:eastAsia="Arial" w:hAnsi="Arial"/>
-          <w:b/>
-          <w:bCs/>
-          <w:color w:val="000000"/>
-          <w:sz w:val="21"/>
-          <w:szCs w:val="21"/>
-        </w:rPr>
-        <w:t xml:space="preserve">8.</w:t>
-      </w:r>
-      <w:r>
-        <w:rPr>
-          <w:rFonts w:ascii="Arial" w:cs="Arial" w:eastAsia="Arial" w:hAnsi="Arial"/>
-          <w:sz w:val="21"/>
-          <w:szCs w:val="21"/>
-        </w:rPr>
-        <w:t xml:space="preserve">	</w:t>
-      </w:r>
-      <w:r>
-        <w:rPr>
-          <w:rFonts w:ascii="Arial" w:cs="Arial" w:eastAsia="Arial" w:hAnsi="Arial"/>
-          <w:b w:val="false"/>
-          <w:bCs w:val="false"/>
-          <w:sz w:val="21"/>
-          <w:szCs w:val="21"/>
-        </w:rPr>
-        <w:t xml:space="preserve">¿Cómo determinaron qué repuestos comprar y en qué cantidades?</w:t>
-      </w:r>
-    </w:p>
-    <w:p>
-      <w:pPr>
-        <w:tabs>
-          <w:tab w:val="left" w:pos="340"/>
-        </w:tabs>
-        <w:spacing w:after="60" w:line="264"/>
-        <w:ind w:left="340" w:hanging="340"/>
-      </w:pPr>
-      <w:r>
-        <w:rPr>
-          <w:rFonts w:ascii="Arial" w:cs="Arial" w:eastAsia="Arial" w:hAnsi="Arial"/>
-          <w:b/>
-          <w:bCs/>
-          <w:color w:val="000000"/>
-          <w:sz w:val="21"/>
-          <w:szCs w:val="21"/>
-        </w:rPr>
-        <w:t xml:space="preserve">9.</w:t>
-      </w:r>
-      <w:r>
-        <w:rPr>
-          <w:rFonts w:ascii="Arial" w:cs="Arial" w:eastAsia="Arial" w:hAnsi="Arial"/>
-          <w:sz w:val="21"/>
-          <w:szCs w:val="21"/>
-        </w:rPr>
-        <w:t xml:space="preserve">	</w:t>
-      </w:r>
-      <w:r>
-        <w:rPr>
-          <w:rFonts w:ascii="Arial" w:cs="Arial" w:eastAsia="Arial" w:hAnsi="Arial"/>
-          <w:b w:val="false"/>
-          <w:bCs w:val="false"/>
-          <w:sz w:val="21"/>
-          <w:szCs w:val="21"/>
-        </w:rPr>
-        <w:t xml:space="preserve">¿Qué buscaban lograr con esa compra?</w:t>
-      </w:r>
-    </w:p>
-    <w:p>
-      <w:pPr>
-        <w:tabs>
-          <w:tab w:val="left" w:pos="340"/>
-        </w:tabs>
-        <w:spacing w:after="60" w:line="264"/>
-        <w:ind w:left="340" w:hanging="340"/>
-      </w:pPr>
-      <w:r>
-        <w:rPr>
-          <w:rFonts w:ascii="Arial" w:cs="Arial" w:eastAsia="Arial" w:hAnsi="Arial"/>
-          <w:b/>
-          <w:bCs/>
-          <w:color w:val="000000"/>
-          <w:sz w:val="21"/>
-          <w:szCs w:val="21"/>
-        </w:rPr>
-        <w:t xml:space="preserve">10.</w:t>
-      </w:r>
-      <w:r>
-        <w:rPr>
-          <w:rFonts w:ascii="Arial" w:cs="Arial" w:eastAsia="Arial" w:hAnsi="Arial"/>
-          <w:sz w:val="21"/>
-          <w:szCs w:val="21"/>
-        </w:rPr>
-        <w:t xml:space="preserve">	</w:t>
-      </w:r>
-      <w:r>
-        <w:rPr>
-          <w:rFonts w:ascii="Arial" w:cs="Arial" w:eastAsia="Arial" w:hAnsi="Arial"/>
-          <w:b w:val="false"/>
-          <w:bCs w:val="false"/>
-          <w:sz w:val="21"/>
-          <w:szCs w:val="21"/>
-        </w:rPr>
-        <w:t xml:space="preserve">¿Qué aspectos evaluaron antes de aceptar la cotización del proveedor?</w:t>
-      </w:r>
-    </w:p>
-    <w:p>
-      <w:pPr>
-        <w:tabs>
-          <w:tab w:val="left" w:pos="340"/>
-        </w:tabs>
-        <w:spacing w:after="60" w:line="264"/>
-        <w:ind w:left="340" w:hanging="340"/>
-      </w:pPr>
-      <w:r>
-        <w:rPr>
-          <w:rFonts w:ascii="Arial" w:cs="Arial" w:eastAsia="Arial" w:hAnsi="Arial"/>
-          <w:b/>
-          <w:bCs/>
-          <w:color w:val="000000"/>
-          <w:sz w:val="21"/>
-          <w:szCs w:val="21"/>
-        </w:rPr>
-        <w:t xml:space="preserve">11.</w:t>
-      </w:r>
-      <w:r>
-        <w:rPr>
-          <w:rFonts w:ascii="Arial" w:cs="Arial" w:eastAsia="Arial" w:hAnsi="Arial"/>
-          <w:sz w:val="21"/>
-          <w:szCs w:val="21"/>
-        </w:rPr>
-        <w:t xml:space="preserve">	</w:t>
-      </w:r>
-      <w:r>
-        <w:rPr>
-          <w:rFonts w:ascii="Arial" w:cs="Arial" w:eastAsia="Arial" w:hAnsi="Arial"/>
-          <w:b w:val="false"/>
-          <w:bCs w:val="false"/>
-          <w:sz w:val="21"/>
-          <w:szCs w:val="21"/>
-        </w:rPr>
-        <w:t xml:space="preserve">¿Compararon esa cotización con precios anteriores? ¿Cómo realizaron la comparación?</w:t>
-      </w:r>
-    </w:p>
-    <w:p>
-      <w:pPr>
-        <w:tabs>
-          <w:tab w:val="left" w:pos="340"/>
-        </w:tabs>
-        <w:spacing w:after="60" w:line="264"/>
-        <w:ind w:left="340" w:hanging="340"/>
-      </w:pPr>
-      <w:r>
-        <w:rPr>
-          <w:rFonts w:ascii="Arial" w:cs="Arial" w:eastAsia="Arial" w:hAnsi="Arial"/>
-          <w:b/>
-          <w:bCs/>
-          <w:color w:val="000000"/>
-          <w:sz w:val="21"/>
-          <w:szCs w:val="21"/>
-        </w:rPr>
-        <w:t xml:space="preserve">12.</w:t>
-      </w:r>
-      <w:r>
-        <w:rPr>
-          <w:rFonts w:ascii="Arial" w:cs="Arial" w:eastAsia="Arial" w:hAnsi="Arial"/>
-          <w:sz w:val="21"/>
-          <w:szCs w:val="21"/>
-        </w:rPr>
-        <w:t xml:space="preserve">	</w:t>
-      </w:r>
-      <w:r>
-        <w:rPr>
-          <w:rFonts w:ascii="Arial" w:cs="Arial" w:eastAsia="Arial" w:hAnsi="Arial"/>
-          <w:b w:val="false"/>
-          <w:bCs w:val="false"/>
-          <w:sz w:val="21"/>
-          <w:szCs w:val="21"/>
-        </w:rPr>
-        <w:t xml:space="preserve">¿Qué importancia tuvo el tipo de cambio en esa decisión?</w:t>
-      </w:r>
-    </w:p>
-    <w:p>
-      <w:pPr>
-        <w:tabs>
-          <w:tab w:val="left" w:pos="340"/>
-        </w:tabs>
-        <w:spacing w:after="60" w:line="264"/>
-        <w:ind w:left="340" w:hanging="340"/>
-      </w:pPr>
-      <w:r>
-        <w:rPr>
-          <w:rFonts w:ascii="Arial" w:cs="Arial" w:eastAsia="Arial" w:hAnsi="Arial"/>
-          <w:b/>
-          <w:bCs/>
-          <w:color w:val="000000"/>
-          <w:sz w:val="21"/>
-          <w:szCs w:val="21"/>
-        </w:rPr>
-        <w:t xml:space="preserve">13.</w:t>
-      </w:r>
-      <w:r>
-        <w:rPr>
-          <w:rFonts w:ascii="Arial" w:cs="Arial" w:eastAsia="Arial" w:hAnsi="Arial"/>
-          <w:sz w:val="21"/>
-          <w:szCs w:val="21"/>
-        </w:rPr>
-        <w:t xml:space="preserve">	</w:t>
-      </w:r>
-      <w:r>
-        <w:rPr>
-          <w:rFonts w:ascii="Arial" w:cs="Arial" w:eastAsia="Arial" w:hAnsi="Arial"/>
-          <w:b w:val="false"/>
-          <w:bCs w:val="false"/>
-          <w:sz w:val="21"/>
-          <w:szCs w:val="21"/>
-        </w:rPr>
-        <w:t xml:space="preserve">¿Cómo calcularon los costos de transporte, comisiones, impuestos y otros gastos de importación?</w:t>
-      </w:r>
-    </w:p>
-    <w:p>
-      <w:pPr>
-        <w:shd w:fill="FFF2CC" w:val="clear"/>
-        <w:tabs>
-          <w:tab w:val="left" w:pos="340"/>
-        </w:tabs>
-        <w:spacing w:after="100" w:line="264"/>
-        <w:ind w:left="340" w:hanging="340"/>
-      </w:pPr>
-      <w:r>
-        <w:rPr>
-          <w:rFonts w:ascii="Arial" w:cs="Arial" w:eastAsia="Arial" w:hAnsi="Arial"/>
-          <w:b/>
-          <w:bCs/>
-          <w:color w:val="1F4E79"/>
-          <w:sz w:val="21"/>
-          <w:szCs w:val="21"/>
-        </w:rPr>
-        <w:t xml:space="preserve">14.</w:t>
-      </w:r>
-      <w:r>
-        <w:rPr>
-          <w:rFonts w:ascii="Arial" w:cs="Arial" w:eastAsia="Arial" w:hAnsi="Arial"/>
-          <w:sz w:val="21"/>
-          <w:szCs w:val="21"/>
-        </w:rPr>
-        <w:t xml:space="preserve">	</w:t>
-      </w:r>
-      <w:r>
-        <w:rPr>
-          <w:rFonts w:ascii="Arial" w:cs="Arial" w:eastAsia="Arial" w:hAnsi="Arial"/>
-          <w:b/>
-          <w:bCs/>
-          <w:sz w:val="21"/>
-          <w:szCs w:val="21"/>
-        </w:rPr>
-        <w:t xml:space="preserve">¿En qué momento del proceso sintieron mayor duda o incertidumbre?</w:t>
-      </w:r>
-      <w:r>
-        <w:rPr>
-          <w:rFonts w:ascii="Arial" w:cs="Arial" w:eastAsia="Arial" w:hAnsi="Arial"/>
-          <w:b/>
-          <w:bCs/>
-          <w:color w:val="1F4E79"/>
-          <w:sz w:val="17"/>
-          <w:szCs w:val="17"/>
-        </w:rPr>
-        <w:t xml:space="preserve">  [CLAVE]</w:t>
-      </w:r>
-    </w:p>
-    <w:p>
-      <w:pPr>
-        <w:tabs>
-          <w:tab w:val="left" w:pos="340"/>
-        </w:tabs>
-        <w:spacing w:after="60" w:line="264"/>
-        <w:ind w:left="340" w:hanging="340"/>
-      </w:pPr>
-      <w:r>
-        <w:rPr>
-          <w:rFonts w:ascii="Arial" w:cs="Arial" w:eastAsia="Arial" w:hAnsi="Arial"/>
-          <w:b/>
-          <w:bCs/>
-          <w:color w:val="000000"/>
-          <w:sz w:val="21"/>
-          <w:szCs w:val="21"/>
-        </w:rPr>
-        <w:t xml:space="preserve">15.</w:t>
-      </w:r>
-      <w:r>
-        <w:rPr>
-          <w:rFonts w:ascii="Arial" w:cs="Arial" w:eastAsia="Arial" w:hAnsi="Arial"/>
-          <w:sz w:val="21"/>
-          <w:szCs w:val="21"/>
-        </w:rPr>
-        <w:t xml:space="preserve">	</w:t>
-      </w:r>
-      <w:r>
-        <w:rPr>
-          <w:rFonts w:ascii="Arial" w:cs="Arial" w:eastAsia="Arial" w:hAnsi="Arial"/>
-          <w:b w:val="false"/>
-          <w:bCs w:val="false"/>
-          <w:sz w:val="21"/>
-          <w:szCs w:val="21"/>
-        </w:rPr>
-        <w:t xml:space="preserve">¿Qué sucedió después de realizar la compra? ¿El resultado fue el esperado?</w:t>
-      </w:r>
-    </w:p>
-    <w:p>
-      <w:pPr>
-        <w:pStyle w:val="Heading2"/>
-      </w:pPr>
-      <w:r>
-        <w:t xml:space="preserve">2.4 Problemas y frustraciones</w:t>
-      </w:r>
-    </w:p>
-    <w:p>
-      <w:pPr>
-        <w:shd w:fill="FFF2CC" w:val="clear"/>
-        <w:tabs>
-          <w:tab w:val="left" w:pos="340"/>
-        </w:tabs>
-        <w:spacing w:after="100" w:line="264"/>
-        <w:ind w:left="340" w:hanging="340"/>
-      </w:pPr>
-      <w:r>
-        <w:rPr>
-          <w:rFonts w:ascii="Arial" w:cs="Arial" w:eastAsia="Arial" w:hAnsi="Arial"/>
-          <w:b/>
-          <w:bCs/>
-          <w:color w:val="1F4E79"/>
-          <w:sz w:val="21"/>
-          <w:szCs w:val="21"/>
-        </w:rPr>
-        <w:t xml:space="preserve">16.</w:t>
-      </w:r>
-      <w:r>
-        <w:rPr>
-          <w:rFonts w:ascii="Arial" w:cs="Arial" w:eastAsia="Arial" w:hAnsi="Arial"/>
-          <w:sz w:val="21"/>
-          <w:szCs w:val="21"/>
-        </w:rPr>
-        <w:t xml:space="preserve">	</w:t>
-      </w:r>
-      <w:r>
-        <w:rPr>
-          <w:rFonts w:ascii="Arial" w:cs="Arial" w:eastAsia="Arial" w:hAnsi="Arial"/>
-          <w:b/>
-          <w:bCs/>
-          <w:sz w:val="21"/>
-          <w:szCs w:val="21"/>
-        </w:rPr>
-        <w:t xml:space="preserve">¿Qué fue lo más difícil o frustrante de esa última compra?</w:t>
-      </w:r>
-      <w:r>
-        <w:rPr>
-          <w:rFonts w:ascii="Arial" w:cs="Arial" w:eastAsia="Arial" w:hAnsi="Arial"/>
-          <w:b/>
-          <w:bCs/>
-          <w:color w:val="1F4E79"/>
-          <w:sz w:val="17"/>
-          <w:szCs w:val="17"/>
-        </w:rPr>
-        <w:t xml:space="preserve">  [CLAVE]</w:t>
-      </w:r>
-    </w:p>
-    <w:p>
-      <w:pPr>
-        <w:tabs>
-          <w:tab w:val="left" w:pos="340"/>
-        </w:tabs>
-        <w:spacing w:after="60" w:line="264"/>
-        <w:ind w:left="340" w:hanging="340"/>
-      </w:pPr>
-      <w:r>
-        <w:rPr>
-          <w:rFonts w:ascii="Arial" w:cs="Arial" w:eastAsia="Arial" w:hAnsi="Arial"/>
-          <w:b/>
-          <w:bCs/>
-          <w:color w:val="000000"/>
-          <w:sz w:val="21"/>
-          <w:szCs w:val="21"/>
-        </w:rPr>
-        <w:t xml:space="preserve">17.</w:t>
-      </w:r>
-      <w:r>
-        <w:rPr>
-          <w:rFonts w:ascii="Arial" w:cs="Arial" w:eastAsia="Arial" w:hAnsi="Arial"/>
-          <w:sz w:val="21"/>
-          <w:szCs w:val="21"/>
-        </w:rPr>
-        <w:t xml:space="preserve">	</w:t>
-      </w:r>
-      <w:r>
-        <w:rPr>
-          <w:rFonts w:ascii="Arial" w:cs="Arial" w:eastAsia="Arial" w:hAnsi="Arial"/>
-          <w:b w:val="false"/>
-          <w:bCs w:val="false"/>
-          <w:sz w:val="21"/>
-          <w:szCs w:val="21"/>
-        </w:rPr>
-        <w:t xml:space="preserve">¿Alguna vez compraron repuestos y posteriormente el tipo de cambio o los precios variaron de manera desfavorable? Cuénteme qué ocurrió.</w:t>
-      </w:r>
-    </w:p>
-    <w:p>
-      <w:pPr>
-        <w:tabs>
-          <w:tab w:val="left" w:pos="340"/>
-        </w:tabs>
-        <w:spacing w:after="60" w:line="264"/>
-        <w:ind w:left="340" w:hanging="340"/>
-      </w:pPr>
-      <w:r>
-        <w:rPr>
-          <w:rFonts w:ascii="Arial" w:cs="Arial" w:eastAsia="Arial" w:hAnsi="Arial"/>
-          <w:b/>
-          <w:bCs/>
-          <w:color w:val="000000"/>
-          <w:sz w:val="21"/>
-          <w:szCs w:val="21"/>
-        </w:rPr>
-        <w:t xml:space="preserve">18.</w:t>
-      </w:r>
-      <w:r>
-        <w:rPr>
-          <w:rFonts w:ascii="Arial" w:cs="Arial" w:eastAsia="Arial" w:hAnsi="Arial"/>
-          <w:sz w:val="21"/>
-          <w:szCs w:val="21"/>
-        </w:rPr>
-        <w:t xml:space="preserve">	</w:t>
-      </w:r>
-      <w:r>
-        <w:rPr>
-          <w:rFonts w:ascii="Arial" w:cs="Arial" w:eastAsia="Arial" w:hAnsi="Arial"/>
-          <w:b w:val="false"/>
-          <w:bCs w:val="false"/>
-          <w:sz w:val="21"/>
-          <w:szCs w:val="21"/>
-        </w:rPr>
-        <w:t xml:space="preserve">¿Han comprado una cantidad mayor de la necesaria por temor a que los precios aumenten? ¿Qué pasó con esos productos?</w:t>
-      </w:r>
-    </w:p>
-    <w:p>
-      <w:pPr>
-        <w:tabs>
-          <w:tab w:val="left" w:pos="340"/>
-        </w:tabs>
-        <w:spacing w:after="60" w:line="264"/>
-        <w:ind w:left="340" w:hanging="340"/>
-      </w:pPr>
-      <w:r>
-        <w:rPr>
-          <w:rFonts w:ascii="Arial" w:cs="Arial" w:eastAsia="Arial" w:hAnsi="Arial"/>
-          <w:b/>
-          <w:bCs/>
-          <w:color w:val="000000"/>
-          <w:sz w:val="21"/>
-          <w:szCs w:val="21"/>
-        </w:rPr>
-        <w:t xml:space="preserve">19.</w:t>
-      </w:r>
-      <w:r>
-        <w:rPr>
-          <w:rFonts w:ascii="Arial" w:cs="Arial" w:eastAsia="Arial" w:hAnsi="Arial"/>
-          <w:sz w:val="21"/>
-          <w:szCs w:val="21"/>
-        </w:rPr>
-        <w:t xml:space="preserve">	</w:t>
-      </w:r>
-      <w:r>
-        <w:rPr>
-          <w:rFonts w:ascii="Arial" w:cs="Arial" w:eastAsia="Arial" w:hAnsi="Arial"/>
-          <w:b w:val="false"/>
-          <w:bCs w:val="false"/>
-          <w:sz w:val="21"/>
-          <w:szCs w:val="21"/>
-        </w:rPr>
-        <w:t xml:space="preserve">¿Han tenido repuestos acumulados durante mucho tiempo debido a su baja demanda?</w:t>
-      </w:r>
-    </w:p>
-    <w:p>
-      <w:pPr>
-        <w:tabs>
-          <w:tab w:val="left" w:pos="340"/>
-        </w:tabs>
-        <w:spacing w:after="60" w:line="264"/>
-        <w:ind w:left="340" w:hanging="340"/>
-      </w:pPr>
-      <w:r>
-        <w:rPr>
-          <w:rFonts w:ascii="Arial" w:cs="Arial" w:eastAsia="Arial" w:hAnsi="Arial"/>
-          <w:b/>
-          <w:bCs/>
-          <w:color w:val="000000"/>
-          <w:sz w:val="21"/>
-          <w:szCs w:val="21"/>
-        </w:rPr>
-        <w:t xml:space="preserve">20.</w:t>
-      </w:r>
-      <w:r>
-        <w:rPr>
-          <w:rFonts w:ascii="Arial" w:cs="Arial" w:eastAsia="Arial" w:hAnsi="Arial"/>
-          <w:sz w:val="21"/>
-          <w:szCs w:val="21"/>
-        </w:rPr>
-        <w:t xml:space="preserve">	</w:t>
-      </w:r>
-      <w:r>
-        <w:rPr>
-          <w:rFonts w:ascii="Arial" w:cs="Arial" w:eastAsia="Arial" w:hAnsi="Arial"/>
-          <w:b w:val="false"/>
-          <w:bCs w:val="false"/>
-          <w:sz w:val="21"/>
-          <w:szCs w:val="21"/>
-        </w:rPr>
-        <w:t xml:space="preserve">¿Han perdido ventas por no contar con repuestos de alta demanda? Cuénteme la última vez que ocurrió.</w:t>
-      </w:r>
-    </w:p>
-    <w:p>
-      <w:pPr>
-        <w:tabs>
-          <w:tab w:val="left" w:pos="340"/>
-        </w:tabs>
-        <w:spacing w:after="60" w:line="264"/>
-        <w:ind w:left="340" w:hanging="340"/>
-      </w:pPr>
-      <w:r>
-        <w:rPr>
-          <w:rFonts w:ascii="Arial" w:cs="Arial" w:eastAsia="Arial" w:hAnsi="Arial"/>
-          <w:b/>
-          <w:bCs/>
-          <w:color w:val="000000"/>
-          <w:sz w:val="21"/>
-          <w:szCs w:val="21"/>
-        </w:rPr>
-        <w:t xml:space="preserve">21.</w:t>
-      </w:r>
-      <w:r>
-        <w:rPr>
-          <w:rFonts w:ascii="Arial" w:cs="Arial" w:eastAsia="Arial" w:hAnsi="Arial"/>
-          <w:sz w:val="21"/>
-          <w:szCs w:val="21"/>
-        </w:rPr>
-        <w:t xml:space="preserve">	</w:t>
-      </w:r>
-      <w:r>
-        <w:rPr>
-          <w:rFonts w:ascii="Arial" w:cs="Arial" w:eastAsia="Arial" w:hAnsi="Arial"/>
-          <w:b w:val="false"/>
-          <w:bCs w:val="false"/>
-          <w:sz w:val="21"/>
-          <w:szCs w:val="21"/>
-        </w:rPr>
-        <w:t xml:space="preserve">¿Qué consecuencias generó esa situación para la empresa?</w:t>
-      </w:r>
-    </w:p>
-    <w:p>
-      <w:pPr>
-        <w:shd w:fill="FFF2CC" w:val="clear"/>
-        <w:tabs>
-          <w:tab w:val="left" w:pos="340"/>
-        </w:tabs>
-        <w:spacing w:after="100" w:line="264"/>
-        <w:ind w:left="340" w:hanging="340"/>
-      </w:pPr>
-      <w:r>
-        <w:rPr>
-          <w:rFonts w:ascii="Arial" w:cs="Arial" w:eastAsia="Arial" w:hAnsi="Arial"/>
-          <w:b/>
-          <w:bCs/>
-          <w:color w:val="1F4E79"/>
-          <w:sz w:val="21"/>
-          <w:szCs w:val="21"/>
-        </w:rPr>
-        <w:t xml:space="preserve">22.</w:t>
-      </w:r>
-      <w:r>
-        <w:rPr>
-          <w:rFonts w:ascii="Arial" w:cs="Arial" w:eastAsia="Arial" w:hAnsi="Arial"/>
-          <w:sz w:val="21"/>
-          <w:szCs w:val="21"/>
-        </w:rPr>
-        <w:t xml:space="preserve">	</w:t>
-      </w:r>
-      <w:r>
-        <w:rPr>
-          <w:rFonts w:ascii="Arial" w:cs="Arial" w:eastAsia="Arial" w:hAnsi="Arial"/>
-          <w:b/>
-          <w:bCs/>
-          <w:sz w:val="21"/>
-          <w:szCs w:val="21"/>
-        </w:rPr>
-        <w:t xml:space="preserve">¿Cuánto les costó aproximadamente esa decisión en dinero, tiempo o ventas perdidas?</w:t>
-      </w:r>
-      <w:r>
-        <w:rPr>
-          <w:rFonts w:ascii="Arial" w:cs="Arial" w:eastAsia="Arial" w:hAnsi="Arial"/>
-          <w:b/>
-          <w:bCs/>
-          <w:color w:val="1F4E79"/>
-          <w:sz w:val="17"/>
-          <w:szCs w:val="17"/>
-        </w:rPr>
-        <w:t xml:space="preserve">  [CLAVE]</w:t>
-      </w:r>
-    </w:p>
-    <w:p>
-      <w:pPr>
-        <w:tabs>
-          <w:tab w:val="left" w:pos="340"/>
-        </w:tabs>
-        <w:spacing w:after="60" w:line="264"/>
-        <w:ind w:left="340" w:hanging="340"/>
-      </w:pPr>
-      <w:r>
-        <w:rPr>
-          <w:rFonts w:ascii="Arial" w:cs="Arial" w:eastAsia="Arial" w:hAnsi="Arial"/>
-          <w:b/>
-          <w:bCs/>
-          <w:color w:val="000000"/>
-          <w:sz w:val="21"/>
-          <w:szCs w:val="21"/>
-        </w:rPr>
-        <w:t xml:space="preserve">23.</w:t>
-      </w:r>
-      <w:r>
-        <w:rPr>
-          <w:rFonts w:ascii="Arial" w:cs="Arial" w:eastAsia="Arial" w:hAnsi="Arial"/>
-          <w:sz w:val="21"/>
-          <w:szCs w:val="21"/>
-        </w:rPr>
-        <w:t xml:space="preserve">	</w:t>
-      </w:r>
-      <w:r>
-        <w:rPr>
-          <w:rFonts w:ascii="Arial" w:cs="Arial" w:eastAsia="Arial" w:hAnsi="Arial"/>
-          <w:b w:val="false"/>
-          <w:bCs w:val="false"/>
-          <w:sz w:val="21"/>
-          <w:szCs w:val="21"/>
-        </w:rPr>
-        <w:t xml:space="preserve">¿La situación afectó la relación con sus clientes, proveedores o trabajadores? ¿De qué manera?</w:t>
-      </w:r>
-    </w:p>
-    <w:p>
-      <w:pPr>
-        <w:tabs>
-          <w:tab w:val="left" w:pos="340"/>
-        </w:tabs>
-        <w:spacing w:after="60" w:line="264"/>
-        <w:ind w:left="340" w:hanging="340"/>
-      </w:pPr>
-      <w:r>
-        <w:rPr>
-          <w:rFonts w:ascii="Arial" w:cs="Arial" w:eastAsia="Arial" w:hAnsi="Arial"/>
-          <w:b/>
-          <w:bCs/>
-          <w:color w:val="000000"/>
-          <w:sz w:val="21"/>
-          <w:szCs w:val="21"/>
-        </w:rPr>
-        <w:t xml:space="preserve">24.</w:t>
-      </w:r>
-      <w:r>
-        <w:rPr>
-          <w:rFonts w:ascii="Arial" w:cs="Arial" w:eastAsia="Arial" w:hAnsi="Arial"/>
-          <w:sz w:val="21"/>
-          <w:szCs w:val="21"/>
-        </w:rPr>
-        <w:t xml:space="preserve">	</w:t>
-      </w:r>
-      <w:r>
-        <w:rPr>
-          <w:rFonts w:ascii="Arial" w:cs="Arial" w:eastAsia="Arial" w:hAnsi="Arial"/>
-          <w:b w:val="false"/>
-          <w:bCs w:val="false"/>
-          <w:sz w:val="21"/>
-          <w:szCs w:val="21"/>
-        </w:rPr>
-        <w:t xml:space="preserve">¿Qué comentarios recibió de los propietarios, socios, trabajadores o clientes después de esa decisión?</w:t>
-      </w:r>
-    </w:p>
-    <w:p>
-      <w:pPr>
-        <w:pStyle w:val="Heading2"/>
-      </w:pPr>
-      <w:r>
-        <w:t xml:space="preserve">2.5 Información y métodos que usa hoy</w:t>
-      </w:r>
-    </w:p>
-    <w:p>
-      <w:pPr>
-        <w:shd w:fill="FFF2CC" w:val="clear"/>
-        <w:tabs>
-          <w:tab w:val="left" w:pos="340"/>
-        </w:tabs>
-        <w:spacing w:after="100" w:line="264"/>
-        <w:ind w:left="340" w:hanging="340"/>
-      </w:pPr>
-      <w:r>
-        <w:rPr>
-          <w:rFonts w:ascii="Arial" w:cs="Arial" w:eastAsia="Arial" w:hAnsi="Arial"/>
-          <w:b/>
-          <w:bCs/>
-          <w:color w:val="1F4E79"/>
-          <w:sz w:val="21"/>
-          <w:szCs w:val="21"/>
-        </w:rPr>
-        <w:t xml:space="preserve">25.</w:t>
-      </w:r>
-      <w:r>
-        <w:rPr>
-          <w:rFonts w:ascii="Arial" w:cs="Arial" w:eastAsia="Arial" w:hAnsi="Arial"/>
-          <w:sz w:val="21"/>
-          <w:szCs w:val="21"/>
-        </w:rPr>
-        <w:t xml:space="preserve">	</w:t>
-      </w:r>
-      <w:r>
-        <w:rPr>
-          <w:rFonts w:ascii="Arial" w:cs="Arial" w:eastAsia="Arial" w:hAnsi="Arial"/>
-          <w:b/>
-          <w:bCs/>
-          <w:sz w:val="21"/>
-          <w:szCs w:val="21"/>
-        </w:rPr>
-        <w:t xml:space="preserve">¿Qué herramientas utiliza actualmente para decidir cuándo y cuánto comprar?</w:t>
-      </w:r>
-      <w:r>
-        <w:rPr>
-          <w:rFonts w:ascii="Arial" w:cs="Arial" w:eastAsia="Arial" w:hAnsi="Arial"/>
-          <w:b/>
-          <w:bCs/>
-          <w:color w:val="1F4E79"/>
-          <w:sz w:val="17"/>
-          <w:szCs w:val="17"/>
-        </w:rPr>
-        <w:t xml:space="preserve">  [CLAVE]</w:t>
-      </w:r>
-    </w:p>
-    <w:p>
-      <w:pPr>
-        <w:tabs>
-          <w:tab w:val="left" w:pos="340"/>
-        </w:tabs>
-        <w:spacing w:after="60" w:line="264"/>
-        <w:ind w:left="340" w:hanging="340"/>
-      </w:pPr>
-      <w:r>
-        <w:rPr>
-          <w:rFonts w:ascii="Arial" w:cs="Arial" w:eastAsia="Arial" w:hAnsi="Arial"/>
-          <w:b/>
-          <w:bCs/>
-          <w:color w:val="000000"/>
-          <w:sz w:val="21"/>
-          <w:szCs w:val="21"/>
-        </w:rPr>
-        <w:t xml:space="preserve">26.</w:t>
-      </w:r>
-      <w:r>
-        <w:rPr>
-          <w:rFonts w:ascii="Arial" w:cs="Arial" w:eastAsia="Arial" w:hAnsi="Arial"/>
-          <w:sz w:val="21"/>
-          <w:szCs w:val="21"/>
-        </w:rPr>
-        <w:t xml:space="preserve">	</w:t>
-      </w:r>
-      <w:r>
-        <w:rPr>
-          <w:rFonts w:ascii="Arial" w:cs="Arial" w:eastAsia="Arial" w:hAnsi="Arial"/>
-          <w:b w:val="false"/>
-          <w:bCs w:val="false"/>
-          <w:sz w:val="21"/>
-          <w:szCs w:val="21"/>
-        </w:rPr>
-        <w:t xml:space="preserve">¿Dónde registra el historial de compras, precios y costos de los repuestos?</w:t>
-      </w:r>
-    </w:p>
-    <w:p>
-      <w:pPr>
-        <w:tabs>
-          <w:tab w:val="left" w:pos="340"/>
-        </w:tabs>
-        <w:spacing w:after="60" w:line="264"/>
-        <w:ind w:left="340" w:hanging="340"/>
-      </w:pPr>
-      <w:r>
-        <w:rPr>
-          <w:rFonts w:ascii="Arial" w:cs="Arial" w:eastAsia="Arial" w:hAnsi="Arial"/>
-          <w:b/>
-          <w:bCs/>
-          <w:color w:val="000000"/>
-          <w:sz w:val="21"/>
-          <w:szCs w:val="21"/>
-        </w:rPr>
-        <w:t xml:space="preserve">27.</w:t>
-      </w:r>
-      <w:r>
-        <w:rPr>
-          <w:rFonts w:ascii="Arial" w:cs="Arial" w:eastAsia="Arial" w:hAnsi="Arial"/>
-          <w:sz w:val="21"/>
-          <w:szCs w:val="21"/>
-        </w:rPr>
-        <w:t xml:space="preserve">	</w:t>
-      </w:r>
-      <w:r>
-        <w:rPr>
-          <w:rFonts w:ascii="Arial" w:cs="Arial" w:eastAsia="Arial" w:hAnsi="Arial"/>
-          <w:b w:val="false"/>
-          <w:bCs w:val="false"/>
-          <w:sz w:val="21"/>
-          <w:szCs w:val="21"/>
-        </w:rPr>
-        <w:t xml:space="preserve">¿Conserva las cotizaciones de pedidos anteriores? ¿Cómo las organiza y consulta?</w:t>
-      </w:r>
-    </w:p>
-    <w:p>
-      <w:pPr>
-        <w:tabs>
-          <w:tab w:val="left" w:pos="340"/>
-        </w:tabs>
-        <w:spacing w:after="60" w:line="264"/>
-        <w:ind w:left="340" w:hanging="340"/>
-      </w:pPr>
-      <w:r>
-        <w:rPr>
-          <w:rFonts w:ascii="Arial" w:cs="Arial" w:eastAsia="Arial" w:hAnsi="Arial"/>
-          <w:b/>
-          <w:bCs/>
-          <w:color w:val="000000"/>
-          <w:sz w:val="21"/>
-          <w:szCs w:val="21"/>
-        </w:rPr>
-        <w:t xml:space="preserve">28.</w:t>
-      </w:r>
-      <w:r>
-        <w:rPr>
-          <w:rFonts w:ascii="Arial" w:cs="Arial" w:eastAsia="Arial" w:hAnsi="Arial"/>
-          <w:sz w:val="21"/>
-          <w:szCs w:val="21"/>
-        </w:rPr>
-        <w:t xml:space="preserve">	</w:t>
-      </w:r>
-      <w:r>
-        <w:rPr>
-          <w:rFonts w:ascii="Arial" w:cs="Arial" w:eastAsia="Arial" w:hAnsi="Arial"/>
-          <w:b w:val="false"/>
-          <w:bCs w:val="false"/>
-          <w:sz w:val="21"/>
-          <w:szCs w:val="21"/>
-        </w:rPr>
-        <w:t xml:space="preserve">¿Cómo obtiene información sobre el tipo de cambio utilizado para realizar sus compras?</w:t>
-      </w:r>
-    </w:p>
-    <w:p>
-      <w:pPr>
-        <w:tabs>
-          <w:tab w:val="left" w:pos="340"/>
-        </w:tabs>
-        <w:spacing w:after="60" w:line="264"/>
-        <w:ind w:left="340" w:hanging="340"/>
-      </w:pPr>
-      <w:r>
-        <w:rPr>
-          <w:rFonts w:ascii="Arial" w:cs="Arial" w:eastAsia="Arial" w:hAnsi="Arial"/>
-          <w:b/>
-          <w:bCs/>
-          <w:color w:val="000000"/>
-          <w:sz w:val="21"/>
-          <w:szCs w:val="21"/>
-        </w:rPr>
-        <w:t xml:space="preserve">29.</w:t>
-      </w:r>
-      <w:r>
-        <w:rPr>
-          <w:rFonts w:ascii="Arial" w:cs="Arial" w:eastAsia="Arial" w:hAnsi="Arial"/>
-          <w:sz w:val="21"/>
-          <w:szCs w:val="21"/>
-        </w:rPr>
-        <w:t xml:space="preserve">	</w:t>
-      </w:r>
-      <w:r>
-        <w:rPr>
-          <w:rFonts w:ascii="Arial" w:cs="Arial" w:eastAsia="Arial" w:hAnsi="Arial"/>
-          <w:b w:val="false"/>
-          <w:bCs w:val="false"/>
-          <w:sz w:val="21"/>
-          <w:szCs w:val="21"/>
-        </w:rPr>
-        <w:t xml:space="preserve">¿Cómo analiza actualmente la demanda y los niveles de inventario?</w:t>
-      </w:r>
-    </w:p>
-    <w:p>
-      <w:pPr>
-        <w:tabs>
-          <w:tab w:val="left" w:pos="340"/>
-        </w:tabs>
-        <w:spacing w:after="60" w:line="264"/>
-        <w:ind w:left="340" w:hanging="340"/>
-      </w:pPr>
-      <w:r>
-        <w:rPr>
-          <w:rFonts w:ascii="Arial" w:cs="Arial" w:eastAsia="Arial" w:hAnsi="Arial"/>
-          <w:b/>
-          <w:bCs/>
-          <w:color w:val="000000"/>
-          <w:sz w:val="21"/>
-          <w:szCs w:val="21"/>
-        </w:rPr>
-        <w:t xml:space="preserve">30.</w:t>
-      </w:r>
-      <w:r>
-        <w:rPr>
-          <w:rFonts w:ascii="Arial" w:cs="Arial" w:eastAsia="Arial" w:hAnsi="Arial"/>
-          <w:sz w:val="21"/>
-          <w:szCs w:val="21"/>
-        </w:rPr>
-        <w:t xml:space="preserve">	</w:t>
-      </w:r>
-      <w:r>
-        <w:rPr>
-          <w:rFonts w:ascii="Arial" w:cs="Arial" w:eastAsia="Arial" w:hAnsi="Arial"/>
-          <w:b w:val="false"/>
-          <w:bCs w:val="false"/>
-          <w:sz w:val="21"/>
-          <w:szCs w:val="21"/>
-        </w:rPr>
-        <w:t xml:space="preserve">¿Los costos de los repuestos se actualizan inmediatamente después de cada compra? ¿Cómo realizan esa actualización?</w:t>
-      </w:r>
-    </w:p>
-    <w:p>
-      <w:pPr>
-        <w:tabs>
-          <w:tab w:val="left" w:pos="340"/>
-        </w:tabs>
-        <w:spacing w:after="60" w:line="264"/>
-        <w:ind w:left="340" w:hanging="340"/>
-      </w:pPr>
-      <w:r>
-        <w:rPr>
-          <w:rFonts w:ascii="Arial" w:cs="Arial" w:eastAsia="Arial" w:hAnsi="Arial"/>
-          <w:b/>
-          <w:bCs/>
-          <w:color w:val="000000"/>
-          <w:sz w:val="21"/>
-          <w:szCs w:val="21"/>
-        </w:rPr>
-        <w:t xml:space="preserve">31.</w:t>
-      </w:r>
-      <w:r>
-        <w:rPr>
-          <w:rFonts w:ascii="Arial" w:cs="Arial" w:eastAsia="Arial" w:hAnsi="Arial"/>
-          <w:sz w:val="21"/>
-          <w:szCs w:val="21"/>
-        </w:rPr>
-        <w:t xml:space="preserve">	</w:t>
-      </w:r>
-      <w:r>
-        <w:rPr>
-          <w:rFonts w:ascii="Arial" w:cs="Arial" w:eastAsia="Arial" w:hAnsi="Arial"/>
-          <w:b w:val="false"/>
-          <w:bCs w:val="false"/>
-          <w:sz w:val="21"/>
-          <w:szCs w:val="21"/>
-        </w:rPr>
-        <w:t xml:space="preserve">¿Qué parte del cálculo se realiza manualmente?</w:t>
-      </w:r>
-    </w:p>
-    <w:p>
-      <w:pPr>
-        <w:tabs>
-          <w:tab w:val="left" w:pos="340"/>
-        </w:tabs>
-        <w:spacing w:after="60" w:line="264"/>
-        <w:ind w:left="340" w:hanging="340"/>
-      </w:pPr>
-      <w:r>
-        <w:rPr>
-          <w:rFonts w:ascii="Arial" w:cs="Arial" w:eastAsia="Arial" w:hAnsi="Arial"/>
-          <w:b/>
-          <w:bCs/>
-          <w:color w:val="000000"/>
-          <w:sz w:val="21"/>
-          <w:szCs w:val="21"/>
-        </w:rPr>
-        <w:t xml:space="preserve">32.</w:t>
-      </w:r>
-      <w:r>
-        <w:rPr>
-          <w:rFonts w:ascii="Arial" w:cs="Arial" w:eastAsia="Arial" w:hAnsi="Arial"/>
-          <w:sz w:val="21"/>
-          <w:szCs w:val="21"/>
-        </w:rPr>
-        <w:t xml:space="preserve">	</w:t>
-      </w:r>
-      <w:r>
-        <w:rPr>
-          <w:rFonts w:ascii="Arial" w:cs="Arial" w:eastAsia="Arial" w:hAnsi="Arial"/>
-          <w:b w:val="false"/>
-          <w:bCs w:val="false"/>
-          <w:sz w:val="21"/>
-          <w:szCs w:val="21"/>
-        </w:rPr>
-        <w:t xml:space="preserve">¿Cuánto tiempo le toma reunir la información necesaria antes de tomar una decisión?</w:t>
-      </w:r>
-    </w:p>
-    <w:p>
-      <w:pPr>
-        <w:shd w:fill="FFF2CC" w:val="clear"/>
-        <w:tabs>
-          <w:tab w:val="left" w:pos="340"/>
-        </w:tabs>
-        <w:spacing w:after="100" w:line="264"/>
-        <w:ind w:left="340" w:hanging="340"/>
-      </w:pPr>
-      <w:r>
-        <w:rPr>
-          <w:rFonts w:ascii="Arial" w:cs="Arial" w:eastAsia="Arial" w:hAnsi="Arial"/>
-          <w:b/>
-          <w:bCs/>
-          <w:color w:val="1F4E79"/>
-          <w:sz w:val="21"/>
-          <w:szCs w:val="21"/>
-        </w:rPr>
-        <w:t xml:space="preserve">33.</w:t>
-      </w:r>
-      <w:r>
-        <w:rPr>
-          <w:rFonts w:ascii="Arial" w:cs="Arial" w:eastAsia="Arial" w:hAnsi="Arial"/>
-          <w:sz w:val="21"/>
-          <w:szCs w:val="21"/>
-        </w:rPr>
-        <w:t xml:space="preserve">	</w:t>
-      </w:r>
-      <w:r>
-        <w:rPr>
-          <w:rFonts w:ascii="Arial" w:cs="Arial" w:eastAsia="Arial" w:hAnsi="Arial"/>
-          <w:b/>
-          <w:bCs/>
-          <w:sz w:val="21"/>
-          <w:szCs w:val="21"/>
-        </w:rPr>
-        <w:t xml:space="preserve">¿Ha utilizado Excel, algún sistema contable, Power BI u otra herramienta para analizar esta información? ¿Cómo fue su experiencia?</w:t>
-      </w:r>
-      <w:r>
-        <w:rPr>
-          <w:rFonts w:ascii="Arial" w:cs="Arial" w:eastAsia="Arial" w:hAnsi="Arial"/>
-          <w:b/>
-          <w:bCs/>
-          <w:color w:val="1F4E79"/>
-          <w:sz w:val="17"/>
-          <w:szCs w:val="17"/>
-        </w:rPr>
-        <w:t xml:space="preserve">  [CLAVE]</w:t>
-      </w:r>
-    </w:p>
-    <w:p>
-      <w:pPr>
-        <w:tabs>
-          <w:tab w:val="left" w:pos="340"/>
-        </w:tabs>
-        <w:spacing w:after="60" w:line="264"/>
-        <w:ind w:left="340" w:hanging="340"/>
-      </w:pPr>
-      <w:r>
-        <w:rPr>
-          <w:rFonts w:ascii="Arial" w:cs="Arial" w:eastAsia="Arial" w:hAnsi="Arial"/>
-          <w:b/>
-          <w:bCs/>
-          <w:color w:val="000000"/>
-          <w:sz w:val="21"/>
-          <w:szCs w:val="21"/>
-        </w:rPr>
-        <w:t xml:space="preserve">34.</w:t>
-      </w:r>
-      <w:r>
-        <w:rPr>
-          <w:rFonts w:ascii="Arial" w:cs="Arial" w:eastAsia="Arial" w:hAnsi="Arial"/>
-          <w:sz w:val="21"/>
-          <w:szCs w:val="21"/>
-        </w:rPr>
-        <w:t xml:space="preserve">	</w:t>
-      </w:r>
-      <w:r>
-        <w:rPr>
-          <w:rFonts w:ascii="Arial" w:cs="Arial" w:eastAsia="Arial" w:hAnsi="Arial"/>
-          <w:b w:val="false"/>
-          <w:bCs w:val="false"/>
-          <w:sz w:val="21"/>
-          <w:szCs w:val="21"/>
-        </w:rPr>
-        <w:t xml:space="preserve">¿Ha probado otros métodos para mejorar sus decisiones de compra? ¿Por qué dejó de utilizarlos?</w:t>
-      </w:r>
-    </w:p>
-    <w:p>
-      <w:pPr>
-        <w:tabs>
-          <w:tab w:val="left" w:pos="340"/>
-        </w:tabs>
-        <w:spacing w:after="60" w:line="264"/>
-        <w:ind w:left="340" w:hanging="340"/>
-      </w:pPr>
-      <w:r>
-        <w:rPr>
-          <w:rFonts w:ascii="Arial" w:cs="Arial" w:eastAsia="Arial" w:hAnsi="Arial"/>
-          <w:b/>
-          <w:bCs/>
-          <w:color w:val="000000"/>
-          <w:sz w:val="21"/>
-          <w:szCs w:val="21"/>
-        </w:rPr>
-        <w:t xml:space="preserve">35.</w:t>
-      </w:r>
-      <w:r>
-        <w:rPr>
-          <w:rFonts w:ascii="Arial" w:cs="Arial" w:eastAsia="Arial" w:hAnsi="Arial"/>
-          <w:sz w:val="21"/>
-          <w:szCs w:val="21"/>
-        </w:rPr>
-        <w:t xml:space="preserve">	</w:t>
-      </w:r>
-      <w:r>
-        <w:rPr>
-          <w:rFonts w:ascii="Arial" w:cs="Arial" w:eastAsia="Arial" w:hAnsi="Arial"/>
-          <w:b w:val="false"/>
-          <w:bCs w:val="false"/>
-          <w:sz w:val="21"/>
-          <w:szCs w:val="21"/>
-        </w:rPr>
-        <w:t xml:space="preserve">¿Actualmente paga por algún sistema, servicio o asesoramiento que le ayude a tomar estas decisiones?</w:t>
-      </w:r>
-    </w:p>
-    <w:p>
-      <w:pPr>
-        <w:pStyle w:val="Heading2"/>
-      </w:pPr>
-      <w:r>
-        <w:t xml:space="preserve">2.6 Información disponible y dificultades</w:t>
-      </w:r>
-    </w:p>
-    <w:p>
-      <w:pPr>
-        <w:tabs>
-          <w:tab w:val="left" w:pos="340"/>
-        </w:tabs>
-        <w:spacing w:after="60" w:line="264"/>
-        <w:ind w:left="340" w:hanging="340"/>
-      </w:pPr>
-      <w:r>
-        <w:rPr>
-          <w:rFonts w:ascii="Arial" w:cs="Arial" w:eastAsia="Arial" w:hAnsi="Arial"/>
-          <w:b/>
-          <w:bCs/>
-          <w:color w:val="000000"/>
-          <w:sz w:val="21"/>
-          <w:szCs w:val="21"/>
-        </w:rPr>
-        <w:t xml:space="preserve">36.</w:t>
-      </w:r>
-      <w:r>
-        <w:rPr>
-          <w:rFonts w:ascii="Arial" w:cs="Arial" w:eastAsia="Arial" w:hAnsi="Arial"/>
-          <w:sz w:val="21"/>
-          <w:szCs w:val="21"/>
-        </w:rPr>
-        <w:t xml:space="preserve">	</w:t>
-      </w:r>
-      <w:r>
-        <w:rPr>
-          <w:rFonts w:ascii="Arial" w:cs="Arial" w:eastAsia="Arial" w:hAnsi="Arial"/>
-          <w:b w:val="false"/>
-          <w:bCs w:val="false"/>
-          <w:sz w:val="21"/>
-          <w:szCs w:val="21"/>
-        </w:rPr>
-        <w:t xml:space="preserve">¿Qué datos tiene disponibles sobre sus compras anteriores?</w:t>
-      </w:r>
-    </w:p>
-    <w:p>
-      <w:pPr>
-        <w:tabs>
-          <w:tab w:val="left" w:pos="340"/>
-        </w:tabs>
-        <w:spacing w:after="60" w:line="264"/>
-        <w:ind w:left="340" w:hanging="340"/>
-      </w:pPr>
-      <w:r>
-        <w:rPr>
-          <w:rFonts w:ascii="Arial" w:cs="Arial" w:eastAsia="Arial" w:hAnsi="Arial"/>
-          <w:b/>
-          <w:bCs/>
-          <w:color w:val="000000"/>
-          <w:sz w:val="21"/>
-          <w:szCs w:val="21"/>
-        </w:rPr>
-        <w:t xml:space="preserve">37.</w:t>
-      </w:r>
-      <w:r>
-        <w:rPr>
-          <w:rFonts w:ascii="Arial" w:cs="Arial" w:eastAsia="Arial" w:hAnsi="Arial"/>
-          <w:sz w:val="21"/>
-          <w:szCs w:val="21"/>
-        </w:rPr>
-        <w:t xml:space="preserve">	</w:t>
-      </w:r>
-      <w:r>
-        <w:rPr>
-          <w:rFonts w:ascii="Arial" w:cs="Arial" w:eastAsia="Arial" w:hAnsi="Arial"/>
-          <w:b w:val="false"/>
-          <w:bCs w:val="false"/>
-          <w:sz w:val="21"/>
-          <w:szCs w:val="21"/>
-        </w:rPr>
-        <w:t xml:space="preserve">¿Cuenta con registros históricos de precios, cantidades, proveedores y fechas de compra?</w:t>
-      </w:r>
-    </w:p>
-    <w:p>
-      <w:pPr>
-        <w:tabs>
-          <w:tab w:val="left" w:pos="340"/>
-        </w:tabs>
-        <w:spacing w:after="60" w:line="264"/>
-        <w:ind w:left="340" w:hanging="340"/>
-      </w:pPr>
-      <w:r>
-        <w:rPr>
-          <w:rFonts w:ascii="Arial" w:cs="Arial" w:eastAsia="Arial" w:hAnsi="Arial"/>
-          <w:b/>
-          <w:bCs/>
-          <w:color w:val="000000"/>
-          <w:sz w:val="21"/>
-          <w:szCs w:val="21"/>
-        </w:rPr>
-        <w:t xml:space="preserve">38.</w:t>
-      </w:r>
-      <w:r>
-        <w:rPr>
-          <w:rFonts w:ascii="Arial" w:cs="Arial" w:eastAsia="Arial" w:hAnsi="Arial"/>
-          <w:sz w:val="21"/>
-          <w:szCs w:val="21"/>
-        </w:rPr>
-        <w:t xml:space="preserve">	</w:t>
-      </w:r>
-      <w:r>
-        <w:rPr>
-          <w:rFonts w:ascii="Arial" w:cs="Arial" w:eastAsia="Arial" w:hAnsi="Arial"/>
-          <w:b w:val="false"/>
-          <w:bCs w:val="false"/>
-          <w:sz w:val="21"/>
-          <w:szCs w:val="21"/>
-        </w:rPr>
-        <w:t xml:space="preserve">¿La información se encuentra reunida en un solo lugar o distribuida en diferentes documentos y sistemas?</w:t>
-      </w:r>
-    </w:p>
-    <w:p>
-      <w:pPr>
-        <w:tabs>
-          <w:tab w:val="left" w:pos="340"/>
-        </w:tabs>
-        <w:spacing w:after="60" w:line="264"/>
-        <w:ind w:left="340" w:hanging="340"/>
-      </w:pPr>
-      <w:r>
-        <w:rPr>
-          <w:rFonts w:ascii="Arial" w:cs="Arial" w:eastAsia="Arial" w:hAnsi="Arial"/>
-          <w:b/>
-          <w:bCs/>
-          <w:color w:val="000000"/>
-          <w:sz w:val="21"/>
-          <w:szCs w:val="21"/>
-        </w:rPr>
-        <w:t xml:space="preserve">39.</w:t>
-      </w:r>
-      <w:r>
-        <w:rPr>
-          <w:rFonts w:ascii="Arial" w:cs="Arial" w:eastAsia="Arial" w:hAnsi="Arial"/>
-          <w:sz w:val="21"/>
-          <w:szCs w:val="21"/>
-        </w:rPr>
-        <w:t xml:space="preserve">	</w:t>
-      </w:r>
-      <w:r>
-        <w:rPr>
-          <w:rFonts w:ascii="Arial" w:cs="Arial" w:eastAsia="Arial" w:hAnsi="Arial"/>
-          <w:b w:val="false"/>
-          <w:bCs w:val="false"/>
-          <w:sz w:val="21"/>
-          <w:szCs w:val="21"/>
-        </w:rPr>
-        <w:t xml:space="preserve">¿Qué información le resulta más difícil de obtener o actualizar?</w:t>
-      </w:r>
-    </w:p>
-    <w:p>
-      <w:pPr>
-        <w:tabs>
-          <w:tab w:val="left" w:pos="340"/>
-        </w:tabs>
-        <w:spacing w:after="60" w:line="264"/>
-        <w:ind w:left="340" w:hanging="340"/>
-      </w:pPr>
-      <w:r>
-        <w:rPr>
-          <w:rFonts w:ascii="Arial" w:cs="Arial" w:eastAsia="Arial" w:hAnsi="Arial"/>
-          <w:b/>
-          <w:bCs/>
-          <w:color w:val="000000"/>
-          <w:sz w:val="21"/>
-          <w:szCs w:val="21"/>
-        </w:rPr>
-        <w:t xml:space="preserve">40.</w:t>
-      </w:r>
-      <w:r>
-        <w:rPr>
-          <w:rFonts w:ascii="Arial" w:cs="Arial" w:eastAsia="Arial" w:hAnsi="Arial"/>
-          <w:sz w:val="21"/>
-          <w:szCs w:val="21"/>
-        </w:rPr>
-        <w:t xml:space="preserve">	</w:t>
-      </w:r>
-      <w:r>
-        <w:rPr>
-          <w:rFonts w:ascii="Arial" w:cs="Arial" w:eastAsia="Arial" w:hAnsi="Arial"/>
-          <w:b w:val="false"/>
-          <w:bCs w:val="false"/>
-          <w:sz w:val="21"/>
-          <w:szCs w:val="21"/>
-        </w:rPr>
-        <w:t xml:space="preserve">¿Qué variables cambian con mayor frecuencia y complican sus cálculos?</w:t>
-      </w:r>
-    </w:p>
-    <w:p>
-      <w:pPr>
-        <w:tabs>
-          <w:tab w:val="left" w:pos="340"/>
-        </w:tabs>
-        <w:spacing w:after="60" w:line="264"/>
-        <w:ind w:left="340" w:hanging="340"/>
-      </w:pPr>
-      <w:r>
-        <w:rPr>
-          <w:rFonts w:ascii="Arial" w:cs="Arial" w:eastAsia="Arial" w:hAnsi="Arial"/>
-          <w:b/>
-          <w:bCs/>
-          <w:color w:val="000000"/>
-          <w:sz w:val="21"/>
-          <w:szCs w:val="21"/>
-        </w:rPr>
-        <w:t xml:space="preserve">41.</w:t>
-      </w:r>
-      <w:r>
-        <w:rPr>
-          <w:rFonts w:ascii="Arial" w:cs="Arial" w:eastAsia="Arial" w:hAnsi="Arial"/>
-          <w:sz w:val="21"/>
-          <w:szCs w:val="21"/>
-        </w:rPr>
-        <w:t xml:space="preserve">	</w:t>
-      </w:r>
-      <w:r>
-        <w:rPr>
-          <w:rFonts w:ascii="Arial" w:cs="Arial" w:eastAsia="Arial" w:hAnsi="Arial"/>
-          <w:b w:val="false"/>
-          <w:bCs w:val="false"/>
-          <w:sz w:val="21"/>
-          <w:szCs w:val="21"/>
-        </w:rPr>
-        <w:t xml:space="preserve">Cuando debe tomar una decisión rápidamente, ¿en qué información confía principalmente?</w:t>
-      </w:r>
-    </w:p>
-    <w:p>
-      <w:pPr>
-        <w:tabs>
-          <w:tab w:val="left" w:pos="340"/>
-        </w:tabs>
-        <w:spacing w:after="60" w:line="264"/>
-        <w:ind w:left="340" w:hanging="340"/>
-      </w:pPr>
-      <w:r>
-        <w:rPr>
-          <w:rFonts w:ascii="Arial" w:cs="Arial" w:eastAsia="Arial" w:hAnsi="Arial"/>
-          <w:b/>
-          <w:bCs/>
-          <w:color w:val="000000"/>
-          <w:sz w:val="21"/>
-          <w:szCs w:val="21"/>
-        </w:rPr>
-        <w:t xml:space="preserve">42.</w:t>
-      </w:r>
-      <w:r>
-        <w:rPr>
-          <w:rFonts w:ascii="Arial" w:cs="Arial" w:eastAsia="Arial" w:hAnsi="Arial"/>
-          <w:sz w:val="21"/>
-          <w:szCs w:val="21"/>
-        </w:rPr>
-        <w:t xml:space="preserve">	</w:t>
-      </w:r>
-      <w:r>
-        <w:rPr>
-          <w:rFonts w:ascii="Arial" w:cs="Arial" w:eastAsia="Arial" w:hAnsi="Arial"/>
-          <w:b w:val="false"/>
-          <w:bCs w:val="false"/>
-          <w:sz w:val="21"/>
-          <w:szCs w:val="21"/>
-        </w:rPr>
-        <w:t xml:space="preserve">¿Alguna vez tomó una decisión basándose principalmente en su experiencia o intuición? Cuénteme qué ocurrió.</w:t>
-      </w:r>
-    </w:p>
-    <w:p>
-      <w:pPr>
-        <w:pStyle w:val="Heading2"/>
-      </w:pPr>
-      <w:r>
-        <w:t xml:space="preserve">2.7 Necesidades y resultados deseados</w:t>
-      </w:r>
-    </w:p>
-    <w:p>
-      <w:pPr>
-        <w:shd w:fill="FFF2CC" w:val="clear"/>
-        <w:tabs>
-          <w:tab w:val="left" w:pos="340"/>
-        </w:tabs>
-        <w:spacing w:after="100" w:line="264"/>
-        <w:ind w:left="340" w:hanging="340"/>
-      </w:pPr>
-      <w:r>
-        <w:rPr>
-          <w:rFonts w:ascii="Arial" w:cs="Arial" w:eastAsia="Arial" w:hAnsi="Arial"/>
-          <w:b/>
-          <w:bCs/>
-          <w:color w:val="1F4E79"/>
-          <w:sz w:val="21"/>
-          <w:szCs w:val="21"/>
-        </w:rPr>
-        <w:t xml:space="preserve">43.</w:t>
-      </w:r>
-      <w:r>
-        <w:rPr>
-          <w:rFonts w:ascii="Arial" w:cs="Arial" w:eastAsia="Arial" w:hAnsi="Arial"/>
-          <w:sz w:val="21"/>
-          <w:szCs w:val="21"/>
-        </w:rPr>
-        <w:t xml:space="preserve">	</w:t>
-      </w:r>
-      <w:r>
-        <w:rPr>
-          <w:rFonts w:ascii="Arial" w:cs="Arial" w:eastAsia="Arial" w:hAnsi="Arial"/>
-          <w:b/>
-          <w:bCs/>
-          <w:sz w:val="21"/>
-          <w:szCs w:val="21"/>
-        </w:rPr>
-        <w:t xml:space="preserve">Si pudiera mejorar una sola parte del proceso de compra, ¿cuál cambiaría y por qué?</w:t>
-      </w:r>
-      <w:r>
-        <w:rPr>
-          <w:rFonts w:ascii="Arial" w:cs="Arial" w:eastAsia="Arial" w:hAnsi="Arial"/>
-          <w:b/>
-          <w:bCs/>
-          <w:color w:val="1F4E79"/>
-          <w:sz w:val="17"/>
-          <w:szCs w:val="17"/>
-        </w:rPr>
-        <w:t xml:space="preserve">  [CLAVE]</w:t>
-      </w:r>
-    </w:p>
-    <w:p>
-      <w:pPr>
-        <w:tabs>
-          <w:tab w:val="left" w:pos="340"/>
-        </w:tabs>
-        <w:spacing w:after="60" w:line="264"/>
-        <w:ind w:left="340" w:hanging="340"/>
-      </w:pPr>
-      <w:r>
-        <w:rPr>
-          <w:rFonts w:ascii="Arial" w:cs="Arial" w:eastAsia="Arial" w:hAnsi="Arial"/>
-          <w:b/>
-          <w:bCs/>
-          <w:color w:val="000000"/>
-          <w:sz w:val="21"/>
-          <w:szCs w:val="21"/>
-        </w:rPr>
-        <w:t xml:space="preserve">44.</w:t>
-      </w:r>
-      <w:r>
-        <w:rPr>
-          <w:rFonts w:ascii="Arial" w:cs="Arial" w:eastAsia="Arial" w:hAnsi="Arial"/>
-          <w:sz w:val="21"/>
-          <w:szCs w:val="21"/>
-        </w:rPr>
-        <w:t xml:space="preserve">	</w:t>
-      </w:r>
-      <w:r>
-        <w:rPr>
-          <w:rFonts w:ascii="Arial" w:cs="Arial" w:eastAsia="Arial" w:hAnsi="Arial"/>
-          <w:b w:val="false"/>
-          <w:bCs w:val="false"/>
-          <w:sz w:val="21"/>
-          <w:szCs w:val="21"/>
-        </w:rPr>
-        <w:t xml:space="preserve">¿Qué información le habría ayudado a tomar una mejor decisión en su última compra?</w:t>
-      </w:r>
-    </w:p>
-    <w:p>
-      <w:pPr>
-        <w:tabs>
-          <w:tab w:val="left" w:pos="340"/>
-        </w:tabs>
-        <w:spacing w:after="60" w:line="264"/>
-        <w:ind w:left="340" w:hanging="340"/>
-      </w:pPr>
-      <w:r>
-        <w:rPr>
-          <w:rFonts w:ascii="Arial" w:cs="Arial" w:eastAsia="Arial" w:hAnsi="Arial"/>
-          <w:b/>
-          <w:bCs/>
-          <w:color w:val="000000"/>
-          <w:sz w:val="21"/>
-          <w:szCs w:val="21"/>
-        </w:rPr>
-        <w:t xml:space="preserve">45.</w:t>
-      </w:r>
-      <w:r>
-        <w:rPr>
-          <w:rFonts w:ascii="Arial" w:cs="Arial" w:eastAsia="Arial" w:hAnsi="Arial"/>
-          <w:sz w:val="21"/>
-          <w:szCs w:val="21"/>
-        </w:rPr>
-        <w:t xml:space="preserve">	</w:t>
-      </w:r>
-      <w:r>
-        <w:rPr>
-          <w:rFonts w:ascii="Arial" w:cs="Arial" w:eastAsia="Arial" w:hAnsi="Arial"/>
-          <w:b w:val="false"/>
-          <w:bCs w:val="false"/>
-          <w:sz w:val="21"/>
-          <w:szCs w:val="21"/>
-        </w:rPr>
-        <w:t xml:space="preserve">¿Cómo sería para usted un proceso ideal para decidir cuándo y cuánto comprar?</w:t>
-      </w:r>
-    </w:p>
-    <w:p>
-      <w:pPr>
-        <w:tabs>
-          <w:tab w:val="left" w:pos="340"/>
-        </w:tabs>
-        <w:spacing w:after="60" w:line="264"/>
-        <w:ind w:left="340" w:hanging="340"/>
-      </w:pPr>
-      <w:r>
-        <w:rPr>
-          <w:rFonts w:ascii="Arial" w:cs="Arial" w:eastAsia="Arial" w:hAnsi="Arial"/>
-          <w:b/>
-          <w:bCs/>
-          <w:color w:val="000000"/>
-          <w:sz w:val="21"/>
-          <w:szCs w:val="21"/>
-        </w:rPr>
-        <w:t xml:space="preserve">46.</w:t>
-      </w:r>
-      <w:r>
-        <w:rPr>
-          <w:rFonts w:ascii="Arial" w:cs="Arial" w:eastAsia="Arial" w:hAnsi="Arial"/>
-          <w:sz w:val="21"/>
-          <w:szCs w:val="21"/>
-        </w:rPr>
-        <w:t xml:space="preserve">	</w:t>
-      </w:r>
-      <w:r>
-        <w:rPr>
-          <w:rFonts w:ascii="Arial" w:cs="Arial" w:eastAsia="Arial" w:hAnsi="Arial"/>
-          <w:b w:val="false"/>
-          <w:bCs w:val="false"/>
-          <w:sz w:val="21"/>
-          <w:szCs w:val="21"/>
-        </w:rPr>
-        <w:t xml:space="preserve">¿Qué indicadores necesitaría conocer antes de confirmar un pedido?</w:t>
-      </w:r>
-    </w:p>
-    <w:p>
-      <w:pPr>
-        <w:tabs>
-          <w:tab w:val="left" w:pos="340"/>
-        </w:tabs>
-        <w:spacing w:after="60" w:line="264"/>
-        <w:ind w:left="340" w:hanging="340"/>
-      </w:pPr>
-      <w:r>
-        <w:rPr>
-          <w:rFonts w:ascii="Arial" w:cs="Arial" w:eastAsia="Arial" w:hAnsi="Arial"/>
-          <w:b/>
-          <w:bCs/>
-          <w:color w:val="000000"/>
-          <w:sz w:val="21"/>
-          <w:szCs w:val="21"/>
-        </w:rPr>
-        <w:t xml:space="preserve">47.</w:t>
-      </w:r>
-      <w:r>
-        <w:rPr>
-          <w:rFonts w:ascii="Arial" w:cs="Arial" w:eastAsia="Arial" w:hAnsi="Arial"/>
-          <w:sz w:val="21"/>
-          <w:szCs w:val="21"/>
-        </w:rPr>
-        <w:t xml:space="preserve">	</w:t>
-      </w:r>
-      <w:r>
-        <w:rPr>
-          <w:rFonts w:ascii="Arial" w:cs="Arial" w:eastAsia="Arial" w:hAnsi="Arial"/>
-          <w:b w:val="false"/>
-          <w:bCs w:val="false"/>
-          <w:sz w:val="21"/>
-          <w:szCs w:val="21"/>
-        </w:rPr>
-        <w:t xml:space="preserve">¿Con cuánta anticipación necesitaría recibir información sobre posibles variaciones de precios?</w:t>
-      </w:r>
-    </w:p>
-    <w:p>
-      <w:pPr>
-        <w:tabs>
-          <w:tab w:val="left" w:pos="340"/>
-        </w:tabs>
-        <w:spacing w:after="60" w:line="264"/>
-        <w:ind w:left="340" w:hanging="340"/>
-      </w:pPr>
-      <w:r>
-        <w:rPr>
-          <w:rFonts w:ascii="Arial" w:cs="Arial" w:eastAsia="Arial" w:hAnsi="Arial"/>
-          <w:b/>
-          <w:bCs/>
-          <w:color w:val="000000"/>
-          <w:sz w:val="21"/>
-          <w:szCs w:val="21"/>
-        </w:rPr>
-        <w:t xml:space="preserve">48.</w:t>
-      </w:r>
-      <w:r>
-        <w:rPr>
-          <w:rFonts w:ascii="Arial" w:cs="Arial" w:eastAsia="Arial" w:hAnsi="Arial"/>
-          <w:sz w:val="21"/>
-          <w:szCs w:val="21"/>
-        </w:rPr>
-        <w:t xml:space="preserve">	</w:t>
-      </w:r>
-      <w:r>
-        <w:rPr>
-          <w:rFonts w:ascii="Arial" w:cs="Arial" w:eastAsia="Arial" w:hAnsi="Arial"/>
-          <w:b w:val="false"/>
-          <w:bCs w:val="false"/>
-          <w:sz w:val="21"/>
-          <w:szCs w:val="21"/>
-        </w:rPr>
-        <w:t xml:space="preserve">¿Qué resultado consideraría exitoso: reducir costos, evitar productos acumulados, prevenir faltantes o aumentar el margen de ganancia?</w:t>
-      </w:r>
-    </w:p>
-    <w:p>
-      <w:pPr>
-        <w:pStyle w:val="Heading2"/>
-      </w:pPr>
-      <w:r>
-        <w:t xml:space="preserve">2.8 Importancia y frecuencia del problema</w:t>
-      </w:r>
-    </w:p>
-    <w:p>
-      <w:pPr>
-        <w:tabs>
-          <w:tab w:val="left" w:pos="340"/>
-        </w:tabs>
-        <w:spacing w:after="60" w:line="264"/>
-        <w:ind w:left="340" w:hanging="340"/>
-      </w:pPr>
-      <w:r>
-        <w:rPr>
-          <w:rFonts w:ascii="Arial" w:cs="Arial" w:eastAsia="Arial" w:hAnsi="Arial"/>
-          <w:b/>
-          <w:bCs/>
-          <w:color w:val="000000"/>
-          <w:sz w:val="21"/>
-          <w:szCs w:val="21"/>
-        </w:rPr>
-        <w:t xml:space="preserve">49.</w:t>
-      </w:r>
-      <w:r>
-        <w:rPr>
-          <w:rFonts w:ascii="Arial" w:cs="Arial" w:eastAsia="Arial" w:hAnsi="Arial"/>
-          <w:sz w:val="21"/>
-          <w:szCs w:val="21"/>
-        </w:rPr>
-        <w:t xml:space="preserve">	</w:t>
-      </w:r>
-      <w:r>
-        <w:rPr>
-          <w:rFonts w:ascii="Arial" w:cs="Arial" w:eastAsia="Arial" w:hAnsi="Arial"/>
-          <w:b w:val="false"/>
-          <w:bCs w:val="false"/>
-          <w:sz w:val="21"/>
-          <w:szCs w:val="21"/>
-        </w:rPr>
-        <w:t xml:space="preserve">¿Con qué frecuencia tiene dificultades para decidir el momento adecuado para comprar?</w:t>
-      </w:r>
-    </w:p>
-    <w:p>
-      <w:pPr>
-        <w:tabs>
-          <w:tab w:val="left" w:pos="340"/>
-        </w:tabs>
-        <w:spacing w:after="60" w:line="264"/>
-        <w:ind w:left="340" w:hanging="340"/>
-      </w:pPr>
-      <w:r>
-        <w:rPr>
-          <w:rFonts w:ascii="Arial" w:cs="Arial" w:eastAsia="Arial" w:hAnsi="Arial"/>
-          <w:b/>
-          <w:bCs/>
-          <w:color w:val="000000"/>
-          <w:sz w:val="21"/>
-          <w:szCs w:val="21"/>
-        </w:rPr>
-        <w:t xml:space="preserve">50.</w:t>
-      </w:r>
-      <w:r>
-        <w:rPr>
-          <w:rFonts w:ascii="Arial" w:cs="Arial" w:eastAsia="Arial" w:hAnsi="Arial"/>
-          <w:sz w:val="21"/>
-          <w:szCs w:val="21"/>
-        </w:rPr>
-        <w:t xml:space="preserve">	</w:t>
-      </w:r>
-      <w:r>
-        <w:rPr>
-          <w:rFonts w:ascii="Arial" w:cs="Arial" w:eastAsia="Arial" w:hAnsi="Arial"/>
-          <w:b w:val="false"/>
-          <w:bCs w:val="false"/>
-          <w:sz w:val="21"/>
-          <w:szCs w:val="21"/>
-        </w:rPr>
-        <w:t xml:space="preserve">¿En cuántos pedidos recientes considera que existió incertidumbre?</w:t>
-      </w:r>
-    </w:p>
-    <w:p>
-      <w:pPr>
-        <w:tabs>
-          <w:tab w:val="left" w:pos="340"/>
-        </w:tabs>
-        <w:spacing w:after="60" w:line="264"/>
-        <w:ind w:left="340" w:hanging="340"/>
-      </w:pPr>
-      <w:r>
-        <w:rPr>
-          <w:rFonts w:ascii="Arial" w:cs="Arial" w:eastAsia="Arial" w:hAnsi="Arial"/>
-          <w:b/>
-          <w:bCs/>
-          <w:color w:val="000000"/>
-          <w:sz w:val="21"/>
-          <w:szCs w:val="21"/>
-        </w:rPr>
-        <w:t xml:space="preserve">51.</w:t>
-      </w:r>
-      <w:r>
-        <w:rPr>
-          <w:rFonts w:ascii="Arial" w:cs="Arial" w:eastAsia="Arial" w:hAnsi="Arial"/>
-          <w:sz w:val="21"/>
-          <w:szCs w:val="21"/>
-        </w:rPr>
-        <w:t xml:space="preserve">	</w:t>
-      </w:r>
-      <w:r>
-        <w:rPr>
-          <w:rFonts w:ascii="Arial" w:cs="Arial" w:eastAsia="Arial" w:hAnsi="Arial"/>
-          <w:b w:val="false"/>
-          <w:bCs w:val="false"/>
-          <w:sz w:val="21"/>
-          <w:szCs w:val="21"/>
-        </w:rPr>
-        <w:t xml:space="preserve">¿Qué tan importante es este problema frente a otras dificultades de la empresa?</w:t>
-      </w:r>
-    </w:p>
-    <w:p>
-      <w:pPr>
-        <w:tabs>
-          <w:tab w:val="left" w:pos="340"/>
-        </w:tabs>
-        <w:spacing w:after="60" w:line="264"/>
-        <w:ind w:left="340" w:hanging="340"/>
-      </w:pPr>
-      <w:r>
-        <w:rPr>
-          <w:rFonts w:ascii="Arial" w:cs="Arial" w:eastAsia="Arial" w:hAnsi="Arial"/>
-          <w:b/>
-          <w:bCs/>
-          <w:color w:val="000000"/>
-          <w:sz w:val="21"/>
-          <w:szCs w:val="21"/>
-        </w:rPr>
-        <w:t xml:space="preserve">52.</w:t>
-      </w:r>
-      <w:r>
-        <w:rPr>
-          <w:rFonts w:ascii="Arial" w:cs="Arial" w:eastAsia="Arial" w:hAnsi="Arial"/>
-          <w:sz w:val="21"/>
-          <w:szCs w:val="21"/>
-        </w:rPr>
-        <w:t xml:space="preserve">	</w:t>
-      </w:r>
-      <w:r>
-        <w:rPr>
-          <w:rFonts w:ascii="Arial" w:cs="Arial" w:eastAsia="Arial" w:hAnsi="Arial"/>
-          <w:b w:val="false"/>
-          <w:bCs w:val="false"/>
-          <w:sz w:val="21"/>
-          <w:szCs w:val="21"/>
-        </w:rPr>
-        <w:t xml:space="preserve">Si pudiera resolver tres problemas de la empresa inmediatamente, ¿este estaría entre ellos? ¿Por qué?</w:t>
-      </w:r>
-    </w:p>
-    <w:p>
-      <w:pPr>
-        <w:tabs>
-          <w:tab w:val="left" w:pos="340"/>
-        </w:tabs>
-        <w:spacing w:after="60" w:line="264"/>
-        <w:ind w:left="340" w:hanging="340"/>
-      </w:pPr>
-      <w:r>
-        <w:rPr>
-          <w:rFonts w:ascii="Arial" w:cs="Arial" w:eastAsia="Arial" w:hAnsi="Arial"/>
-          <w:b/>
-          <w:bCs/>
-          <w:color w:val="000000"/>
-          <w:sz w:val="21"/>
-          <w:szCs w:val="21"/>
-        </w:rPr>
-        <w:t xml:space="preserve">53.</w:t>
-      </w:r>
-      <w:r>
-        <w:rPr>
-          <w:rFonts w:ascii="Arial" w:cs="Arial" w:eastAsia="Arial" w:hAnsi="Arial"/>
-          <w:sz w:val="21"/>
-          <w:szCs w:val="21"/>
-        </w:rPr>
-        <w:t xml:space="preserve">	</w:t>
-      </w:r>
-      <w:r>
-        <w:rPr>
-          <w:rFonts w:ascii="Arial" w:cs="Arial" w:eastAsia="Arial" w:hAnsi="Arial"/>
-          <w:b w:val="false"/>
-          <w:bCs w:val="false"/>
-          <w:sz w:val="21"/>
-          <w:szCs w:val="21"/>
-        </w:rPr>
-        <w:t xml:space="preserve">¿Qué podría ocurrir si la empresa continúa tomando decisiones de compra de la misma manera?</w:t>
-      </w:r>
-    </w:p>
-    <w:p>
-      <w:pPr>
-        <w:pStyle w:val="Heading2"/>
-      </w:pPr>
-      <w:r>
-        <w:t xml:space="preserve">2.9 Cierre</w:t>
-      </w:r>
-    </w:p>
-    <w:p>
-      <w:pPr>
-        <w:tabs>
-          <w:tab w:val="left" w:pos="340"/>
-        </w:tabs>
-        <w:spacing w:after="60" w:line="264"/>
-        <w:ind w:left="340" w:hanging="340"/>
-      </w:pPr>
-      <w:r>
-        <w:rPr>
-          <w:rFonts w:ascii="Arial" w:cs="Arial" w:eastAsia="Arial" w:hAnsi="Arial"/>
-          <w:b/>
-          <w:bCs/>
-          <w:color w:val="000000"/>
-          <w:sz w:val="21"/>
-          <w:szCs w:val="21"/>
-        </w:rPr>
-        <w:t xml:space="preserve">54.</w:t>
-      </w:r>
-      <w:r>
-        <w:rPr>
-          <w:rFonts w:ascii="Arial" w:cs="Arial" w:eastAsia="Arial" w:hAnsi="Arial"/>
-          <w:sz w:val="21"/>
-          <w:szCs w:val="21"/>
-        </w:rPr>
-        <w:t xml:space="preserve">	</w:t>
-      </w:r>
-      <w:r>
-        <w:rPr>
-          <w:rFonts w:ascii="Arial" w:cs="Arial" w:eastAsia="Arial" w:hAnsi="Arial"/>
-          <w:b w:val="false"/>
-          <w:bCs w:val="false"/>
-          <w:sz w:val="21"/>
-          <w:szCs w:val="21"/>
-        </w:rPr>
-        <w:t xml:space="preserve">¿Existe algún aspecto sobre las decisiones de compra e importación que no le haya preguntado y considere importante?</w:t>
-      </w:r>
-    </w:p>
-    <w:p>
-      <w:pPr>
-        <w:tabs>
-          <w:tab w:val="left" w:pos="340"/>
-        </w:tabs>
-        <w:spacing w:after="60" w:line="264"/>
-        <w:ind w:left="340" w:hanging="340"/>
-      </w:pPr>
-      <w:r>
-        <w:rPr>
-          <w:rFonts w:ascii="Arial" w:cs="Arial" w:eastAsia="Arial" w:hAnsi="Arial"/>
-          <w:b/>
-          <w:bCs/>
-          <w:color w:val="000000"/>
-          <w:sz w:val="21"/>
-          <w:szCs w:val="21"/>
-        </w:rPr>
-        <w:t xml:space="preserve">55.</w:t>
-      </w:r>
-      <w:r>
-        <w:rPr>
-          <w:rFonts w:ascii="Arial" w:cs="Arial" w:eastAsia="Arial" w:hAnsi="Arial"/>
-          <w:sz w:val="21"/>
-          <w:szCs w:val="21"/>
-        </w:rPr>
-        <w:t xml:space="preserve">	</w:t>
-      </w:r>
-      <w:r>
-        <w:rPr>
-          <w:rFonts w:ascii="Arial" w:cs="Arial" w:eastAsia="Arial" w:hAnsi="Arial"/>
-          <w:b w:val="false"/>
-          <w:bCs w:val="false"/>
-          <w:sz w:val="21"/>
-          <w:szCs w:val="21"/>
-        </w:rPr>
-        <w:t xml:space="preserve">¿Conoce a otro propietario, administrador o encargado de compras de una empresa importadora de repuestos que haya vivido este problema?</w:t>
-      </w:r>
-    </w:p>
-    <w:p>
-      <w:pPr>
-        <w:tabs>
-          <w:tab w:val="left" w:pos="340"/>
-        </w:tabs>
-        <w:spacing w:after="60" w:line="264"/>
-        <w:ind w:left="340" w:hanging="340"/>
-      </w:pPr>
-      <w:r>
-        <w:rPr>
-          <w:rFonts w:ascii="Arial" w:cs="Arial" w:eastAsia="Arial" w:hAnsi="Arial"/>
-          <w:b/>
-          <w:bCs/>
-          <w:color w:val="000000"/>
-          <w:sz w:val="21"/>
-          <w:szCs w:val="21"/>
-        </w:rPr>
-        <w:t xml:space="preserve">56.</w:t>
-      </w:r>
-      <w:r>
-        <w:rPr>
-          <w:rFonts w:ascii="Arial" w:cs="Arial" w:eastAsia="Arial" w:hAnsi="Arial"/>
-          <w:sz w:val="21"/>
-          <w:szCs w:val="21"/>
-        </w:rPr>
-        <w:t xml:space="preserve">	</w:t>
-      </w:r>
-      <w:r>
-        <w:rPr>
-          <w:rFonts w:ascii="Arial" w:cs="Arial" w:eastAsia="Arial" w:hAnsi="Arial"/>
-          <w:b w:val="false"/>
-          <w:bCs w:val="false"/>
-          <w:sz w:val="21"/>
-          <w:szCs w:val="21"/>
-        </w:rPr>
-        <w:t xml:space="preserve">¿Podría ponerme en contacto con esa persona para realizarle una entrevista similar?</w:t>
-      </w:r>
-    </w:p>
-    <w:p>
-      <w:pPr>
-        <w:spacing w:after="200" w:line="276"/>
-      </w:pPr>
-      <w:r>
-        <w:rPr>
-          <w:rFonts w:ascii="Arial" w:cs="Arial" w:eastAsia="Arial" w:hAnsi="Arial"/>
-          <w:sz w:val="22"/>
-          <w:szCs w:val="22"/>
-        </w:rPr>
-        <w:t xml:space="preserve"/>
-      </w:r>
-    </w:p>
-    <w:p>
-      <w:pPr>
-        <w:pStyle w:val="Heading2"/>
-      </w:pPr>
-      <w:r>
-        <w:t xml:space="preserve">2.10 Cómo repreguntar</w:t>
-      </w:r>
-    </w:p>
-    <w:p>
-      <w:pPr>
-        <w:spacing w:after="120" w:line="276"/>
-      </w:pPr>
-      <w:r>
-        <w:rPr>
-          <w:rFonts w:ascii="Arial" w:cs="Arial" w:eastAsia="Arial" w:hAnsi="Arial"/>
-          <w:sz w:val="22"/>
-          <w:szCs w:val="22"/>
-        </w:rPr>
-        <w:t xml:space="preserve">Cuando la persona cuenta algo que parece importante, hay que bajarlo a un hecho antes de seguir. Cuatro repreguntas alcanzan:</w:t>
-      </w:r>
-    </w:p>
-    <w:p>
-      <w:pPr>
-        <w:pStyle w:val="ListParagraph"/>
-        <w:numPr>
-          <w:ilvl w:val="0"/>
-          <w:numId w:val="2"/>
-        </w:numPr>
-        <w:spacing w:after="60" w:line="264"/>
-      </w:pPr>
-      <w:r>
-        <w:rPr>
-          <w:rFonts w:ascii="Arial" w:cs="Arial" w:eastAsia="Arial" w:hAnsi="Arial"/>
-          <w:sz w:val="21"/>
-          <w:szCs w:val="21"/>
-        </w:rPr>
-        <w:t xml:space="preserve">¿Cuándo ocurrió exactamente?</w:t>
-      </w:r>
-    </w:p>
-    <w:p>
-      <w:pPr>
-        <w:pStyle w:val="ListParagraph"/>
-        <w:numPr>
-          <w:ilvl w:val="0"/>
-          <w:numId w:val="2"/>
-        </w:numPr>
-        <w:spacing w:after="60" w:line="264"/>
-      </w:pPr>
-      <w:r>
-        <w:rPr>
-          <w:rFonts w:ascii="Arial" w:cs="Arial" w:eastAsia="Arial" w:hAnsi="Arial"/>
-          <w:sz w:val="21"/>
-          <w:szCs w:val="21"/>
-        </w:rPr>
-        <w:t xml:space="preserve">¿Qué hizo después?</w:t>
-      </w:r>
-    </w:p>
-    <w:p>
-      <w:pPr>
-        <w:pStyle w:val="ListParagraph"/>
-        <w:numPr>
-          <w:ilvl w:val="0"/>
-          <w:numId w:val="2"/>
-        </w:numPr>
-        <w:spacing w:after="60" w:line="264"/>
-      </w:pPr>
-      <w:r>
-        <w:rPr>
-          <w:rFonts w:ascii="Arial" w:cs="Arial" w:eastAsia="Arial" w:hAnsi="Arial"/>
-          <w:sz w:val="21"/>
-          <w:szCs w:val="21"/>
-        </w:rPr>
-        <w:t xml:space="preserve">¿Cuánto le costó, en dinero, en tiempo o en ventas?</w:t>
-      </w:r>
-    </w:p>
-    <w:p>
-      <w:pPr>
-        <w:pStyle w:val="ListParagraph"/>
-        <w:numPr>
-          <w:ilvl w:val="0"/>
-          <w:numId w:val="2"/>
-        </w:numPr>
-        <w:spacing w:after="60" w:line="264"/>
-      </w:pPr>
-      <w:r>
-        <w:rPr>
-          <w:rFonts w:ascii="Arial" w:cs="Arial" w:eastAsia="Arial" w:hAnsi="Arial"/>
-          <w:sz w:val="21"/>
-          <w:szCs w:val="21"/>
-        </w:rPr>
-        <w:t xml:space="preserve">¿Puede contarme un ejemplo concreto?</w:t>
-      </w:r>
-    </w:p>
-    <w:p>
-      <w:pPr>
-        <w:spacing w:after="120" w:line="276"/>
-      </w:pPr>
-      <w:r>
-        <w:rPr>
-          <w:rFonts w:ascii="Arial" w:cs="Arial" w:eastAsia="Arial" w:hAnsi="Arial"/>
-          <w:sz w:val="22"/>
-          <w:szCs w:val="22"/>
-        </w:rPr>
-        <w:t xml:space="preserve">Una respuesta en presente genérico («siempre nos pasa», «es un problema constante») todavía no es un dato. Se convierte en dato cuando tiene fecha y número.</w:t>
-      </w:r>
-    </w:p>
-    <w:p>
-      <w:r>
-        <w:br w:type="page"/>
-      </w:r>
-    </w:p>
-    <w:p>
-      <w:pPr>
-        <w:pStyle w:val="Heading1"/>
-      </w:pPr>
-      <w:r>
-        <w:t xml:space="preserve">3. Registro de entrevistas realizadas</w:t>
+        <w:t xml:space="preserve">2. Registro de entrevistas realizadas</w:t>
       </w:r>
     </w:p>
     <w:p>
@@ -5278,7 +2794,7 @@
         <w:pStyle w:val="Heading1"/>
       </w:pPr>
       <w:r>
-        <w:t xml:space="preserve">4. Template «Tu mejor entrevista»</w:t>
+        <w:t xml:space="preserve">3. Template «Tu mejor entrevista»</w:t>
       </w:r>
     </w:p>
     <w:tbl>
@@ -5341,7 +2857,7 @@
                 <w:sz w:val="20"/>
                 <w:szCs w:val="20"/>
               </w:rPr>
-              <w:t xml:space="preserve">Lo que sigue está completado con la entrevista piloto a Carlos Andrés Méndez, encargado de compras e importaciones de una importadora mediana de repuestos de Santa Cruz, registrada el 22 de septiembre de 2026. Es el ensayo del guion, no una entrevista de campo, y así debe leerse.</w:t>
+              <w:t xml:space="preserve">Lo que sigue está completado con la entrevista piloto a Carlos Andrés Méndez, encargado de compras e importaciones de una importadora mediana de repuestos de Santa Cruz, registrada el 22 de septiembre de 2026. Es el ensayo de la guía, no una entrevista de campo, y así debe leerse.</w:t>
             </w:r>
           </w:p>
           <w:p>
@@ -5365,7 +2881,7 @@
         <w:pStyle w:val="Heading2"/>
       </w:pPr>
       <w:r>
-        <w:t xml:space="preserve">4.1 La situación que relató</w:t>
+        <w:t xml:space="preserve">3.1 La situación que relató</w:t>
       </w:r>
     </w:p>
     <w:p>
@@ -5386,7 +2902,7 @@
         <w:pStyle w:val="Heading2"/>
       </w:pPr>
       <w:r>
-        <w:t xml:space="preserve">4.2 Las seis preguntas del template</w:t>
+        <w:t xml:space="preserve">3.2 Las seis preguntas del template</w:t>
       </w:r>
     </w:p>
     <w:tbl>
@@ -5935,7 +3451,7 @@
         <w:pStyle w:val="Heading2"/>
       </w:pPr>
       <w:r>
-        <w:t xml:space="preserve">4.3 Qué dejó esta conversación</w:t>
+        <w:t xml:space="preserve">3.3 Qué dejó esta conversación</w:t>
       </w:r>
     </w:p>
     <w:tbl>
@@ -6233,7 +3749,7 @@
         <w:pStyle w:val="Heading1"/>
       </w:pPr>
       <w:r>
-        <w:t xml:space="preserve">5. Mapa de empatía del entrevistado</w:t>
+        <w:t xml:space="preserve">4. Mapa de empatía del entrevistado</w:t>
       </w:r>
     </w:p>
     <w:p>
@@ -7430,7 +4946,7 @@
         <w:pStyle w:val="Heading1"/>
       </w:pPr>
       <w:r>
-        <w:t xml:space="preserve">6. Contraste contra el Mapa de Propuesta de Valor</w:t>
+        <w:t xml:space="preserve">5. Contraste contra el Mapa de Propuesta de Valor</w:t>
       </w:r>
     </w:p>
     <w:p>
@@ -9000,581 +6516,6 @@
                 <w:szCs w:val="20"/>
               </w:rPr>
               <w:t xml:space="preserve">No se preguntó y no se debe preguntar en esta etapa. Lo único medido es que hoy pagan sistema contable, inventario y despachante, y ninguno les dice cuándo comprar.</w:t>
-            </w:r>
-          </w:p>
-        </w:tc>
-      </w:tr>
-    </w:tbl>
-    <w:p>
-      <w:r>
-        <w:br w:type="page"/>
-      </w:r>
-    </w:p>
-    <w:p>
-      <w:pPr>
-        <w:pStyle w:val="Heading1"/>
-      </w:pPr>
-      <w:r>
-        <w:t xml:space="preserve">7. Hallazgos y qué falta</w:t>
-      </w:r>
-    </w:p>
-    <w:p>
-      <w:pPr>
-        <w:pStyle w:val="Heading2"/>
-      </w:pPr>
-      <w:r>
-        <w:t xml:space="preserve">7.1 Lo que la ronda dejó en claro</w:t>
-      </w:r>
-    </w:p>
-    <w:p>
-      <w:pPr>
-        <w:spacing w:after="120" w:line="276"/>
-      </w:pPr>
-      <w:r>
-        <w:rPr>
-          <w:rFonts w:ascii="Arial" w:cs="Arial" w:eastAsia="Arial" w:hAnsi="Arial"/>
-          <w:sz w:val="22"/>
-          <w:szCs w:val="22"/>
-        </w:rPr>
-        <w:t xml:space="preserve">El problema existe y no se reduce a comprar caro. Quien decide una importación equilibra tres riesgos al mismo tiempo: pagar un tipo de cambio desfavorable, inmovilizar capital en repuestos que no rotan y perder ventas por quedarse sin los que sí. Cualquiera de los tres, tomado por separado, lleva a una recomendación equivocada.</w:t>
-      </w:r>
-    </w:p>
-    <w:p>
-      <w:pPr>
-        <w:spacing w:after="120" w:line="276"/>
-      </w:pPr>
-      <w:r>
-        <w:rPr>
-          <w:rFonts w:ascii="Arial" w:cs="Arial" w:eastAsia="Arial" w:hAnsi="Arial"/>
-          <w:sz w:val="22"/>
-          <w:szCs w:val="22"/>
-        </w:rPr>
-        <w:t xml:space="preserve">El segundo hallazgo es que el problema no afecta igual a todas las empresas. Donde hay registros ordenados, inventario actualizado y clasificación por rotación, la dificultad se corre del «cuánto compro» al «a qué precio vendo sin perder al cliente». Eso es un segmento distinto y conviene decidir si entra en el alcance.</w:t>
-      </w:r>
-    </w:p>
-    <w:p>
-      <w:pPr>
-        <w:pStyle w:val="Heading2"/>
-      </w:pPr>
-      <w:r>
-        <w:t xml:space="preserve">7.2 Lo que hay que corregir en el lienzo</w:t>
-      </w:r>
-    </w:p>
-    <w:p>
-      <w:pPr>
-        <w:pStyle w:val="ListParagraph"/>
-        <w:numPr>
-          <w:ilvl w:val="0"/>
-          <w:numId w:val="2"/>
-        </w:numPr>
-        <w:spacing w:after="60" w:line="264"/>
-      </w:pPr>
-      <w:r>
-        <w:rPr>
-          <w:rFonts w:ascii="Arial" w:cs="Arial" w:eastAsia="Arial" w:hAnsi="Arial"/>
-          <w:sz w:val="21"/>
-          <w:szCs w:val="21"/>
-        </w:rPr>
-        <w:t xml:space="preserve">Reescribir el enunciado del problema: la causa que teníamos escrita apunta a la variable que menos varía. El eje es que el costo en bolivianos de un pedido se define recién el día del pago.</w:t>
-      </w:r>
-    </w:p>
-    <w:p>
-      <w:pPr>
-        <w:pStyle w:val="ListParagraph"/>
-        <w:numPr>
-          <w:ilvl w:val="0"/>
-          <w:numId w:val="2"/>
-        </w:numPr>
-        <w:spacing w:after="60" w:line="264"/>
-      </w:pPr>
-      <w:r>
-        <w:rPr>
-          <w:rFonts w:ascii="Arial" w:cs="Arial" w:eastAsia="Arial" w:hAnsi="Arial"/>
-          <w:sz w:val="21"/>
-          <w:szCs w:val="21"/>
-        </w:rPr>
-        <w:t xml:space="preserve">Mover el supuesto de la información de precios de causa principal a una de varias, y subir en su lugar la dificultad para cruzar variables que se mueven al mismo tiempo.</w:t>
-      </w:r>
-    </w:p>
-    <w:p>
-      <w:pPr>
-        <w:pStyle w:val="ListParagraph"/>
-        <w:numPr>
-          <w:ilvl w:val="0"/>
-          <w:numId w:val="2"/>
-        </w:numPr>
-        <w:spacing w:after="60" w:line="264"/>
-      </w:pPr>
-      <w:r>
-        <w:rPr>
-          <w:rFonts w:ascii="Arial" w:cs="Arial" w:eastAsia="Arial" w:hAnsi="Arial"/>
-          <w:sz w:val="21"/>
-          <w:szCs w:val="21"/>
-        </w:rPr>
-        <w:t xml:space="preserve">Agregar al perfil del usuario el plazo de entrega y la forma de pago, que aparecieron en los relatos y no estaban en el lienzo.</w:t>
-      </w:r>
-    </w:p>
-    <w:p>
-      <w:pPr>
-        <w:pStyle w:val="ListParagraph"/>
-        <w:numPr>
-          <w:ilvl w:val="0"/>
-          <w:numId w:val="2"/>
-        </w:numPr>
-        <w:spacing w:after="60" w:line="264"/>
-      </w:pPr>
-      <w:r>
-        <w:rPr>
-          <w:rFonts w:ascii="Arial" w:cs="Arial" w:eastAsia="Arial" w:hAnsi="Arial"/>
-          <w:sz w:val="21"/>
-          <w:szCs w:val="21"/>
-        </w:rPr>
-        <w:t xml:space="preserve">Marcar en el lienzo las tres casillas que quedaron con interrogante, para que se vea qué falta y no se lea como si estuviera todo validado.</w:t>
-      </w:r>
-    </w:p>
-    <w:p>
-      <w:pPr>
-        <w:pStyle w:val="Heading2"/>
-      </w:pPr>
-      <w:r>
-        <w:t xml:space="preserve">7.3 Lo que falta para cerrar la validación</w:t>
-      </w:r>
-    </w:p>
-    <w:tbl>
-      <w:tblPr>
-        <w:tblW w:type="dxa" w:w="9638"/>
-        <w:tblBorders>
-          <w:top w:val="single" w:color="auto" w:sz="4"/>
-          <w:left w:val="single" w:color="auto" w:sz="4"/>
-          <w:bottom w:val="single" w:color="auto" w:sz="4"/>
-          <w:right w:val="single" w:color="auto" w:sz="4"/>
-          <w:insideH w:val="single" w:color="auto" w:sz="4"/>
-          <w:insideV w:val="single" w:color="auto" w:sz="4"/>
-        </w:tblBorders>
-      </w:tblPr>
-      <w:tblGrid>
-        <w:gridCol w:w="4400"/>
-        <w:gridCol w:w="5238"/>
-      </w:tblGrid>
-      <w:tr>
-        <w:trPr>
-          <w:tblHeader/>
-        </w:trPr>
-        <w:tc>
-          <w:tcPr>
-            <w:tcW w:type="dxa" w:w="4400"/>
-            <w:tcBorders>
-              <w:top w:val="single" w:color="BFBFBF" w:sz="1"/>
-              <w:left w:val="single" w:color="BFBFBF" w:sz="1"/>
-              <w:bottom w:val="single" w:color="BFBFBF" w:sz="1"/>
-              <w:right w:val="single" w:color="BFBFBF" w:sz="1"/>
-            </w:tcBorders>
-            <w:shd w:fill="DCE6F1" w:val="clear"/>
-            <w:tcMar>
-              <w:top w:type="dxa" w:w="80"/>
-              <w:left w:type="dxa" w:w="120"/>
-              <w:bottom w:type="dxa" w:w="80"/>
-              <w:right w:type="dxa" w:w="120"/>
-            </w:tcMar>
-            <w:vAlign w:val="top"/>
-          </w:tcPr>
-          <w:p>
-            <w:pPr>
-              <w:spacing w:after="0" w:line="276"/>
-            </w:pPr>
-            <w:r>
-              <w:rPr>
-                <w:rFonts w:ascii="Arial" w:cs="Arial" w:eastAsia="Arial" w:hAnsi="Arial"/>
-                <w:b/>
-                <w:bCs/>
-                <w:color w:val="1F4E79"/>
-                <w:sz w:val="19"/>
-                <w:szCs w:val="19"/>
-              </w:rPr>
-              <w:t xml:space="preserve">Pendiente</w:t>
-            </w:r>
-          </w:p>
-        </w:tc>
-        <w:tc>
-          <w:tcPr>
-            <w:tcW w:type="dxa" w:w="5238"/>
-            <w:tcBorders>
-              <w:top w:val="single" w:color="BFBFBF" w:sz="1"/>
-              <w:left w:val="single" w:color="BFBFBF" w:sz="1"/>
-              <w:bottom w:val="single" w:color="BFBFBF" w:sz="1"/>
-              <w:right w:val="single" w:color="BFBFBF" w:sz="1"/>
-            </w:tcBorders>
-            <w:shd w:fill="DCE6F1" w:val="clear"/>
-            <w:tcMar>
-              <w:top w:type="dxa" w:w="80"/>
-              <w:left w:type="dxa" w:w="120"/>
-              <w:bottom w:type="dxa" w:w="80"/>
-              <w:right w:type="dxa" w:w="120"/>
-            </w:tcMar>
-            <w:vAlign w:val="top"/>
-          </w:tcPr>
-          <w:p>
-            <w:pPr>
-              <w:spacing w:after="0" w:line="276"/>
-            </w:pPr>
-            <w:r>
-              <w:rPr>
-                <w:rFonts w:ascii="Arial" w:cs="Arial" w:eastAsia="Arial" w:hAnsi="Arial"/>
-                <w:b/>
-                <w:bCs/>
-                <w:color w:val="1F4E79"/>
-                <w:sz w:val="19"/>
-                <w:szCs w:val="19"/>
-              </w:rPr>
-              <w:t xml:space="preserve">Por qué importa</w:t>
-            </w:r>
-          </w:p>
-        </w:tc>
-      </w:tr>
-      <w:tr>
-        <w:tc>
-          <w:tcPr>
-            <w:tcW w:type="dxa" w:w="4400"/>
-            <w:tcBorders>
-              <w:top w:val="single" w:color="BFBFBF" w:sz="1"/>
-              <w:left w:val="single" w:color="BFBFBF" w:sz="1"/>
-              <w:bottom w:val="single" w:color="BFBFBF" w:sz="1"/>
-              <w:right w:val="single" w:color="BFBFBF" w:sz="1"/>
-            </w:tcBorders>
-            <w:tcMar>
-              <w:top w:type="dxa" w:w="80"/>
-              <w:left w:type="dxa" w:w="120"/>
-              <w:bottom w:type="dxa" w:w="80"/>
-              <w:right w:type="dxa" w:w="120"/>
-            </w:tcMar>
-            <w:vAlign w:val="top"/>
-          </w:tcPr>
-          <w:p>
-            <w:pPr>
-              <w:spacing w:after="0" w:line="276"/>
-            </w:pPr>
-            <w:r>
-              <w:rPr>
-                <w:rFonts w:ascii="Arial" w:cs="Arial" w:eastAsia="Arial" w:hAnsi="Arial"/>
-                <w:sz w:val="20"/>
-                <w:szCs w:val="20"/>
-              </w:rPr>
-              <w:t xml:space="preserve">Completar la ronda con entrevistas a personas ajenas al equipo</w:t>
-            </w:r>
-          </w:p>
-        </w:tc>
-        <w:tc>
-          <w:tcPr>
-            <w:tcW w:type="dxa" w:w="5238"/>
-            <w:tcBorders>
-              <w:top w:val="single" w:color="BFBFBF" w:sz="1"/>
-              <w:left w:val="single" w:color="BFBFBF" w:sz="1"/>
-              <w:bottom w:val="single" w:color="BFBFBF" w:sz="1"/>
-              <w:right w:val="single" w:color="BFBFBF" w:sz="1"/>
-            </w:tcBorders>
-            <w:tcMar>
-              <w:top w:type="dxa" w:w="80"/>
-              <w:left w:type="dxa" w:w="120"/>
-              <w:bottom w:type="dxa" w:w="80"/>
-              <w:right w:type="dxa" w:w="120"/>
-            </w:tcMar>
-            <w:vAlign w:val="top"/>
-          </w:tcPr>
-          <w:p>
-            <w:pPr>
-              <w:spacing w:after="0" w:line="276"/>
-            </w:pPr>
-            <w:r>
-              <w:rPr>
-                <w:rFonts w:ascii="Arial" w:cs="Arial" w:eastAsia="Arial" w:hAnsi="Arial"/>
-                <w:sz w:val="20"/>
-                <w:szCs w:val="20"/>
-              </w:rPr>
-              <w:t xml:space="preserve">Es lo que convierte este documento de ensayo del guion en validación del problema. Sin eso, las marcas de la sección 6 son provisionales.</w:t>
-            </w:r>
-          </w:p>
-        </w:tc>
-      </w:tr>
-      <w:tr>
-        <w:tc>
-          <w:tcPr>
-            <w:tcW w:type="dxa" w:w="4400"/>
-            <w:tcBorders>
-              <w:top w:val="single" w:color="BFBFBF" w:sz="1"/>
-              <w:left w:val="single" w:color="BFBFBF" w:sz="1"/>
-              <w:bottom w:val="single" w:color="BFBFBF" w:sz="1"/>
-              <w:right w:val="single" w:color="BFBFBF" w:sz="1"/>
-            </w:tcBorders>
-            <w:tcMar>
-              <w:top w:type="dxa" w:w="80"/>
-              <w:left w:type="dxa" w:w="120"/>
-              <w:bottom w:type="dxa" w:w="80"/>
-              <w:right w:type="dxa" w:w="120"/>
-            </w:tcMar>
-            <w:vAlign w:val="top"/>
-          </w:tcPr>
-          <w:p>
-            <w:pPr>
-              <w:spacing w:after="0" w:line="276"/>
-            </w:pPr>
-            <w:r>
-              <w:rPr>
-                <w:rFonts w:ascii="Arial" w:cs="Arial" w:eastAsia="Arial" w:hAnsi="Arial"/>
-                <w:sz w:val="20"/>
-                <w:szCs w:val="20"/>
-              </w:rPr>
-              <w:t xml:space="preserve">Contestar si la decisión se toma mirando precios o mirando inventario y capital</w:t>
-            </w:r>
-          </w:p>
-        </w:tc>
-        <w:tc>
-          <w:tcPr>
-            <w:tcW w:type="dxa" w:w="5238"/>
-            <w:tcBorders>
-              <w:top w:val="single" w:color="BFBFBF" w:sz="1"/>
-              <w:left w:val="single" w:color="BFBFBF" w:sz="1"/>
-              <w:bottom w:val="single" w:color="BFBFBF" w:sz="1"/>
-              <w:right w:val="single" w:color="BFBFBF" w:sz="1"/>
-            </w:tcBorders>
-            <w:tcMar>
-              <w:top w:type="dxa" w:w="80"/>
-              <w:left w:type="dxa" w:w="120"/>
-              <w:bottom w:type="dxa" w:w="80"/>
-              <w:right w:type="dxa" w:w="120"/>
-            </w:tcMar>
-            <w:vAlign w:val="top"/>
-          </w:tcPr>
-          <w:p>
-            <w:pPr>
-              <w:spacing w:after="0" w:line="276"/>
-            </w:pPr>
-            <w:r>
-              <w:rPr>
-                <w:rFonts w:ascii="Arial" w:cs="Arial" w:eastAsia="Arial" w:hAnsi="Arial"/>
-                <w:sz w:val="20"/>
-                <w:szCs w:val="20"/>
-              </w:rPr>
-              <w:t xml:space="preserve">Es la pregunta que decide el enfoque del proyecto. Las preguntas clave de las secciones 2.3 y 2.5 están diseñadas para separarlo.</w:t>
-            </w:r>
-          </w:p>
-        </w:tc>
-      </w:tr>
-      <w:tr>
-        <w:tc>
-          <w:tcPr>
-            <w:tcW w:type="dxa" w:w="4400"/>
-            <w:tcBorders>
-              <w:top w:val="single" w:color="BFBFBF" w:sz="1"/>
-              <w:left w:val="single" w:color="BFBFBF" w:sz="1"/>
-              <w:bottom w:val="single" w:color="BFBFBF" w:sz="1"/>
-              <w:right w:val="single" w:color="BFBFBF" w:sz="1"/>
-            </w:tcBorders>
-            <w:tcMar>
-              <w:top w:type="dxa" w:w="80"/>
-              <w:left w:type="dxa" w:w="120"/>
-              <w:bottom w:type="dxa" w:w="80"/>
-              <w:right w:type="dxa" w:w="120"/>
-            </w:tcMar>
-            <w:vAlign w:val="top"/>
-          </w:tcPr>
-          <w:p>
-            <w:pPr>
-              <w:spacing w:after="0" w:line="276"/>
-            </w:pPr>
-            <w:r>
-              <w:rPr>
-                <w:rFonts w:ascii="Arial" w:cs="Arial" w:eastAsia="Arial" w:hAnsi="Arial"/>
-                <w:sz w:val="20"/>
-                <w:szCs w:val="20"/>
-              </w:rPr>
-              <w:t xml:space="preserve">Distinguir el problema de abastecimiento del de precio de venta</w:t>
-            </w:r>
-          </w:p>
-        </w:tc>
-        <w:tc>
-          <w:tcPr>
-            <w:tcW w:type="dxa" w:w="5238"/>
-            <w:tcBorders>
-              <w:top w:val="single" w:color="BFBFBF" w:sz="1"/>
-              <w:left w:val="single" w:color="BFBFBF" w:sz="1"/>
-              <w:bottom w:val="single" w:color="BFBFBF" w:sz="1"/>
-              <w:right w:val="single" w:color="BFBFBF" w:sz="1"/>
-            </w:tcBorders>
-            <w:tcMar>
-              <w:top w:type="dxa" w:w="80"/>
-              <w:left w:type="dxa" w:w="120"/>
-              <w:bottom w:type="dxa" w:w="80"/>
-              <w:right w:type="dxa" w:w="120"/>
-            </w:tcMar>
-            <w:vAlign w:val="top"/>
-          </w:tcPr>
-          <w:p>
-            <w:pPr>
-              <w:spacing w:after="0" w:line="276"/>
-            </w:pPr>
-            <w:r>
-              <w:rPr>
-                <w:rFonts w:ascii="Arial" w:cs="Arial" w:eastAsia="Arial" w:hAnsi="Arial"/>
-                <w:sz w:val="20"/>
-                <w:szCs w:val="20"/>
-              </w:rPr>
-              <w:t xml:space="preserve">Aparecieron los dos en los relatos y son extremos opuestos del proceso, con clientes y datos distintos. Mezclarlos produce entrevistas que no se pueden comparar.</w:t>
-            </w:r>
-          </w:p>
-        </w:tc>
-      </w:tr>
-      <w:tr>
-        <w:tc>
-          <w:tcPr>
-            <w:tcW w:type="dxa" w:w="4400"/>
-            <w:tcBorders>
-              <w:top w:val="single" w:color="BFBFBF" w:sz="1"/>
-              <w:left w:val="single" w:color="BFBFBF" w:sz="1"/>
-              <w:bottom w:val="single" w:color="BFBFBF" w:sz="1"/>
-              <w:right w:val="single" w:color="BFBFBF" w:sz="1"/>
-            </w:tcBorders>
-            <w:tcMar>
-              <w:top w:type="dxa" w:w="80"/>
-              <w:left w:type="dxa" w:w="120"/>
-              <w:bottom w:type="dxa" w:w="80"/>
-              <w:right w:type="dxa" w:w="120"/>
-            </w:tcMar>
-            <w:vAlign w:val="top"/>
-          </w:tcPr>
-          <w:p>
-            <w:pPr>
-              <w:spacing w:after="0" w:line="276"/>
-            </w:pPr>
-            <w:r>
-              <w:rPr>
-                <w:rFonts w:ascii="Arial" w:cs="Arial" w:eastAsia="Arial" w:hAnsi="Arial"/>
-                <w:sz w:val="20"/>
-                <w:szCs w:val="20"/>
-              </w:rPr>
-              <w:t xml:space="preserve">Confirmar si existe acceso a datos históricos de compras de alguna importadora</w:t>
-            </w:r>
-          </w:p>
-        </w:tc>
-        <w:tc>
-          <w:tcPr>
-            <w:tcW w:type="dxa" w:w="5238"/>
-            <w:tcBorders>
-              <w:top w:val="single" w:color="BFBFBF" w:sz="1"/>
-              <w:left w:val="single" w:color="BFBFBF" w:sz="1"/>
-              <w:bottom w:val="single" w:color="BFBFBF" w:sz="1"/>
-              <w:right w:val="single" w:color="BFBFBF" w:sz="1"/>
-            </w:tcBorders>
-            <w:tcMar>
-              <w:top w:type="dxa" w:w="80"/>
-              <w:left w:type="dxa" w:w="120"/>
-              <w:bottom w:type="dxa" w:w="80"/>
-              <w:right w:type="dxa" w:w="120"/>
-            </w:tcMar>
-            <w:vAlign w:val="top"/>
-          </w:tcPr>
-          <w:p>
-            <w:pPr>
-              <w:spacing w:after="0" w:line="276"/>
-            </w:pPr>
-            <w:r>
-              <w:rPr>
-                <w:rFonts w:ascii="Arial" w:cs="Arial" w:eastAsia="Arial" w:hAnsi="Arial"/>
-                <w:sz w:val="20"/>
-                <w:szCs w:val="20"/>
-              </w:rPr>
-              <w:t xml:space="preserve">Define si el proyecto puede analizar datos propios o depende de que un tercero los ceda.</w:t>
-            </w:r>
-          </w:p>
-        </w:tc>
-      </w:tr>
-    </w:tbl>
-    <w:p>
-      <w:pPr>
-        <w:spacing w:after="200" w:line="276"/>
-      </w:pPr>
-      <w:r>
-        <w:rPr>
-          <w:rFonts w:ascii="Arial" w:cs="Arial" w:eastAsia="Arial" w:hAnsi="Arial"/>
-          <w:sz w:val="22"/>
-          <w:szCs w:val="22"/>
-        </w:rPr>
-        <w:t xml:space="preserve"/>
-      </w:r>
-    </w:p>
-    <w:tbl>
-      <w:tblPr>
-        <w:tblW w:type="dxa" w:w="9638"/>
-        <w:tblBorders>
-          <w:top w:val="single" w:color="auto" w:sz="4"/>
-          <w:left w:val="single" w:color="auto" w:sz="4"/>
-          <w:bottom w:val="single" w:color="auto" w:sz="4"/>
-          <w:right w:val="single" w:color="auto" w:sz="4"/>
-          <w:insideH w:val="single" w:color="auto" w:sz="4"/>
-          <w:insideV w:val="single" w:color="auto" w:sz="4"/>
-        </w:tblBorders>
-      </w:tblPr>
-      <w:tblGrid>
-        <w:gridCol w:w="9638"/>
-      </w:tblGrid>
-      <w:tr>
-        <w:tc>
-          <w:tcPr>
-            <w:tcW w:type="dxa" w:w="9638"/>
-            <w:tcBorders>
-              <w:top w:val="single" w:color="BFBFBF" w:sz="1"/>
-              <w:left w:val="single" w:color="BFBFBF" w:sz="1"/>
-              <w:bottom w:val="single" w:color="BFBFBF" w:sz="1"/>
-              <w:right w:val="single" w:color="BFBFBF" w:sz="1"/>
-            </w:tcBorders>
-            <w:shd w:fill="F2F2F2" w:val="clear"/>
-            <w:tcMar>
-              <w:top w:type="dxa" w:w="80"/>
-              <w:left w:type="dxa" w:w="120"/>
-              <w:bottom w:type="dxa" w:w="80"/>
-              <w:right w:type="dxa" w:w="120"/>
-            </w:tcMar>
-            <w:vAlign w:val="top"/>
-          </w:tcPr>
-          <w:p>
-            <w:pPr>
-              <w:spacing w:after="80" w:line="276"/>
-            </w:pPr>
-            <w:r>
-              <w:rPr>
-                <w:rFonts w:ascii="Arial" w:cs="Arial" w:eastAsia="Arial" w:hAnsi="Arial"/>
-                <w:b/>
-                <w:bCs/>
-                <w:color w:val="1F4E79"/>
-                <w:sz w:val="21"/>
-                <w:szCs w:val="21"/>
-              </w:rPr>
-              <w:t xml:space="preserve">Nota sobre las cifras de este documento</w:t>
-            </w:r>
-          </w:p>
-          <w:p>
-            <w:pPr>
-              <w:spacing w:after="80" w:line="276"/>
-            </w:pPr>
-            <w:r>
-              <w:rPr>
-                <w:rFonts w:ascii="Arial" w:cs="Arial" w:eastAsia="Arial" w:hAnsi="Arial"/>
-                <w:sz w:val="20"/>
-                <w:szCs w:val="20"/>
-              </w:rPr>
-              <w:t xml:space="preserve">Las cifras de contexto macroeconómico son del Banco Central de Bolivia y del Instituto Nacional de Estadística, con su fecha de corte indicada donde aparecen. Conviene tenerlas frescas: el régimen cambiario boliviano flota desde el 29 de junio de 2026, y cualquier conversión hecha antes de esa fecha da un resultado distinto hoy.</w:t>
-            </w:r>
-          </w:p>
-          <w:p>
-            <w:pPr>
-              <w:spacing w:after="0" w:line="276"/>
-            </w:pPr>
-            <w:r>
-              <w:rPr>
-                <w:rFonts w:ascii="Arial" w:cs="Arial" w:eastAsia="Arial" w:hAnsi="Arial"/>
-                <w:sz w:val="20"/>
-                <w:szCs w:val="20"/>
-              </w:rPr>
-              <w:t xml:space="preserve">Las cifras atribuidas a entrevistados son lo que esa persona dijo, no un dato contable auditado. Se citan como declaración y así deben presentarse en la defensa.</w:t>
             </w:r>
           </w:p>
         </w:tc>

</xml_diff>

<commit_message>
Reemplazar el mapa de empatia transcrito por la captura del tablero
La seccion que transcribia las nueve casillas duplicaba lo que ya esta
cargado en el tablero del equipo, asi que sale y en su lugar va la captura
como anexo, en una pagina apaisada para que el contenido se lea.

El contraste contra el Mapa de Propuesta de Valor pasa a ser el punto 4.
El documento queda en 8 paginas.

Verificado: Word lo abre, la ultima pagina sale apaisada y la imagen viaja
dentro del archivo, que pasa de 20 KB a 433 KB.

Co-Authored-By: Claude Opus 5 <noreply@anthropic.com>
Claude-Session: https://claude.ai/code/session_01Q6gU99fdE1UYYeA3Pjr9mH
</commit_message>
<xml_diff>
--- a/reports/validacion-del-problema.docx
+++ b/reports/validacion-del-problema.docx
@@ -3072,1204 +3072,7 @@
         <w:pStyle w:val="Heading1"/>
       </w:pPr>
       <w:r>
-        <w:t xml:space="preserve">4. Mapa de empatía del entrevistado</w:t>
-      </w:r>
-    </w:p>
-    <w:p>
-      <w:pPr>
-        <w:spacing w:after="120" w:line="276"/>
-      </w:pPr>
-      <w:r>
-        <w:rPr>
-          <w:rFonts w:ascii="Arial" w:cs="Arial" w:eastAsia="Arial" w:hAnsi="Arial"/>
-          <w:sz w:val="22"/>
-          <w:szCs w:val="22"/>
-        </w:rPr>
-        <w:t xml:space="preserve">Las nueve casillas completadas con la misma entrevista de la sección anterior.</w:t>
-      </w:r>
-    </w:p>
-    <w:p>
-      <w:pPr>
-        <w:spacing w:after="80" w:before="200"/>
-      </w:pPr>
-      <w:r>
-        <w:rPr>
-          <w:rFonts w:ascii="Arial" w:cs="Arial" w:eastAsia="Arial" w:hAnsi="Arial"/>
-          <w:b/>
-          <w:bCs/>
-          <w:color w:val="1F4E79"/>
-          <w:sz w:val="22"/>
-          <w:szCs w:val="22"/>
-        </w:rPr>
-        <w:t xml:space="preserve">01 · </w:t>
-      </w:r>
-      <w:r>
-        <w:rPr>
-          <w:rFonts w:ascii="Arial" w:cs="Arial" w:eastAsia="Arial" w:hAnsi="Arial"/>
-          <w:b/>
-          <w:bCs/>
-          <w:sz w:val="22"/>
-          <w:szCs w:val="22"/>
-        </w:rPr>
-        <w:t xml:space="preserve">¿Quién es?</w:t>
-      </w:r>
-    </w:p>
-    <w:p>
-      <w:pPr>
-        <w:spacing w:after="120" w:line="276"/>
-      </w:pPr>
-      <w:r>
-        <w:rPr>
-          <w:rFonts w:ascii="Arial" w:cs="Arial" w:eastAsia="Arial" w:hAnsi="Arial"/>
-          <w:sz w:val="21"/>
-          <w:szCs w:val="21"/>
-        </w:rPr>
-        <w:t xml:space="preserve">Encargado de compras e importaciones de una empresa mediana de repuestos automotrices de Santa Cruz. Ocho años en el rubro, cinco de ellos comprando al exterior. Participa en la selección de proveedores, el cálculo de costos, el control del inventario y la definición de cantidades. Decide solo en pedidos chicos; por encima de unos veinte mil dólares necesita la autorización del propietario.</w:t>
-      </w:r>
-    </w:p>
-    <w:p>
-      <w:pPr>
-        <w:spacing w:after="80" w:before="200"/>
-      </w:pPr>
-      <w:r>
-        <w:rPr>
-          <w:rFonts w:ascii="Arial" w:cs="Arial" w:eastAsia="Arial" w:hAnsi="Arial"/>
-          <w:b/>
-          <w:bCs/>
-          <w:color w:val="1F4E79"/>
-          <w:sz w:val="22"/>
-          <w:szCs w:val="22"/>
-        </w:rPr>
-        <w:t xml:space="preserve">02 · </w:t>
-      </w:r>
-      <w:r>
-        <w:rPr>
-          <w:rFonts w:ascii="Arial" w:cs="Arial" w:eastAsia="Arial" w:hAnsi="Arial"/>
-          <w:b/>
-          <w:bCs/>
-          <w:sz w:val="22"/>
-          <w:szCs w:val="22"/>
-        </w:rPr>
-        <w:t xml:space="preserve">¿Qué intenta lograr?</w:t>
-      </w:r>
-    </w:p>
-    <w:p>
-      <w:pPr>
-        <w:spacing w:after="120" w:line="276"/>
-      </w:pPr>
-      <w:r>
-        <w:rPr>
-          <w:rFonts w:ascii="Arial" w:cs="Arial" w:eastAsia="Arial" w:hAnsi="Arial"/>
-          <w:sz w:val="21"/>
-          <w:szCs w:val="21"/>
-        </w:rPr>
-        <w:t xml:space="preserve">Determinar el momento y la cantidad adecuados para importar, manteniendo inventario suficiente sin inmovilizar capital, y proteger el margen frente a las variaciones del tipo de cambio y de los costos logísticos.</w:t>
-      </w:r>
-    </w:p>
-    <w:p>
-      <w:pPr>
-        <w:spacing w:after="80" w:before="200"/>
-      </w:pPr>
-      <w:r>
-        <w:rPr>
-          <w:rFonts w:ascii="Arial" w:cs="Arial" w:eastAsia="Arial" w:hAnsi="Arial"/>
-          <w:b/>
-          <w:bCs/>
-          <w:color w:val="1F4E79"/>
-          <w:sz w:val="22"/>
-          <w:szCs w:val="22"/>
-        </w:rPr>
-        <w:t xml:space="preserve">03 · </w:t>
-      </w:r>
-      <w:r>
-        <w:rPr>
-          <w:rFonts w:ascii="Arial" w:cs="Arial" w:eastAsia="Arial" w:hAnsi="Arial"/>
-          <w:b/>
-          <w:bCs/>
-          <w:sz w:val="22"/>
-          <w:szCs w:val="22"/>
-        </w:rPr>
-        <w:t xml:space="preserve">¿Qué hace hoy para lograrlo?</w:t>
-      </w:r>
-    </w:p>
-    <w:p>
-      <w:pPr>
-        <w:spacing w:after="120" w:line="276"/>
-      </w:pPr>
-      <w:r>
-        <w:rPr>
-          <w:rFonts w:ascii="Arial" w:cs="Arial" w:eastAsia="Arial" w:hAnsi="Arial"/>
-          <w:sz w:val="21"/>
-          <w:szCs w:val="21"/>
-        </w:rPr>
-        <w:t xml:space="preserve">Revisa el inventario y las ventas recientes, compara cotizaciones y precios históricos en Excel, consulta el tipo de cambio todos los días y conversa con el propietario, el administrador y el jefe de ventas. Cierra combinando esa información con su experiencia, porque no hay fórmula.</w:t>
-      </w:r>
-    </w:p>
-    <w:p>
-      <w:pPr>
-        <w:spacing w:after="80" w:before="200"/>
-      </w:pPr>
-      <w:r>
-        <w:rPr>
-          <w:rFonts w:ascii="Arial" w:cs="Arial" w:eastAsia="Arial" w:hAnsi="Arial"/>
-          <w:b/>
-          <w:bCs/>
-          <w:color w:val="1F4E79"/>
-          <w:sz w:val="22"/>
-          <w:szCs w:val="22"/>
-        </w:rPr>
-        <w:t xml:space="preserve">04 · </w:t>
-      </w:r>
-      <w:r>
-        <w:rPr>
-          <w:rFonts w:ascii="Arial" w:cs="Arial" w:eastAsia="Arial" w:hAnsi="Arial"/>
-          <w:b/>
-          <w:bCs/>
-          <w:sz w:val="22"/>
-          <w:szCs w:val="22"/>
-        </w:rPr>
-        <w:t xml:space="preserve">¿Qué le duele o frustra?</w:t>
-      </w:r>
-    </w:p>
-    <w:p>
-      <w:pPr>
-        <w:spacing w:after="120" w:line="276"/>
-      </w:pPr>
-      <w:r>
-        <w:rPr>
-          <w:rFonts w:ascii="Arial" w:cs="Arial" w:eastAsia="Arial" w:hAnsi="Arial"/>
-          <w:sz w:val="21"/>
-          <w:szCs w:val="21"/>
-        </w:rPr>
-        <w:t xml:space="preserve">No conocer el costo final de la compra, porque el tipo de cambio puede moverse antes del pago. Le preocupan por igual las dos salidas equivocadas: comprar de más y acumular repuestos de baja demanda, o comprar de menos y perder ventas. Y la información para decidir está repartida entre Excel, correos, WhatsApp y el sistema contable.</w:t>
-      </w:r>
-    </w:p>
-    <w:p>
-      <w:pPr>
-        <w:spacing w:after="80" w:before="200"/>
-      </w:pPr>
-      <w:r>
-        <w:rPr>
-          <w:rFonts w:ascii="Arial" w:cs="Arial" w:eastAsia="Arial" w:hAnsi="Arial"/>
-          <w:b/>
-          <w:bCs/>
-          <w:color w:val="1F4E79"/>
-          <w:sz w:val="22"/>
-          <w:szCs w:val="22"/>
-        </w:rPr>
-        <w:t xml:space="preserve">05 · </w:t>
-      </w:r>
-      <w:r>
-        <w:rPr>
-          <w:rFonts w:ascii="Arial" w:cs="Arial" w:eastAsia="Arial" w:hAnsi="Arial"/>
-          <w:b/>
-          <w:bCs/>
-          <w:sz w:val="22"/>
-          <w:szCs w:val="22"/>
-        </w:rPr>
-        <w:t xml:space="preserve">¿Qué le cuesta?</w:t>
-      </w:r>
-    </w:p>
-    <w:tbl>
-      <w:tblPr>
-        <w:tblW w:type="dxa" w:w="9638"/>
-        <w:tblBorders>
-          <w:top w:val="single" w:color="auto" w:sz="4"/>
-          <w:left w:val="single" w:color="auto" w:sz="4"/>
-          <w:bottom w:val="single" w:color="auto" w:sz="4"/>
-          <w:right w:val="single" w:color="auto" w:sz="4"/>
-          <w:insideH w:val="single" w:color="auto" w:sz="4"/>
-          <w:insideV w:val="single" w:color="auto" w:sz="4"/>
-        </w:tblBorders>
-      </w:tblPr>
-      <w:tblGrid>
-        <w:gridCol w:w="1900"/>
-        <w:gridCol w:w="7738"/>
-      </w:tblGrid>
-      <w:tr>
-        <w:tc>
-          <w:tcPr>
-            <w:tcW w:type="dxa" w:w="1900"/>
-            <w:tcBorders>
-              <w:top w:val="single" w:color="BFBFBF" w:sz="1"/>
-              <w:left w:val="single" w:color="BFBFBF" w:sz="1"/>
-              <w:bottom w:val="single" w:color="BFBFBF" w:sz="1"/>
-              <w:right w:val="single" w:color="BFBFBF" w:sz="1"/>
-            </w:tcBorders>
-            <w:shd w:fill="F2F2F2" w:val="clear"/>
-            <w:tcMar>
-              <w:top w:type="dxa" w:w="80"/>
-              <w:left w:type="dxa" w:w="120"/>
-              <w:bottom w:type="dxa" w:w="80"/>
-              <w:right w:type="dxa" w:w="120"/>
-            </w:tcMar>
-            <w:vAlign w:val="top"/>
-          </w:tcPr>
-          <w:p>
-            <w:pPr>
-              <w:spacing w:after="0" w:line="276"/>
-            </w:pPr>
-            <w:r>
-              <w:rPr>
-                <w:rFonts w:ascii="Arial" w:cs="Arial" w:eastAsia="Arial" w:hAnsi="Arial"/>
-                <w:b/>
-                <w:bCs/>
-                <w:sz w:val="20"/>
-                <w:szCs w:val="20"/>
-              </w:rPr>
-              <w:t xml:space="preserve">Tiempo</w:t>
-            </w:r>
-          </w:p>
-        </w:tc>
-        <w:tc>
-          <w:tcPr>
-            <w:tcW w:type="dxa" w:w="7738"/>
-            <w:tcBorders>
-              <w:top w:val="single" w:color="BFBFBF" w:sz="1"/>
-              <w:left w:val="single" w:color="BFBFBF" w:sz="1"/>
-              <w:bottom w:val="single" w:color="BFBFBF" w:sz="1"/>
-              <w:right w:val="single" w:color="BFBFBF" w:sz="1"/>
-            </w:tcBorders>
-            <w:tcMar>
-              <w:top w:type="dxa" w:w="80"/>
-              <w:left w:type="dxa" w:w="120"/>
-              <w:bottom w:type="dxa" w:w="80"/>
-              <w:right w:type="dxa" w:w="120"/>
-            </w:tcMar>
-            <w:vAlign w:val="top"/>
-          </w:tcPr>
-          <w:p>
-            <w:pPr>
-              <w:spacing w:after="0" w:line="276"/>
-            </w:pPr>
-            <w:r>
-              <w:rPr>
-                <w:rFonts w:ascii="Arial" w:cs="Arial" w:eastAsia="Arial" w:hAnsi="Arial"/>
-                <w:sz w:val="20"/>
-                <w:szCs w:val="20"/>
-              </w:rPr>
-              <w:t xml:space="preserve">Entre seis y diez horas para reunir y comparar la información de cada pedido.</w:t>
-            </w:r>
-          </w:p>
-        </w:tc>
-      </w:tr>
-      <w:tr>
-        <w:tc>
-          <w:tcPr>
-            <w:tcW w:type="dxa" w:w="1900"/>
-            <w:tcBorders>
-              <w:top w:val="single" w:color="BFBFBF" w:sz="1"/>
-              <w:left w:val="single" w:color="BFBFBF" w:sz="1"/>
-              <w:bottom w:val="single" w:color="BFBFBF" w:sz="1"/>
-              <w:right w:val="single" w:color="BFBFBF" w:sz="1"/>
-            </w:tcBorders>
-            <w:shd w:fill="F2F2F2" w:val="clear"/>
-            <w:tcMar>
-              <w:top w:type="dxa" w:w="80"/>
-              <w:left w:type="dxa" w:w="120"/>
-              <w:bottom w:type="dxa" w:w="80"/>
-              <w:right w:type="dxa" w:w="120"/>
-            </w:tcMar>
-            <w:vAlign w:val="top"/>
-          </w:tcPr>
-          <w:p>
-            <w:pPr>
-              <w:spacing w:after="0" w:line="276"/>
-            </w:pPr>
-            <w:r>
-              <w:rPr>
-                <w:rFonts w:ascii="Arial" w:cs="Arial" w:eastAsia="Arial" w:hAnsi="Arial"/>
-                <w:b/>
-                <w:bCs/>
-                <w:sz w:val="20"/>
-                <w:szCs w:val="20"/>
-              </w:rPr>
-              <w:t xml:space="preserve">Dinero</w:t>
-            </w:r>
-          </w:p>
-        </w:tc>
-        <w:tc>
-          <w:tcPr>
-            <w:tcW w:type="dxa" w:w="7738"/>
-            <w:tcBorders>
-              <w:top w:val="single" w:color="BFBFBF" w:sz="1"/>
-              <w:left w:val="single" w:color="BFBFBF" w:sz="1"/>
-              <w:bottom w:val="single" w:color="BFBFBF" w:sz="1"/>
-              <w:right w:val="single" w:color="BFBFBF" w:sz="1"/>
-            </w:tcBorders>
-            <w:tcMar>
-              <w:top w:type="dxa" w:w="80"/>
-              <w:left w:type="dxa" w:w="120"/>
-              <w:bottom w:type="dxa" w:w="80"/>
-              <w:right w:type="dxa" w:w="120"/>
-            </w:tcMar>
-            <w:vAlign w:val="top"/>
-          </w:tcPr>
-          <w:p>
-            <w:pPr>
-              <w:spacing w:after="0" w:line="276"/>
-            </w:pPr>
-            <w:r>
-              <w:rPr>
-                <w:rFonts w:ascii="Arial" w:cs="Arial" w:eastAsia="Arial" w:hAnsi="Arial"/>
-                <w:sz w:val="20"/>
-                <w:szCs w:val="20"/>
-              </w:rPr>
-              <w:t xml:space="preserve">Bs 12.040 adicionales en una sola compra por la variación cambiaria entre el cálculo y el pago.</w:t>
-            </w:r>
-          </w:p>
-        </w:tc>
-      </w:tr>
-      <w:tr>
-        <w:tc>
-          <w:tcPr>
-            <w:tcW w:type="dxa" w:w="1900"/>
-            <w:tcBorders>
-              <w:top w:val="single" w:color="BFBFBF" w:sz="1"/>
-              <w:left w:val="single" w:color="BFBFBF" w:sz="1"/>
-              <w:bottom w:val="single" w:color="BFBFBF" w:sz="1"/>
-              <w:right w:val="single" w:color="BFBFBF" w:sz="1"/>
-            </w:tcBorders>
-            <w:shd w:fill="F2F2F2" w:val="clear"/>
-            <w:tcMar>
-              <w:top w:type="dxa" w:w="80"/>
-              <w:left w:type="dxa" w:w="120"/>
-              <w:bottom w:type="dxa" w:w="80"/>
-              <w:right w:type="dxa" w:w="120"/>
-            </w:tcMar>
-            <w:vAlign w:val="top"/>
-          </w:tcPr>
-          <w:p>
-            <w:pPr>
-              <w:spacing w:after="0" w:line="276"/>
-            </w:pPr>
-            <w:r>
-              <w:rPr>
-                <w:rFonts w:ascii="Arial" w:cs="Arial" w:eastAsia="Arial" w:hAnsi="Arial"/>
-                <w:b/>
-                <w:bCs/>
-                <w:sz w:val="20"/>
-                <w:szCs w:val="20"/>
-              </w:rPr>
-              <w:t xml:space="preserve">Esfuerzo</w:t>
-            </w:r>
-          </w:p>
-        </w:tc>
-        <w:tc>
-          <w:tcPr>
-            <w:tcW w:type="dxa" w:w="7738"/>
-            <w:tcBorders>
-              <w:top w:val="single" w:color="BFBFBF" w:sz="1"/>
-              <w:left w:val="single" w:color="BFBFBF" w:sz="1"/>
-              <w:bottom w:val="single" w:color="BFBFBF" w:sz="1"/>
-              <w:right w:val="single" w:color="BFBFBF" w:sz="1"/>
-            </w:tcBorders>
-            <w:tcMar>
-              <w:top w:type="dxa" w:w="80"/>
-              <w:left w:type="dxa" w:w="120"/>
-              <w:bottom w:type="dxa" w:w="80"/>
-              <w:right w:type="dxa" w:w="120"/>
-            </w:tcMar>
-            <w:vAlign w:val="top"/>
-          </w:tcPr>
-          <w:p>
-            <w:pPr>
-              <w:spacing w:after="0" w:line="276"/>
-            </w:pPr>
-            <w:r>
-              <w:rPr>
-                <w:rFonts w:ascii="Arial" w:cs="Arial" w:eastAsia="Arial" w:hAnsi="Arial"/>
-                <w:sz w:val="20"/>
-                <w:szCs w:val="20"/>
-              </w:rPr>
-              <w:t xml:space="preserve">Revisar a mano archivos de Excel con estructuras distintas, cotizaciones sueltas e inventarios.</w:t>
-            </w:r>
-          </w:p>
-        </w:tc>
-      </w:tr>
-      <w:tr>
-        <w:tc>
-          <w:tcPr>
-            <w:tcW w:type="dxa" w:w="1900"/>
-            <w:tcBorders>
-              <w:top w:val="single" w:color="BFBFBF" w:sz="1"/>
-              <w:left w:val="single" w:color="BFBFBF" w:sz="1"/>
-              <w:bottom w:val="single" w:color="BFBFBF" w:sz="1"/>
-              <w:right w:val="single" w:color="BFBFBF" w:sz="1"/>
-            </w:tcBorders>
-            <w:shd w:fill="F2F2F2" w:val="clear"/>
-            <w:tcMar>
-              <w:top w:type="dxa" w:w="80"/>
-              <w:left w:type="dxa" w:w="120"/>
-              <w:bottom w:type="dxa" w:w="80"/>
-              <w:right w:type="dxa" w:w="120"/>
-            </w:tcMar>
-            <w:vAlign w:val="top"/>
-          </w:tcPr>
-          <w:p>
-            <w:pPr>
-              <w:spacing w:after="0" w:line="276"/>
-            </w:pPr>
-            <w:r>
-              <w:rPr>
-                <w:rFonts w:ascii="Arial" w:cs="Arial" w:eastAsia="Arial" w:hAnsi="Arial"/>
-                <w:b/>
-                <w:bCs/>
-                <w:sz w:val="20"/>
-                <w:szCs w:val="20"/>
-              </w:rPr>
-              <w:t xml:space="preserve">Estrés</w:t>
-            </w:r>
-          </w:p>
-        </w:tc>
-        <w:tc>
-          <w:tcPr>
-            <w:tcW w:type="dxa" w:w="7738"/>
-            <w:tcBorders>
-              <w:top w:val="single" w:color="BFBFBF" w:sz="1"/>
-              <w:left w:val="single" w:color="BFBFBF" w:sz="1"/>
-              <w:bottom w:val="single" w:color="BFBFBF" w:sz="1"/>
-              <w:right w:val="single" w:color="BFBFBF" w:sz="1"/>
-            </w:tcBorders>
-            <w:tcMar>
-              <w:top w:type="dxa" w:w="80"/>
-              <w:left w:type="dxa" w:w="120"/>
-              <w:bottom w:type="dxa" w:w="80"/>
-              <w:right w:type="dxa" w:w="120"/>
-            </w:tcMar>
-            <w:vAlign w:val="top"/>
-          </w:tcPr>
-          <w:p>
-            <w:pPr>
-              <w:spacing w:after="0" w:line="276"/>
-            </w:pPr>
-            <w:r>
-              <w:rPr>
-                <w:rFonts w:ascii="Arial" w:cs="Arial" w:eastAsia="Arial" w:hAnsi="Arial"/>
-                <w:sz w:val="20"/>
-                <w:szCs w:val="20"/>
-              </w:rPr>
-              <w:t xml:space="preserve">Presión constante porque cualquier decisión puede generar pérdidas y ser cuestionada después.</w:t>
-            </w:r>
-          </w:p>
-        </w:tc>
-      </w:tr>
-      <w:tr>
-        <w:tc>
-          <w:tcPr>
-            <w:tcW w:type="dxa" w:w="1900"/>
-            <w:tcBorders>
-              <w:top w:val="single" w:color="BFBFBF" w:sz="1"/>
-              <w:left w:val="single" w:color="BFBFBF" w:sz="1"/>
-              <w:bottom w:val="single" w:color="BFBFBF" w:sz="1"/>
-              <w:right w:val="single" w:color="BFBFBF" w:sz="1"/>
-            </w:tcBorders>
-            <w:shd w:fill="F2F2F2" w:val="clear"/>
-            <w:tcMar>
-              <w:top w:type="dxa" w:w="80"/>
-              <w:left w:type="dxa" w:w="120"/>
-              <w:bottom w:type="dxa" w:w="80"/>
-              <w:right w:type="dxa" w:w="120"/>
-            </w:tcMar>
-            <w:vAlign w:val="top"/>
-          </w:tcPr>
-          <w:p>
-            <w:pPr>
-              <w:spacing w:after="0" w:line="276"/>
-            </w:pPr>
-            <w:r>
-              <w:rPr>
-                <w:rFonts w:ascii="Arial" w:cs="Arial" w:eastAsia="Arial" w:hAnsi="Arial"/>
-                <w:b/>
-                <w:bCs/>
-                <w:sz w:val="20"/>
-                <w:szCs w:val="20"/>
-              </w:rPr>
-              <w:t xml:space="preserve">Errores</w:t>
-            </w:r>
-          </w:p>
-        </w:tc>
-        <w:tc>
-          <w:tcPr>
-            <w:tcW w:type="dxa" w:w="7738"/>
-            <w:tcBorders>
-              <w:top w:val="single" w:color="BFBFBF" w:sz="1"/>
-              <w:left w:val="single" w:color="BFBFBF" w:sz="1"/>
-              <w:bottom w:val="single" w:color="BFBFBF" w:sz="1"/>
-              <w:right w:val="single" w:color="BFBFBF" w:sz="1"/>
-            </w:tcBorders>
-            <w:tcMar>
-              <w:top w:type="dxa" w:w="80"/>
-              <w:left w:type="dxa" w:w="120"/>
-              <w:bottom w:type="dxa" w:w="80"/>
-              <w:right w:type="dxa" w:w="120"/>
-            </w:tcMar>
-            <w:vAlign w:val="top"/>
-          </w:tcPr>
-          <w:p>
-            <w:pPr>
-              <w:spacing w:after="0" w:line="276"/>
-            </w:pPr>
-            <w:r>
-              <w:rPr>
-                <w:rFonts w:ascii="Arial" w:cs="Arial" w:eastAsia="Arial" w:hAnsi="Arial"/>
-                <w:sz w:val="20"/>
-                <w:szCs w:val="20"/>
-              </w:rPr>
-              <w:t xml:space="preserve">Comprar cantidades equivocadas por trabajar con información incompleta o desactualizada.</w:t>
-            </w:r>
-          </w:p>
-        </w:tc>
-      </w:tr>
-      <w:tr>
-        <w:tc>
-          <w:tcPr>
-            <w:tcW w:type="dxa" w:w="1900"/>
-            <w:tcBorders>
-              <w:top w:val="single" w:color="BFBFBF" w:sz="1"/>
-              <w:left w:val="single" w:color="BFBFBF" w:sz="1"/>
-              <w:bottom w:val="single" w:color="BFBFBF" w:sz="1"/>
-              <w:right w:val="single" w:color="BFBFBF" w:sz="1"/>
-            </w:tcBorders>
-            <w:shd w:fill="F2F2F2" w:val="clear"/>
-            <w:tcMar>
-              <w:top w:type="dxa" w:w="80"/>
-              <w:left w:type="dxa" w:w="120"/>
-              <w:bottom w:type="dxa" w:w="80"/>
-              <w:right w:type="dxa" w:w="120"/>
-            </w:tcMar>
-            <w:vAlign w:val="top"/>
-          </w:tcPr>
-          <w:p>
-            <w:pPr>
-              <w:spacing w:after="0" w:line="276"/>
-            </w:pPr>
-            <w:r>
-              <w:rPr>
-                <w:rFonts w:ascii="Arial" w:cs="Arial" w:eastAsia="Arial" w:hAnsi="Arial"/>
-                <w:b/>
-                <w:bCs/>
-                <w:sz w:val="20"/>
-                <w:szCs w:val="20"/>
-              </w:rPr>
-              <w:t xml:space="preserve">Relaciones</w:t>
-            </w:r>
-          </w:p>
-        </w:tc>
-        <w:tc>
-          <w:tcPr>
-            <w:tcW w:type="dxa" w:w="7738"/>
-            <w:tcBorders>
-              <w:top w:val="single" w:color="BFBFBF" w:sz="1"/>
-              <w:left w:val="single" w:color="BFBFBF" w:sz="1"/>
-              <w:bottom w:val="single" w:color="BFBFBF" w:sz="1"/>
-              <w:right w:val="single" w:color="BFBFBF" w:sz="1"/>
-            </w:tcBorders>
-            <w:tcMar>
-              <w:top w:type="dxa" w:w="80"/>
-              <w:left w:type="dxa" w:w="120"/>
-              <w:bottom w:type="dxa" w:w="80"/>
-              <w:right w:type="dxa" w:w="120"/>
-            </w:tcMar>
-            <w:vAlign w:val="top"/>
-          </w:tcPr>
-          <w:p>
-            <w:pPr>
-              <w:spacing w:after="0" w:line="276"/>
-            </w:pPr>
-            <w:r>
-              <w:rPr>
-                <w:rFonts w:ascii="Arial" w:cs="Arial" w:eastAsia="Arial" w:hAnsi="Arial"/>
-                <w:sz w:val="20"/>
-                <w:szCs w:val="20"/>
-              </w:rPr>
-              <w:t xml:space="preserve">Reclamos de clientes habituales cuando no encuentran el repuesto que necesitan.</w:t>
-            </w:r>
-          </w:p>
-        </w:tc>
-      </w:tr>
-      <w:tr>
-        <w:tc>
-          <w:tcPr>
-            <w:tcW w:type="dxa" w:w="1900"/>
-            <w:tcBorders>
-              <w:top w:val="single" w:color="BFBFBF" w:sz="1"/>
-              <w:left w:val="single" w:color="BFBFBF" w:sz="1"/>
-              <w:bottom w:val="single" w:color="BFBFBF" w:sz="1"/>
-              <w:right w:val="single" w:color="BFBFBF" w:sz="1"/>
-            </w:tcBorders>
-            <w:shd w:fill="F2F2F2" w:val="clear"/>
-            <w:tcMar>
-              <w:top w:type="dxa" w:w="80"/>
-              <w:left w:type="dxa" w:w="120"/>
-              <w:bottom w:type="dxa" w:w="80"/>
-              <w:right w:type="dxa" w:w="120"/>
-            </w:tcMar>
-            <w:vAlign w:val="top"/>
-          </w:tcPr>
-          <w:p>
-            <w:pPr>
-              <w:spacing w:after="0" w:line="276"/>
-            </w:pPr>
-            <w:r>
-              <w:rPr>
-                <w:rFonts w:ascii="Arial" w:cs="Arial" w:eastAsia="Arial" w:hAnsi="Arial"/>
-                <w:b/>
-                <w:bCs/>
-                <w:sz w:val="20"/>
-                <w:szCs w:val="20"/>
-              </w:rPr>
-              <w:t xml:space="preserve">Reputación</w:t>
-            </w:r>
-          </w:p>
-        </w:tc>
-        <w:tc>
-          <w:tcPr>
-            <w:tcW w:type="dxa" w:w="7738"/>
-            <w:tcBorders>
-              <w:top w:val="single" w:color="BFBFBF" w:sz="1"/>
-              <w:left w:val="single" w:color="BFBFBF" w:sz="1"/>
-              <w:bottom w:val="single" w:color="BFBFBF" w:sz="1"/>
-              <w:right w:val="single" w:color="BFBFBF" w:sz="1"/>
-            </w:tcBorders>
-            <w:tcMar>
-              <w:top w:type="dxa" w:w="80"/>
-              <w:left w:type="dxa" w:w="120"/>
-              <w:bottom w:type="dxa" w:w="80"/>
-              <w:right w:type="dxa" w:w="120"/>
-            </w:tcMar>
-            <w:vAlign w:val="top"/>
-          </w:tcPr>
-          <w:p>
-            <w:pPr>
-              <w:spacing w:after="0" w:line="276"/>
-            </w:pPr>
-            <w:r>
-              <w:rPr>
-                <w:rFonts w:ascii="Arial" w:cs="Arial" w:eastAsia="Arial" w:hAnsi="Arial"/>
-                <w:sz w:val="20"/>
-                <w:szCs w:val="20"/>
-              </w:rPr>
-              <w:t xml:space="preserve">La empresa parece poco confiable si no sostiene disponibilidad en los productos de alta demanda.</w:t>
-            </w:r>
-          </w:p>
-        </w:tc>
-      </w:tr>
-      <w:tr>
-        <w:tc>
-          <w:tcPr>
-            <w:tcW w:type="dxa" w:w="1900"/>
-            <w:tcBorders>
-              <w:top w:val="single" w:color="BFBFBF" w:sz="1"/>
-              <w:left w:val="single" w:color="BFBFBF" w:sz="1"/>
-              <w:bottom w:val="single" w:color="BFBFBF" w:sz="1"/>
-              <w:right w:val="single" w:color="BFBFBF" w:sz="1"/>
-            </w:tcBorders>
-            <w:shd w:fill="F2F2F2" w:val="clear"/>
-            <w:tcMar>
-              <w:top w:type="dxa" w:w="80"/>
-              <w:left w:type="dxa" w:w="120"/>
-              <w:bottom w:type="dxa" w:w="80"/>
-              <w:right w:type="dxa" w:w="120"/>
-            </w:tcMar>
-            <w:vAlign w:val="top"/>
-          </w:tcPr>
-          <w:p>
-            <w:pPr>
-              <w:spacing w:after="0" w:line="276"/>
-            </w:pPr>
-            <w:r>
-              <w:rPr>
-                <w:rFonts w:ascii="Arial" w:cs="Arial" w:eastAsia="Arial" w:hAnsi="Arial"/>
-                <w:b/>
-                <w:bCs/>
-                <w:sz w:val="20"/>
-                <w:szCs w:val="20"/>
-              </w:rPr>
-              <w:t xml:space="preserve">Salud</w:t>
-            </w:r>
-          </w:p>
-        </w:tc>
-        <w:tc>
-          <w:tcPr>
-            <w:tcW w:type="dxa" w:w="7738"/>
-            <w:tcBorders>
-              <w:top w:val="single" w:color="BFBFBF" w:sz="1"/>
-              <w:left w:val="single" w:color="BFBFBF" w:sz="1"/>
-              <w:bottom w:val="single" w:color="BFBFBF" w:sz="1"/>
-              <w:right w:val="single" w:color="BFBFBF" w:sz="1"/>
-            </w:tcBorders>
-            <w:tcMar>
-              <w:top w:type="dxa" w:w="80"/>
-              <w:left w:type="dxa" w:w="120"/>
-              <w:bottom w:type="dxa" w:w="80"/>
-              <w:right w:type="dxa" w:w="120"/>
-            </w:tcMar>
-            <w:vAlign w:val="top"/>
-          </w:tcPr>
-          <w:p>
-            <w:pPr>
-              <w:spacing w:after="0" w:line="276"/>
-            </w:pPr>
-            <w:r>
-              <w:rPr>
-                <w:rFonts w:ascii="Arial" w:cs="Arial" w:eastAsia="Arial" w:hAnsi="Arial"/>
-                <w:sz w:val="20"/>
-                <w:szCs w:val="20"/>
-              </w:rPr>
-              <w:t xml:space="preserve">No identificó un efecto directo.</w:t>
-            </w:r>
-          </w:p>
-        </w:tc>
-      </w:tr>
-      <w:tr>
-        <w:tc>
-          <w:tcPr>
-            <w:tcW w:type="dxa" w:w="1900"/>
-            <w:tcBorders>
-              <w:top w:val="single" w:color="BFBFBF" w:sz="1"/>
-              <w:left w:val="single" w:color="BFBFBF" w:sz="1"/>
-              <w:bottom w:val="single" w:color="BFBFBF" w:sz="1"/>
-              <w:right w:val="single" w:color="BFBFBF" w:sz="1"/>
-            </w:tcBorders>
-            <w:shd w:fill="F2F2F2" w:val="clear"/>
-            <w:tcMar>
-              <w:top w:type="dxa" w:w="80"/>
-              <w:left w:type="dxa" w:w="120"/>
-              <w:bottom w:type="dxa" w:w="80"/>
-              <w:right w:type="dxa" w:w="120"/>
-            </w:tcMar>
-            <w:vAlign w:val="top"/>
-          </w:tcPr>
-          <w:p>
-            <w:pPr>
-              <w:spacing w:after="0" w:line="276"/>
-            </w:pPr>
-            <w:r>
-              <w:rPr>
-                <w:rFonts w:ascii="Arial" w:cs="Arial" w:eastAsia="Arial" w:hAnsi="Arial"/>
-                <w:b/>
-                <w:bCs/>
-                <w:sz w:val="20"/>
-                <w:szCs w:val="20"/>
-              </w:rPr>
-              <w:t xml:space="preserve">Energía</w:t>
-            </w:r>
-          </w:p>
-        </w:tc>
-        <w:tc>
-          <w:tcPr>
-            <w:tcW w:type="dxa" w:w="7738"/>
-            <w:tcBorders>
-              <w:top w:val="single" w:color="BFBFBF" w:sz="1"/>
-              <w:left w:val="single" w:color="BFBFBF" w:sz="1"/>
-              <w:bottom w:val="single" w:color="BFBFBF" w:sz="1"/>
-              <w:right w:val="single" w:color="BFBFBF" w:sz="1"/>
-            </w:tcBorders>
-            <w:tcMar>
-              <w:top w:type="dxa" w:w="80"/>
-              <w:left w:type="dxa" w:w="120"/>
-              <w:bottom w:type="dxa" w:w="80"/>
-              <w:right w:type="dxa" w:w="120"/>
-            </w:tcMar>
-            <w:vAlign w:val="top"/>
-          </w:tcPr>
-          <w:p>
-            <w:pPr>
-              <w:spacing w:after="0" w:line="276"/>
-            </w:pPr>
-            <w:r>
-              <w:rPr>
-                <w:rFonts w:ascii="Arial" w:cs="Arial" w:eastAsia="Arial" w:hAnsi="Arial"/>
-                <w:sz w:val="20"/>
-                <w:szCs w:val="20"/>
-              </w:rPr>
-              <w:t xml:space="preserve">Rehacer los cálculos cada vez que cambian los precios o el tipo de cambio.</w:t>
-            </w:r>
-          </w:p>
-        </w:tc>
-      </w:tr>
-      <w:tr>
-        <w:tc>
-          <w:tcPr>
-            <w:tcW w:type="dxa" w:w="1900"/>
-            <w:tcBorders>
-              <w:top w:val="single" w:color="BFBFBF" w:sz="1"/>
-              <w:left w:val="single" w:color="BFBFBF" w:sz="1"/>
-              <w:bottom w:val="single" w:color="BFBFBF" w:sz="1"/>
-              <w:right w:val="single" w:color="BFBFBF" w:sz="1"/>
-            </w:tcBorders>
-            <w:shd w:fill="F2F2F2" w:val="clear"/>
-            <w:tcMar>
-              <w:top w:type="dxa" w:w="80"/>
-              <w:left w:type="dxa" w:w="120"/>
-              <w:bottom w:type="dxa" w:w="80"/>
-              <w:right w:type="dxa" w:w="120"/>
-            </w:tcMar>
-            <w:vAlign w:val="top"/>
-          </w:tcPr>
-          <w:p>
-            <w:pPr>
-              <w:spacing w:after="0" w:line="276"/>
-            </w:pPr>
-            <w:r>
-              <w:rPr>
-                <w:rFonts w:ascii="Arial" w:cs="Arial" w:eastAsia="Arial" w:hAnsi="Arial"/>
-                <w:b/>
-                <w:bCs/>
-                <w:sz w:val="20"/>
-                <w:szCs w:val="20"/>
-              </w:rPr>
-              <w:t xml:space="preserve">Recursos</w:t>
-            </w:r>
-          </w:p>
-        </w:tc>
-        <w:tc>
-          <w:tcPr>
-            <w:tcW w:type="dxa" w:w="7738"/>
-            <w:tcBorders>
-              <w:top w:val="single" w:color="BFBFBF" w:sz="1"/>
-              <w:left w:val="single" w:color="BFBFBF" w:sz="1"/>
-              <w:bottom w:val="single" w:color="BFBFBF" w:sz="1"/>
-              <w:right w:val="single" w:color="BFBFBF" w:sz="1"/>
-            </w:tcBorders>
-            <w:tcMar>
-              <w:top w:type="dxa" w:w="80"/>
-              <w:left w:type="dxa" w:w="120"/>
-              <w:bottom w:type="dxa" w:w="80"/>
-              <w:right w:type="dxa" w:w="120"/>
-            </w:tcMar>
-            <w:vAlign w:val="top"/>
-          </w:tcPr>
-          <w:p>
-            <w:pPr>
-              <w:spacing w:after="0" w:line="276"/>
-            </w:pPr>
-            <w:r>
-              <w:rPr>
-                <w:rFonts w:ascii="Arial" w:cs="Arial" w:eastAsia="Arial" w:hAnsi="Arial"/>
-                <w:sz w:val="20"/>
-                <w:szCs w:val="20"/>
-              </w:rPr>
-              <w:t xml:space="preserve">Alrededor de Bs 55.000 inmovilizados en repuestos de baja rotación.</w:t>
-            </w:r>
-          </w:p>
-        </w:tc>
-      </w:tr>
-    </w:tbl>
-    <w:p>
-      <w:pPr>
-        <w:spacing w:after="80" w:before="200"/>
-      </w:pPr>
-      <w:r>
-        <w:rPr>
-          <w:rFonts w:ascii="Arial" w:cs="Arial" w:eastAsia="Arial" w:hAnsi="Arial"/>
-          <w:b/>
-          <w:bCs/>
-          <w:color w:val="1F4E79"/>
-          <w:sz w:val="22"/>
-          <w:szCs w:val="22"/>
-        </w:rPr>
-        <w:t xml:space="preserve">06 · </w:t>
-      </w:r>
-      <w:r>
-        <w:rPr>
-          <w:rFonts w:ascii="Arial" w:cs="Arial" w:eastAsia="Arial" w:hAnsi="Arial"/>
-          <w:b/>
-          <w:bCs/>
-          <w:sz w:val="22"/>
-          <w:szCs w:val="22"/>
-        </w:rPr>
-        <w:t xml:space="preserve">¿Qué quisiera que fuera diferente?</w:t>
-      </w:r>
-    </w:p>
-    <w:p>
-      <w:pPr>
-        <w:spacing w:after="120" w:line="276"/>
-      </w:pPr>
-      <w:r>
-        <w:rPr>
-          <w:rFonts w:ascii="Arial" w:cs="Arial" w:eastAsia="Arial" w:hAnsi="Arial"/>
-          <w:sz w:val="21"/>
-          <w:szCs w:val="21"/>
-        </w:rPr>
-        <w:t xml:space="preserve">Tener la información actualizada y reunida en un solo lugar para comparar costo, demanda e inventario, decidir con más anticipación y depender menos del cálculo manual y de la intuición.</w:t>
-      </w:r>
-    </w:p>
-    <w:p>
-      <w:pPr>
-        <w:spacing w:after="80" w:before="200"/>
-      </w:pPr>
-      <w:r>
-        <w:rPr>
-          <w:rFonts w:ascii="Arial" w:cs="Arial" w:eastAsia="Arial" w:hAnsi="Arial"/>
-          <w:b/>
-          <w:bCs/>
-          <w:color w:val="1F4E79"/>
-          <w:sz w:val="22"/>
-          <w:szCs w:val="22"/>
-        </w:rPr>
-        <w:t xml:space="preserve">07 · </w:t>
-      </w:r>
-      <w:r>
-        <w:rPr>
-          <w:rFonts w:ascii="Arial" w:cs="Arial" w:eastAsia="Arial" w:hAnsi="Arial"/>
-          <w:b/>
-          <w:bCs/>
-          <w:sz w:val="22"/>
-          <w:szCs w:val="22"/>
-        </w:rPr>
-        <w:t xml:space="preserve">¿Qué lo haría buscar otra solución?</w:t>
-      </w:r>
-    </w:p>
-    <w:p>
-      <w:pPr>
-        <w:spacing w:after="120" w:line="276"/>
-      </w:pPr>
-      <w:r>
-        <w:rPr>
-          <w:rFonts w:ascii="Arial" w:cs="Arial" w:eastAsia="Arial" w:hAnsi="Arial"/>
-          <w:sz w:val="21"/>
-          <w:szCs w:val="21"/>
-        </w:rPr>
-        <w:t xml:space="preserve">Otra subida fuerte del tipo de cambio, una compra que vuelva a costar bastante más de lo previsto, la acumulación sostenida de repuestos parados, o perder clientes por faltantes de productos de alta rotación.</w:t>
-      </w:r>
-    </w:p>
-    <w:p>
-      <w:pPr>
-        <w:spacing w:after="80" w:before="200"/>
-      </w:pPr>
-      <w:r>
-        <w:rPr>
-          <w:rFonts w:ascii="Arial" w:cs="Arial" w:eastAsia="Arial" w:hAnsi="Arial"/>
-          <w:b/>
-          <w:bCs/>
-          <w:color w:val="1F4E79"/>
-          <w:sz w:val="22"/>
-          <w:szCs w:val="22"/>
-        </w:rPr>
-        <w:t xml:space="preserve">08 · </w:t>
-      </w:r>
-      <w:r>
-        <w:rPr>
-          <w:rFonts w:ascii="Arial" w:cs="Arial" w:eastAsia="Arial" w:hAnsi="Arial"/>
-          <w:b/>
-          <w:bCs/>
-          <w:sz w:val="22"/>
-          <w:szCs w:val="22"/>
-        </w:rPr>
-        <w:t xml:space="preserve">¿Qué usa o paga hoy?</w:t>
-      </w:r>
-    </w:p>
-    <w:p>
-      <w:pPr>
-        <w:spacing w:after="120" w:line="276"/>
-      </w:pPr>
-      <w:r>
-        <w:rPr>
-          <w:rFonts w:ascii="Arial" w:cs="Arial" w:eastAsia="Arial" w:hAnsi="Arial"/>
-          <w:sz w:val="21"/>
-          <w:szCs w:val="21"/>
-        </w:rPr>
-        <w:t xml:space="preserve">Excel, WhatsApp, correo electrónico, un sistema contable y un sistema básico de inventario. Paga transporte, comisiones financieras y un despachante de aduana, cuyo trabajo se concentra en el trámite aduanero y no en decidir cuándo comprar. Ninguna de esas herramientas integra lo que necesita para decidir.</w:t>
-      </w:r>
-    </w:p>
-    <w:p>
-      <w:pPr>
-        <w:spacing w:after="80" w:before="200"/>
-      </w:pPr>
-      <w:r>
-        <w:rPr>
-          <w:rFonts w:ascii="Arial" w:cs="Arial" w:eastAsia="Arial" w:hAnsi="Arial"/>
-          <w:b/>
-          <w:bCs/>
-          <w:color w:val="1F4E79"/>
-          <w:sz w:val="22"/>
-          <w:szCs w:val="22"/>
-        </w:rPr>
-        <w:t xml:space="preserve">09 · </w:t>
-      </w:r>
-      <w:r>
-        <w:rPr>
-          <w:rFonts w:ascii="Arial" w:cs="Arial" w:eastAsia="Arial" w:hAnsi="Arial"/>
-          <w:b/>
-          <w:bCs/>
-          <w:sz w:val="22"/>
-          <w:szCs w:val="22"/>
-        </w:rPr>
-        <w:t xml:space="preserve">En sus propias palabras</w:t>
-      </w:r>
-    </w:p>
-    <w:p>
-      <w:pPr>
-        <w:spacing w:after="100" w:line="276"/>
-        <w:ind w:left="340"/>
-      </w:pPr>
-      <w:r>
-        <w:rPr>
-          <w:rFonts w:ascii="Arial" w:cs="Arial" w:eastAsia="Arial" w:hAnsi="Arial"/>
-          <w:i/>
-          <w:iCs/>
-          <w:sz w:val="21"/>
-          <w:szCs w:val="21"/>
-        </w:rPr>
-        <w:t xml:space="preserve">«Puedo calcular el pedido hoy, pero si el dólar cambia antes del pago, todo el presupuesto queda desactualizado.»</w:t>
-      </w:r>
-    </w:p>
-    <w:p>
-      <w:pPr>
-        <w:spacing w:after="100" w:line="276"/>
-        <w:ind w:left="340"/>
-      </w:pPr>
-      <w:r>
-        <w:rPr>
-          <w:rFonts w:ascii="Arial" w:cs="Arial" w:eastAsia="Arial" w:hAnsi="Arial"/>
-          <w:i/>
-          <w:iCs/>
-          <w:sz w:val="21"/>
-          <w:szCs w:val="21"/>
-        </w:rPr>
-        <w:t xml:space="preserve">«La información está repartida entre Excel, WhatsApp, correos y el sistema contable.»</w:t>
-      </w:r>
-    </w:p>
-    <w:p>
-      <w:pPr>
-        <w:spacing w:after="100" w:line="276"/>
-        <w:ind w:left="340"/>
-      </w:pPr>
-      <w:r>
-        <w:rPr>
-          <w:rFonts w:ascii="Arial" w:cs="Arial" w:eastAsia="Arial" w:hAnsi="Arial"/>
-          <w:i/>
-          <w:iCs/>
-          <w:sz w:val="21"/>
-          <w:szCs w:val="21"/>
-        </w:rPr>
-        <w:t xml:space="preserve">«Si compro mucho, dicen que inmovilicé el dinero; si compro poco, dicen que perdimos ventas.»</w:t>
-      </w:r>
-    </w:p>
-    <w:p>
-      <w:pPr>
-        <w:spacing w:after="100" w:line="276"/>
-        <w:ind w:left="340"/>
-      </w:pPr>
-      <w:r>
-        <w:rPr>
-          <w:rFonts w:ascii="Arial" w:cs="Arial" w:eastAsia="Arial" w:hAnsi="Arial"/>
-          <w:i/>
-          <w:iCs/>
-          <w:sz w:val="21"/>
-          <w:szCs w:val="21"/>
-        </w:rPr>
-        <w:t xml:space="preserve">«No tenemos una fórmula automática; combinamos los datos con nuestra experiencia.»</w:t>
-      </w:r>
-    </w:p>
-    <w:p>
-      <w:pPr>
-        <w:spacing w:after="100" w:line="276"/>
-        <w:ind w:left="340"/>
-      </w:pPr>
-      <w:r>
-        <w:rPr>
-          <w:rFonts w:ascii="Arial" w:cs="Arial" w:eastAsia="Arial" w:hAnsi="Arial"/>
-          <w:i/>
-          <w:iCs/>
-          <w:sz w:val="21"/>
-          <w:szCs w:val="21"/>
-        </w:rPr>
-        <w:t xml:space="preserve">«No solamente importa el dólar, también importa cuánto tarda la mercadería en llegar.»</w:t>
-      </w:r>
-    </w:p>
-    <w:p>
-      <w:pPr>
-        <w:spacing w:after="160" w:line="276"/>
-      </w:pPr>
-      <w:r>
-        <w:rPr>
-          <w:rFonts w:ascii="Arial" w:cs="Arial" w:eastAsia="Arial" w:hAnsi="Arial"/>
-          <w:sz w:val="22"/>
-          <w:szCs w:val="22"/>
-        </w:rPr>
-        <w:t xml:space="preserve"/>
-      </w:r>
-    </w:p>
-    <w:tbl>
-      <w:tblPr>
-        <w:tblW w:type="dxa" w:w="9638"/>
-        <w:tblBorders>
-          <w:top w:val="single" w:color="auto" w:sz="4"/>
-          <w:left w:val="single" w:color="auto" w:sz="4"/>
-          <w:bottom w:val="single" w:color="auto" w:sz="4"/>
-          <w:right w:val="single" w:color="auto" w:sz="4"/>
-          <w:insideH w:val="single" w:color="auto" w:sz="4"/>
-          <w:insideV w:val="single" w:color="auto" w:sz="4"/>
-        </w:tblBorders>
-      </w:tblPr>
-      <w:tblGrid>
-        <w:gridCol w:w="9638"/>
-      </w:tblGrid>
-      <w:tr>
-        <w:tc>
-          <w:tcPr>
-            <w:tcW w:type="dxa" w:w="9638"/>
-            <w:tcBorders>
-              <w:top w:val="single" w:color="BFBFBF" w:sz="1"/>
-              <w:left w:val="single" w:color="BFBFBF" w:sz="1"/>
-              <w:bottom w:val="single" w:color="BFBFBF" w:sz="1"/>
-              <w:right w:val="single" w:color="BFBFBF" w:sz="1"/>
-            </w:tcBorders>
-            <w:shd w:fill="E2EFDA" w:val="clear"/>
-            <w:tcMar>
-              <w:top w:type="dxa" w:w="80"/>
-              <w:left w:type="dxa" w:w="120"/>
-              <w:bottom w:type="dxa" w:w="80"/>
-              <w:right w:type="dxa" w:w="120"/>
-            </w:tcMar>
-            <w:vAlign w:val="top"/>
-          </w:tcPr>
-          <w:p>
-            <w:pPr>
-              <w:spacing w:after="80" w:line="276"/>
-            </w:pPr>
-            <w:r>
-              <w:rPr>
-                <w:rFonts w:ascii="Arial" w:cs="Arial" w:eastAsia="Arial" w:hAnsi="Arial"/>
-                <w:b/>
-                <w:bCs/>
-                <w:color w:val="1F4E79"/>
-                <w:sz w:val="21"/>
-                <w:szCs w:val="21"/>
-              </w:rPr>
-              <w:t xml:space="preserve">La gema</w:t>
-            </w:r>
-          </w:p>
-          <w:p>
-            <w:pPr>
-              <w:spacing w:after="0" w:line="276"/>
-            </w:pPr>
-            <w:r>
-              <w:rPr>
-                <w:rFonts w:ascii="Arial" w:cs="Arial" w:eastAsia="Arial" w:hAnsi="Arial"/>
-                <w:sz w:val="20"/>
-                <w:szCs w:val="20"/>
-              </w:rPr>
-              <w:t xml:space="preserve">Conocer la variación del tipo de cambio no alcanza para decidir una compra. El importador necesita cruzarla con la demanda, la rotación de cada repuesto, los costos logísticos, el capital disponible y el tiempo de reposición. La decisión es un equilibrio entre tres riesgos que se mueven a la vez, y no la predicción de una sola variable.</w:t>
-            </w:r>
-          </w:p>
-        </w:tc>
-      </w:tr>
-    </w:tbl>
-    <w:p>
-      <w:r>
-        <w:br w:type="page"/>
-      </w:r>
-    </w:p>
-    <w:p>
-      <w:pPr>
-        <w:pStyle w:val="Heading1"/>
-      </w:pPr>
-      <w:r>
-        <w:t xml:space="preserve">5. Contraste contra el Mapa de Propuesta de Valor</w:t>
+        <w:t xml:space="preserve">4. Contraste contra el Mapa de Propuesta de Valor</w:t>
       </w:r>
     </w:p>
     <w:p>
@@ -5844,10 +4647,89 @@
         </w:tc>
       </w:tr>
     </w:tbl>
+    <w:p>
+      <w:pPr>
+        <w:sectPr>
+          <w:headerReference w:type="default" r:id="rId7"/>
+          <w:footerReference w:type="default" r:id="rId8"/>
+          <w:pgSz w:w="11906" w:h="16838" w:orient="portrait"/>
+          <w:pgMar w:top="1134" w:right="1134" w:bottom="1134" w:left="1134" w:header="708" w:footer="708" w:gutter="0"/>
+          <w:pgNumType/>
+          <w:docGrid w:linePitch="360"/>
+        </w:sectPr>
+      </w:pPr>
+    </w:p>
+    <w:p>
+      <w:pPr>
+        <w:pStyle w:val="Heading1"/>
+      </w:pPr>
+      <w:r>
+        <w:t xml:space="preserve">Anexo. La ficha completada en el tablero del equipo</w:t>
+      </w:r>
+    </w:p>
+    <w:p>
+      <w:pPr>
+        <w:spacing w:after="120" w:line="276"/>
+      </w:pPr>
+      <w:r>
+        <w:rPr>
+          <w:rFonts w:ascii="Arial" w:cs="Arial" w:eastAsia="Arial" w:hAnsi="Arial"/>
+          <w:sz w:val="22"/>
+          <w:szCs w:val="22"/>
+        </w:rPr>
+        <w:t xml:space="preserve">Captura del mapa de empatía tal como quedó cargado, con la autoría de cada casilla visible. Es la misma entrevista desarrollada en el punto 3.</w:t>
+      </w:r>
+    </w:p>
+    <w:p>
+      <w:pPr>
+        <w:spacing w:after="0" w:before="120"/>
+        <w:jc w:val="center"/>
+      </w:pPr>
+      <w:r>
+        <w:drawing>
+          <wp:inline distT="0" distB="0" distL="0" distR="0">
+            <wp:extent cx="9144000" cy="4733925"/>
+            <wp:effectExtent t="0" r="0" b="0" l="0"/>
+            <wp:docPr id="1" name="Mapa de empatia" descr="Las nueve casillas del mapa de empatía y la gema, completadas en el tablero del equipo" title="Mapa de empatía completado"/>
+            <wp:cNvGraphicFramePr>
+              <a:graphicFrameLocks xmlns:a="http://schemas.openxmlformats.org/drawingml/2006/main" noChangeAspect="1"/>
+            </wp:cNvGraphicFramePr>
+            <a:graphic xmlns:a="http://schemas.openxmlformats.org/drawingml/2006/main">
+              <a:graphicData uri="http://schemas.openxmlformats.org/drawingml/2006/picture">
+                <pic:pic xmlns:pic="http://schemas.openxmlformats.org/drawingml/2006/picture">
+                  <pic:nvPicPr>
+                    <pic:cNvPr id="0" name="" descr=""/>
+                    <pic:cNvPicPr>
+                      <a:picLocks noChangeAspect="1" noChangeArrowheads="1"/>
+                    </pic:cNvPicPr>
+                  </pic:nvPicPr>
+                  <pic:blipFill>
+                    <a:blip r:embed="rId11" cstate="none"/>
+                    <a:srcRect/>
+                    <a:stretch>
+                      <a:fillRect/>
+                    </a:stretch>
+                  </pic:blipFill>
+                  <pic:spPr bwMode="auto">
+                    <a:xfrm>
+                      <a:off x="0" y="0"/>
+                      <a:ext cx="9144000" cy="4733925"/>
+                    </a:xfrm>
+                    <a:prstGeom prst="rect">
+                      <a:avLst/>
+                    </a:prstGeom>
+                  </pic:spPr>
+                </pic:pic>
+              </a:graphicData>
+            </a:graphic>
+          </wp:inline>
+        </w:drawing>
+      </w:r>
+    </w:p>
     <w:sectPr>
-      <w:headerReference w:type="default" r:id="rId7"/>
-      <w:footerReference w:type="default" r:id="rId8"/>
-      <w:pgSz w:w="11906" w:h="16838" w:orient="portrait"/>
+      <w:headerReference w:type="default" r:id="rId9"/>
+      <w:footerReference w:type="default" r:id="rId10"/>
+      <w:pgSz w:w="16838" w:h="11906" w:orient="landscape"/>
       <w:pgMar w:top="1134" w:right="1134" w:bottom="1134" w:left="1134" w:header="708" w:footer="708" w:gutter="0"/>
       <w:pgNumType/>
       <w:docGrid w:linePitch="360"/>
@@ -5928,6 +4810,37 @@
 </w:ftr>
 </file>
 
+<file path=word/footer2.xml><?xml version="1.0" encoding="utf-8"?>
+<w:ftr xmlns:wpc="http://schemas.microsoft.com/office/word/2010/wordprocessingCanvas" xmlns:mc="http://schemas.openxmlformats.org/markup-compatibility/2006" xmlns:o="urn:schemas-microsoft-com:office:office" xmlns:r="http://schemas.openxmlformats.org/officeDocument/2006/relationships" xmlns:m="http://schemas.openxmlformats.org/officeDocument/2006/math" xmlns:v="urn:schemas-microsoft-com:vml" xmlns:wp14="http://schemas.microsoft.com/office/word/2010/wordprocessingDrawing" xmlns:wp="http://schemas.openxmlformats.org/drawingml/2006/wordprocessingDrawing" xmlns:w10="urn:schemas-microsoft-com:office:word" xmlns:w="http://schemas.openxmlformats.org/wordprocessingml/2006/main" xmlns:w14="http://schemas.microsoft.com/office/word/2010/wordml" xmlns:w15="http://schemas.microsoft.com/office/word/2012/wordml" xmlns:wpg="http://schemas.microsoft.com/office/word/2010/wordprocessingGroup" xmlns:wpi="http://schemas.microsoft.com/office/word/2010/wordprocessingInk" xmlns:wne="http://schemas.microsoft.com/office/word/2006/wordml" xmlns:wps="http://schemas.microsoft.com/office/word/2010/wordprocessingShape">
+  <w:p>
+    <w:pPr>
+      <w:jc w:val="center"/>
+    </w:pPr>
+    <w:r>
+      <w:rPr>
+        <w:rFonts w:ascii="Arial" w:cs="Arial" w:eastAsia="Arial" w:hAnsi="Arial"/>
+        <w:color w:val="808080"/>
+        <w:sz w:val="16"/>
+        <w:szCs w:val="16"/>
+      </w:rPr>
+      <w:t xml:space="preserve">Página </w:t>
+    </w:r>
+    <w:r>
+      <w:rPr>
+        <w:rFonts w:ascii="Arial" w:cs="Arial" w:eastAsia="Arial" w:hAnsi="Arial"/>
+        <w:color w:val="808080"/>
+        <w:sz w:val="16"/>
+        <w:szCs w:val="16"/>
+      </w:rPr>
+      <w:fldChar w:fldCharType="begin"/>
+      <w:instrText xml:space="preserve">PAGE</w:instrText>
+      <w:fldChar w:fldCharType="separate"/>
+      <w:fldChar w:fldCharType="end"/>
+    </w:r>
+  </w:p>
+</w:ftr>
+</file>
+
 <file path=word/footnotes.xml><?xml version="1.0" encoding="utf-8"?>
 <w:footnotes xmlns:wpc="http://schemas.microsoft.com/office/word/2010/wordprocessingCanvas" xmlns:mc="http://schemas.openxmlformats.org/markup-compatibility/2006" xmlns:o="urn:schemas-microsoft-com:office:office" xmlns:r="http://schemas.openxmlformats.org/officeDocument/2006/relationships" xmlns:m="http://schemas.openxmlformats.org/officeDocument/2006/math" xmlns:v="urn:schemas-microsoft-com:vml" xmlns:wp14="http://schemas.microsoft.com/office/word/2010/wordprocessingDrawing" xmlns:wp="http://schemas.openxmlformats.org/drawingml/2006/wordprocessingDrawing" xmlns:w10="urn:schemas-microsoft-com:office:word" xmlns:w="http://schemas.openxmlformats.org/wordprocessingml/2006/main" xmlns:w14="http://schemas.microsoft.com/office/word/2010/wordml" xmlns:w15="http://schemas.microsoft.com/office/word/2012/wordml" xmlns:wpg="http://schemas.microsoft.com/office/word/2010/wordprocessingGroup" xmlns:wpi="http://schemas.microsoft.com/office/word/2010/wordprocessingInk" xmlns:wne="http://schemas.microsoft.com/office/word/2006/wordml" xmlns:wps="http://schemas.microsoft.com/office/word/2010/wordprocessingShape" mc:Ignorable="w14 w15 wp14">
   <w:footnote w:type="separator" w:id="-1">
@@ -5974,6 +4887,40 @@
       </w:pBdr>
       <w:tabs>
         <w:tab w:val="right" w:pos="9638"/>
+      </w:tabs>
+      <w:spacing w:after="0"/>
+    </w:pPr>
+    <w:r>
+      <w:rPr>
+        <w:rFonts w:ascii="Arial" w:cs="Arial" w:eastAsia="Arial" w:hAnsi="Arial"/>
+        <w:color w:val="808080"/>
+        <w:sz w:val="16"/>
+        <w:szCs w:val="16"/>
+      </w:rPr>
+      <w:t xml:space="preserve">Validación del problema  ·  Programa Emprendedor</w:t>
+    </w:r>
+    <w:r>
+      <w:rPr>
+        <w:rFonts w:ascii="Arial" w:cs="Arial" w:eastAsia="Arial" w:hAnsi="Arial"/>
+        <w:color w:val="808080"/>
+        <w:sz w:val="16"/>
+        <w:szCs w:val="16"/>
+      </w:rPr>
+      <w:t xml:space="preserve">	22 de septiembre de 2026</w:t>
+    </w:r>
+  </w:p>
+</w:hdr>
+</file>
+
+<file path=word/header2.xml><?xml version="1.0" encoding="utf-8"?>
+<w:hdr xmlns:wpc="http://schemas.microsoft.com/office/word/2010/wordprocessingCanvas" xmlns:mc="http://schemas.openxmlformats.org/markup-compatibility/2006" xmlns:o="urn:schemas-microsoft-com:office:office" xmlns:r="http://schemas.openxmlformats.org/officeDocument/2006/relationships" xmlns:m="http://schemas.openxmlformats.org/officeDocument/2006/math" xmlns:v="urn:schemas-microsoft-com:vml" xmlns:wp14="http://schemas.microsoft.com/office/word/2010/wordprocessingDrawing" xmlns:wp="http://schemas.openxmlformats.org/drawingml/2006/wordprocessingDrawing" xmlns:w10="urn:schemas-microsoft-com:office:word" xmlns:w="http://schemas.openxmlformats.org/wordprocessingml/2006/main" xmlns:w14="http://schemas.microsoft.com/office/word/2010/wordml" xmlns:w15="http://schemas.microsoft.com/office/word/2012/wordml" xmlns:wpg="http://schemas.microsoft.com/office/word/2010/wordprocessingGroup" xmlns:wpi="http://schemas.microsoft.com/office/word/2010/wordprocessingInk" xmlns:wne="http://schemas.microsoft.com/office/word/2006/wordml" xmlns:wps="http://schemas.microsoft.com/office/word/2010/wordprocessingShape" xmlns:cx="http://schemas.microsoft.com/office/drawing/2014/chartex" xmlns:cx1="http://schemas.microsoft.com/office/drawing/2015/9/8/chartex" xmlns:cx2="http://schemas.microsoft.com/office/drawing/2015/10/21/chartex" xmlns:cx3="http://schemas.microsoft.com/office/drawing/2016/5/9/chartex" xmlns:cx4="http://schemas.microsoft.com/office/drawing/2016/5/10/chartex" xmlns:cx5="http://schemas.microsoft.com/office/drawing/2016/5/11/chartex" xmlns:cx6="http://schemas.microsoft.com/office/drawing/2016/5/12/chartex" xmlns:cx7="http://schemas.microsoft.com/office/drawing/2016/5/13/chartex" xmlns:cx8="http://schemas.microsoft.com/office/drawing/2016/5/14/chartex" xmlns:w16cid="http://schemas.microsoft.com/office/word/2016/wordml/cid" xmlns:w16se="http://schemas.microsoft.com/office/word/2015/wordml/symex">
+  <w:p>
+    <w:pPr>
+      <w:pBdr>
+        <w:bottom w:val="single" w:color="BFBFBF" w:sz="4" w:space="4"/>
+      </w:pBdr>
+      <w:tabs>
+        <w:tab w:val="right" w:pos="14570"/>
       </w:tabs>
       <w:spacing w:after="0"/>
     </w:pPr>

</xml_diff>

<commit_message>
Quitar el registro de entrevistas del entregable
La tabla que listaba las seis entrevistas con nombre, perfil, episodio y
cifra sale del documento. El contraste de la seccion 1 sigue apoyandose en
ellas sin exponer la lista.

Renumerado: el template Tu mejor entrevista pasa a ser el punto 2 y el
contraste contra el Mapa de Propuesta de Valor el punto 3. El subtitulo de
portada ya no anuncia un registro que el documento no trae.

El documento queda en 7 paginas, la ultima apaisada con la captura del
tablero.

Co-Authored-By: Claude Opus 5 <noreply@anthropic.com>
Claude-Session: https://claude.ai/code/session_01Q6gU99fdE1UYYeA3Pjr9mH
</commit_message>
<xml_diff>
--- a/reports/validacion-del-problema.docx
+++ b/reports/validacion-del-problema.docx
@@ -62,7 +62,7 @@
           <w:sz w:val="24"/>
           <w:szCs w:val="24"/>
         </w:rPr>
-        <w:t xml:space="preserve">Registro de entrevistas, mejor entrevista y contraste contra el Mapa de Propuesta de Valor</w:t>
+        <w:t xml:space="preserve">Nuestra mejor entrevista y el contraste contra el Mapa de Propuesta de Valor</w:t>
       </w:r>
     </w:p>
     <w:tbl>
@@ -828,1362 +828,7 @@
         <w:pStyle w:val="Heading1"/>
       </w:pPr>
       <w:r>
-        <w:t xml:space="preserve">2. Registro de entrevistas realizadas</w:t>
-      </w:r>
-    </w:p>
-    <w:p>
-      <w:pPr>
-        <w:spacing w:after="120" w:line="276"/>
-      </w:pPr>
-      <w:r>
-        <w:rPr>
-          <w:rFonts w:ascii="Arial" w:cs="Arial" w:eastAsia="Arial" w:hAnsi="Arial"/>
-          <w:sz w:val="22"/>
-          <w:szCs w:val="22"/>
-        </w:rPr>
-        <w:t xml:space="preserve">Seis conversaciones con personas del mismo puesto: quien decide o prepara la decisión de compra en una importadora de repuestos de Santa Cruz. Una fila por entrevista, con el episodio que relató y lo que le costó.</w:t>
-      </w:r>
-    </w:p>
-    <w:tbl>
-      <w:tblPr>
-        <w:tblW w:type="dxa" w:w="9638"/>
-        <w:tblBorders>
-          <w:top w:val="single" w:color="auto" w:sz="4"/>
-          <w:left w:val="single" w:color="auto" w:sz="4"/>
-          <w:bottom w:val="single" w:color="auto" w:sz="4"/>
-          <w:right w:val="single" w:color="auto" w:sz="4"/>
-          <w:insideH w:val="single" w:color="auto" w:sz="4"/>
-          <w:insideV w:val="single" w:color="auto" w:sz="4"/>
-        </w:tblBorders>
-      </w:tblPr>
-      <w:tblGrid>
-        <w:gridCol w:w="420"/>
-        <w:gridCol w:w="1880"/>
-        <w:gridCol w:w="1600"/>
-        <w:gridCol w:w="3300"/>
-        <w:gridCol w:w="2438"/>
-      </w:tblGrid>
-      <w:tr>
-        <w:trPr>
-          <w:tblHeader/>
-        </w:trPr>
-        <w:tc>
-          <w:tcPr>
-            <w:tcW w:type="dxa" w:w="420"/>
-            <w:tcBorders>
-              <w:top w:val="single" w:color="BFBFBF" w:sz="1"/>
-              <w:left w:val="single" w:color="BFBFBF" w:sz="1"/>
-              <w:bottom w:val="single" w:color="BFBFBF" w:sz="1"/>
-              <w:right w:val="single" w:color="BFBFBF" w:sz="1"/>
-            </w:tcBorders>
-            <w:shd w:fill="DCE6F1" w:val="clear"/>
-            <w:tcMar>
-              <w:top w:type="dxa" w:w="80"/>
-              <w:left w:type="dxa" w:w="120"/>
-              <w:bottom w:type="dxa" w:w="80"/>
-              <w:right w:type="dxa" w:w="120"/>
-            </w:tcMar>
-            <w:vAlign w:val="top"/>
-          </w:tcPr>
-          <w:p>
-            <w:pPr>
-              <w:spacing w:after="0" w:line="276"/>
-            </w:pPr>
-            <w:r>
-              <w:rPr>
-                <w:rFonts w:ascii="Arial" w:cs="Arial" w:eastAsia="Arial" w:hAnsi="Arial"/>
-                <w:b/>
-                <w:bCs/>
-                <w:color w:val="1F4E79"/>
-                <w:sz w:val="19"/>
-                <w:szCs w:val="19"/>
-              </w:rPr>
-              <w:t xml:space="preserve">N.º</w:t>
-            </w:r>
-          </w:p>
-        </w:tc>
-        <w:tc>
-          <w:tcPr>
-            <w:tcW w:type="dxa" w:w="1880"/>
-            <w:tcBorders>
-              <w:top w:val="single" w:color="BFBFBF" w:sz="1"/>
-              <w:left w:val="single" w:color="BFBFBF" w:sz="1"/>
-              <w:bottom w:val="single" w:color="BFBFBF" w:sz="1"/>
-              <w:right w:val="single" w:color="BFBFBF" w:sz="1"/>
-            </w:tcBorders>
-            <w:shd w:fill="DCE6F1" w:val="clear"/>
-            <w:tcMar>
-              <w:top w:type="dxa" w:w="80"/>
-              <w:left w:type="dxa" w:w="120"/>
-              <w:bottom w:type="dxa" w:w="80"/>
-              <w:right w:type="dxa" w:w="120"/>
-            </w:tcMar>
-            <w:vAlign w:val="top"/>
-          </w:tcPr>
-          <w:p>
-            <w:pPr>
-              <w:spacing w:after="0" w:line="276"/>
-            </w:pPr>
-            <w:r>
-              <w:rPr>
-                <w:rFonts w:ascii="Arial" w:cs="Arial" w:eastAsia="Arial" w:hAnsi="Arial"/>
-                <w:b/>
-                <w:bCs/>
-                <w:color w:val="1F4E79"/>
-                <w:sz w:val="19"/>
-                <w:szCs w:val="19"/>
-              </w:rPr>
-              <w:t xml:space="preserve">Entrevistado</w:t>
-            </w:r>
-          </w:p>
-        </w:tc>
-        <w:tc>
-          <w:tcPr>
-            <w:tcW w:type="dxa" w:w="1600"/>
-            <w:tcBorders>
-              <w:top w:val="single" w:color="BFBFBF" w:sz="1"/>
-              <w:left w:val="single" w:color="BFBFBF" w:sz="1"/>
-              <w:bottom w:val="single" w:color="BFBFBF" w:sz="1"/>
-              <w:right w:val="single" w:color="BFBFBF" w:sz="1"/>
-            </w:tcBorders>
-            <w:shd w:fill="DCE6F1" w:val="clear"/>
-            <w:tcMar>
-              <w:top w:type="dxa" w:w="80"/>
-              <w:left w:type="dxa" w:w="120"/>
-              <w:bottom w:type="dxa" w:w="80"/>
-              <w:right w:type="dxa" w:w="120"/>
-            </w:tcMar>
-            <w:vAlign w:val="top"/>
-          </w:tcPr>
-          <w:p>
-            <w:pPr>
-              <w:spacing w:after="0" w:line="276"/>
-            </w:pPr>
-            <w:r>
-              <w:rPr>
-                <w:rFonts w:ascii="Arial" w:cs="Arial" w:eastAsia="Arial" w:hAnsi="Arial"/>
-                <w:b/>
-                <w:bCs/>
-                <w:color w:val="1F4E79"/>
-                <w:sz w:val="19"/>
-                <w:szCs w:val="19"/>
-              </w:rPr>
-              <w:t xml:space="preserve">Perfil de la empresa</w:t>
-            </w:r>
-          </w:p>
-        </w:tc>
-        <w:tc>
-          <w:tcPr>
-            <w:tcW w:type="dxa" w:w="3300"/>
-            <w:tcBorders>
-              <w:top w:val="single" w:color="BFBFBF" w:sz="1"/>
-              <w:left w:val="single" w:color="BFBFBF" w:sz="1"/>
-              <w:bottom w:val="single" w:color="BFBFBF" w:sz="1"/>
-              <w:right w:val="single" w:color="BFBFBF" w:sz="1"/>
-            </w:tcBorders>
-            <w:shd w:fill="DCE6F1" w:val="clear"/>
-            <w:tcMar>
-              <w:top w:type="dxa" w:w="80"/>
-              <w:left w:type="dxa" w:w="120"/>
-              <w:bottom w:type="dxa" w:w="80"/>
-              <w:right w:type="dxa" w:w="120"/>
-            </w:tcMar>
-            <w:vAlign w:val="top"/>
-          </w:tcPr>
-          <w:p>
-            <w:pPr>
-              <w:spacing w:after="0" w:line="276"/>
-            </w:pPr>
-            <w:r>
-              <w:rPr>
-                <w:rFonts w:ascii="Arial" w:cs="Arial" w:eastAsia="Arial" w:hAnsi="Arial"/>
-                <w:b/>
-                <w:bCs/>
-                <w:color w:val="1F4E79"/>
-                <w:sz w:val="19"/>
-                <w:szCs w:val="19"/>
-              </w:rPr>
-              <w:t xml:space="preserve">Episodio concreto que relató</w:t>
-            </w:r>
-          </w:p>
-        </w:tc>
-        <w:tc>
-          <w:tcPr>
-            <w:tcW w:type="dxa" w:w="2438"/>
-            <w:tcBorders>
-              <w:top w:val="single" w:color="BFBFBF" w:sz="1"/>
-              <w:left w:val="single" w:color="BFBFBF" w:sz="1"/>
-              <w:bottom w:val="single" w:color="BFBFBF" w:sz="1"/>
-              <w:right w:val="single" w:color="BFBFBF" w:sz="1"/>
-            </w:tcBorders>
-            <w:shd w:fill="DCE6F1" w:val="clear"/>
-            <w:tcMar>
-              <w:top w:type="dxa" w:w="80"/>
-              <w:left w:type="dxa" w:w="120"/>
-              <w:bottom w:type="dxa" w:w="80"/>
-              <w:right w:type="dxa" w:w="120"/>
-            </w:tcMar>
-            <w:vAlign w:val="top"/>
-          </w:tcPr>
-          <w:p>
-            <w:pPr>
-              <w:spacing w:after="0" w:line="276"/>
-            </w:pPr>
-            <w:r>
-              <w:rPr>
-                <w:rFonts w:ascii="Arial" w:cs="Arial" w:eastAsia="Arial" w:hAnsi="Arial"/>
-                <w:b/>
-                <w:bCs/>
-                <w:color w:val="1F4E79"/>
-                <w:sz w:val="19"/>
-                <w:szCs w:val="19"/>
-              </w:rPr>
-              <w:t xml:space="preserve">Lo que le costó</w:t>
-            </w:r>
-          </w:p>
-        </w:tc>
-      </w:tr>
-      <w:tr>
-        <w:tc>
-          <w:tcPr>
-            <w:tcW w:type="dxa" w:w="420"/>
-            <w:tcBorders>
-              <w:top w:val="single" w:color="BFBFBF" w:sz="1"/>
-              <w:left w:val="single" w:color="BFBFBF" w:sz="1"/>
-              <w:bottom w:val="single" w:color="BFBFBF" w:sz="1"/>
-              <w:right w:val="single" w:color="BFBFBF" w:sz="1"/>
-            </w:tcBorders>
-            <w:tcMar>
-              <w:top w:type="dxa" w:w="80"/>
-              <w:left w:type="dxa" w:w="120"/>
-              <w:bottom w:type="dxa" w:w="80"/>
-              <w:right w:type="dxa" w:w="120"/>
-            </w:tcMar>
-            <w:vAlign w:val="top"/>
-          </w:tcPr>
-          <w:p>
-            <w:pPr>
-              <w:spacing w:after="0" w:line="276"/>
-            </w:pPr>
-            <w:r>
-              <w:rPr>
-                <w:rFonts w:ascii="Arial" w:cs="Arial" w:eastAsia="Arial" w:hAnsi="Arial"/>
-                <w:b/>
-                <w:bCs/>
-                <w:sz w:val="20"/>
-                <w:szCs w:val="20"/>
-              </w:rPr>
-              <w:t xml:space="preserve">1</w:t>
-            </w:r>
-          </w:p>
-        </w:tc>
-        <w:tc>
-          <w:tcPr>
-            <w:tcW w:type="dxa" w:w="1880"/>
-            <w:tcBorders>
-              <w:top w:val="single" w:color="BFBFBF" w:sz="1"/>
-              <w:left w:val="single" w:color="BFBFBF" w:sz="1"/>
-              <w:bottom w:val="single" w:color="BFBFBF" w:sz="1"/>
-              <w:right w:val="single" w:color="BFBFBF" w:sz="1"/>
-            </w:tcBorders>
-            <w:tcMar>
-              <w:top w:type="dxa" w:w="80"/>
-              <w:left w:type="dxa" w:w="120"/>
-              <w:bottom w:type="dxa" w:w="80"/>
-              <w:right w:type="dxa" w:w="120"/>
-            </w:tcMar>
-            <w:vAlign w:val="top"/>
-          </w:tcPr>
-          <w:p>
-            <w:pPr>
-              <w:spacing w:after="30" w:line="276"/>
-            </w:pPr>
-            <w:r>
-              <w:rPr>
-                <w:rFonts w:ascii="Arial" w:cs="Arial" w:eastAsia="Arial" w:hAnsi="Arial"/>
-                <w:b/>
-                <w:bCs/>
-                <w:sz w:val="19"/>
-                <w:szCs w:val="19"/>
-              </w:rPr>
-              <w:t xml:space="preserve">Carlos Andrés Méndez</w:t>
-            </w:r>
-          </w:p>
-          <w:p>
-            <w:pPr>
-              <w:spacing w:after="0" w:line="276"/>
-            </w:pPr>
-            <w:r>
-              <w:rPr>
-                <w:rFonts w:ascii="Arial" w:cs="Arial" w:eastAsia="Arial" w:hAnsi="Arial"/>
-                <w:color w:val="595959"/>
-                <w:sz w:val="18"/>
-                <w:szCs w:val="18"/>
-              </w:rPr>
-              <w:t xml:space="preserve">Encargado de compras e importaciones</w:t>
-            </w:r>
-          </w:p>
-        </w:tc>
-        <w:tc>
-          <w:tcPr>
-            <w:tcW w:type="dxa" w:w="1600"/>
-            <w:tcBorders>
-              <w:top w:val="single" w:color="BFBFBF" w:sz="1"/>
-              <w:left w:val="single" w:color="BFBFBF" w:sz="1"/>
-              <w:bottom w:val="single" w:color="BFBFBF" w:sz="1"/>
-              <w:right w:val="single" w:color="BFBFBF" w:sz="1"/>
-            </w:tcBorders>
-            <w:tcMar>
-              <w:top w:type="dxa" w:w="80"/>
-              <w:left w:type="dxa" w:w="120"/>
-              <w:bottom w:type="dxa" w:w="80"/>
-              <w:right w:type="dxa" w:w="120"/>
-            </w:tcMar>
-            <w:vAlign w:val="top"/>
-          </w:tcPr>
-          <w:p>
-            <w:pPr>
-              <w:spacing w:after="0" w:line="276"/>
-            </w:pPr>
-            <w:r>
-              <w:rPr>
-                <w:rFonts w:ascii="Arial" w:cs="Arial" w:eastAsia="Arial" w:hAnsi="Arial"/>
-                <w:sz w:val="18"/>
-                <w:szCs w:val="18"/>
-              </w:rPr>
-              <w:t xml:space="preserve">Importadora mediana de repuestos, 8 años de experiencia</w:t>
-            </w:r>
-          </w:p>
-        </w:tc>
-        <w:tc>
-          <w:tcPr>
-            <w:tcW w:type="dxa" w:w="3300"/>
-            <w:tcBorders>
-              <w:top w:val="single" w:color="BFBFBF" w:sz="1"/>
-              <w:left w:val="single" w:color="BFBFBF" w:sz="1"/>
-              <w:bottom w:val="single" w:color="BFBFBF" w:sz="1"/>
-              <w:right w:val="single" w:color="BFBFBF" w:sz="1"/>
-            </w:tcBorders>
-            <w:tcMar>
-              <w:top w:type="dxa" w:w="80"/>
-              <w:left w:type="dxa" w:w="120"/>
-              <w:bottom w:type="dxa" w:w="80"/>
-              <w:right w:type="dxa" w:w="120"/>
-            </w:tcMar>
-            <w:vAlign w:val="top"/>
-          </w:tcPr>
-          <w:p>
-            <w:pPr>
-              <w:spacing w:after="0" w:line="276"/>
-            </w:pPr>
-            <w:r>
-              <w:rPr>
-                <w:rFonts w:ascii="Arial" w:cs="Arial" w:eastAsia="Arial" w:hAnsi="Arial"/>
-                <w:sz w:val="18"/>
-                <w:szCs w:val="18"/>
-              </w:rPr>
-              <w:t xml:space="preserve">Pedido de USD 28.000 a fines de agosto. Esperó cuatro días frente a una cotización vigente por siete y el tipo de cambio siguió subiendo: calculó a Bs 10,95 y pagó cerca de Bs 11,38.</w:t>
-            </w:r>
-          </w:p>
-        </w:tc>
-        <w:tc>
-          <w:tcPr>
-            <w:tcW w:type="dxa" w:w="2438"/>
-            <w:tcBorders>
-              <w:top w:val="single" w:color="BFBFBF" w:sz="1"/>
-              <w:left w:val="single" w:color="BFBFBF" w:sz="1"/>
-              <w:bottom w:val="single" w:color="BFBFBF" w:sz="1"/>
-              <w:right w:val="single" w:color="BFBFBF" w:sz="1"/>
-            </w:tcBorders>
-            <w:tcMar>
-              <w:top w:type="dxa" w:w="80"/>
-              <w:left w:type="dxa" w:w="120"/>
-              <w:bottom w:type="dxa" w:w="80"/>
-              <w:right w:type="dxa" w:w="120"/>
-            </w:tcMar>
-            <w:vAlign w:val="top"/>
-          </w:tcPr>
-          <w:p>
-            <w:pPr>
-              <w:spacing w:after="0" w:line="276"/>
-            </w:pPr>
-            <w:r>
-              <w:rPr>
-                <w:rFonts w:ascii="Arial" w:cs="Arial" w:eastAsia="Arial" w:hAnsi="Arial"/>
-                <w:sz w:val="18"/>
-                <w:szCs w:val="18"/>
-              </w:rPr>
-              <w:t xml:space="preserve">Bs 12.040 adicionales en esa compra. Bs 55.000 inmovilizados en baja rotación. Seis ventas no atendidas en dos semanas.</w:t>
-            </w:r>
-          </w:p>
-        </w:tc>
-      </w:tr>
-      <w:tr>
-        <w:tc>
-          <w:tcPr>
-            <w:tcW w:type="dxa" w:w="420"/>
-            <w:tcBorders>
-              <w:top w:val="single" w:color="BFBFBF" w:sz="1"/>
-              <w:left w:val="single" w:color="BFBFBF" w:sz="1"/>
-              <w:bottom w:val="single" w:color="BFBFBF" w:sz="1"/>
-              <w:right w:val="single" w:color="BFBFBF" w:sz="1"/>
-            </w:tcBorders>
-            <w:tcMar>
-              <w:top w:type="dxa" w:w="80"/>
-              <w:left w:type="dxa" w:w="120"/>
-              <w:bottom w:type="dxa" w:w="80"/>
-              <w:right w:type="dxa" w:w="120"/>
-            </w:tcMar>
-            <w:vAlign w:val="top"/>
-          </w:tcPr>
-          <w:p>
-            <w:pPr>
-              <w:spacing w:after="0" w:line="276"/>
-            </w:pPr>
-            <w:r>
-              <w:rPr>
-                <w:rFonts w:ascii="Arial" w:cs="Arial" w:eastAsia="Arial" w:hAnsi="Arial"/>
-                <w:b/>
-                <w:bCs/>
-                <w:sz w:val="20"/>
-                <w:szCs w:val="20"/>
-              </w:rPr>
-              <w:t xml:space="preserve">2</w:t>
-            </w:r>
-          </w:p>
-        </w:tc>
-        <w:tc>
-          <w:tcPr>
-            <w:tcW w:type="dxa" w:w="1880"/>
-            <w:tcBorders>
-              <w:top w:val="single" w:color="BFBFBF" w:sz="1"/>
-              <w:left w:val="single" w:color="BFBFBF" w:sz="1"/>
-              <w:bottom w:val="single" w:color="BFBFBF" w:sz="1"/>
-              <w:right w:val="single" w:color="BFBFBF" w:sz="1"/>
-            </w:tcBorders>
-            <w:tcMar>
-              <w:top w:type="dxa" w:w="80"/>
-              <w:left w:type="dxa" w:w="120"/>
-              <w:bottom w:type="dxa" w:w="80"/>
-              <w:right w:type="dxa" w:w="120"/>
-            </w:tcMar>
-            <w:vAlign w:val="top"/>
-          </w:tcPr>
-          <w:p>
-            <w:pPr>
-              <w:spacing w:after="30" w:line="276"/>
-            </w:pPr>
-            <w:r>
-              <w:rPr>
-                <w:rFonts w:ascii="Arial" w:cs="Arial" w:eastAsia="Arial" w:hAnsi="Arial"/>
-                <w:b/>
-                <w:bCs/>
-                <w:sz w:val="19"/>
-                <w:szCs w:val="19"/>
-              </w:rPr>
-              <w:t xml:space="preserve">Verónica Salvatierra</w:t>
-            </w:r>
-          </w:p>
-          <w:p>
-            <w:pPr>
-              <w:spacing w:after="0" w:line="276"/>
-            </w:pPr>
-            <w:r>
-              <w:rPr>
-                <w:rFonts w:ascii="Arial" w:cs="Arial" w:eastAsia="Arial" w:hAnsi="Arial"/>
-                <w:color w:val="595959"/>
-                <w:sz w:val="18"/>
-                <w:szCs w:val="18"/>
-              </w:rPr>
-              <w:t xml:space="preserve">Propietaria y encargada de compras</w:t>
-            </w:r>
-          </w:p>
-        </w:tc>
-        <w:tc>
-          <w:tcPr>
-            <w:tcW w:type="dxa" w:w="1600"/>
-            <w:tcBorders>
-              <w:top w:val="single" w:color="BFBFBF" w:sz="1"/>
-              <w:left w:val="single" w:color="BFBFBF" w:sz="1"/>
-              <w:bottom w:val="single" w:color="BFBFBF" w:sz="1"/>
-              <w:right w:val="single" w:color="BFBFBF" w:sz="1"/>
-            </w:tcBorders>
-            <w:tcMar>
-              <w:top w:type="dxa" w:w="80"/>
-              <w:left w:type="dxa" w:w="120"/>
-              <w:bottom w:type="dxa" w:w="80"/>
-              <w:right w:type="dxa" w:w="120"/>
-            </w:tcMar>
-            <w:vAlign w:val="top"/>
-          </w:tcPr>
-          <w:p>
-            <w:pPr>
-              <w:spacing w:after="0" w:line="276"/>
-            </w:pPr>
-            <w:r>
-              <w:rPr>
-                <w:rFonts w:ascii="Arial" w:cs="Arial" w:eastAsia="Arial" w:hAnsi="Arial"/>
-                <w:sz w:val="18"/>
-                <w:szCs w:val="18"/>
-              </w:rPr>
-              <w:t xml:space="preserve">Importadora pequeña, 11 años de experiencia</w:t>
-            </w:r>
-          </w:p>
-        </w:tc>
-        <w:tc>
-          <w:tcPr>
-            <w:tcW w:type="dxa" w:w="3300"/>
-            <w:tcBorders>
-              <w:top w:val="single" w:color="BFBFBF" w:sz="1"/>
-              <w:left w:val="single" w:color="BFBFBF" w:sz="1"/>
-              <w:bottom w:val="single" w:color="BFBFBF" w:sz="1"/>
-              <w:right w:val="single" w:color="BFBFBF" w:sz="1"/>
-            </w:tcBorders>
-            <w:tcMar>
-              <w:top w:type="dxa" w:w="80"/>
-              <w:left w:type="dxa" w:w="120"/>
-              <w:bottom w:type="dxa" w:w="80"/>
-              <w:right w:type="dxa" w:w="120"/>
-            </w:tcMar>
-            <w:vAlign w:val="top"/>
-          </w:tcPr>
-          <w:p>
-            <w:pPr>
-              <w:spacing w:after="0" w:line="276"/>
-            </w:pPr>
-            <w:r>
-              <w:rPr>
-                <w:rFonts w:ascii="Arial" w:cs="Arial" w:eastAsia="Arial" w:hAnsi="Arial"/>
-                <w:sz w:val="18"/>
-                <w:szCs w:val="18"/>
-              </w:rPr>
-              <w:t xml:space="preserve">En julio demoró la decisión sobre amortiguadores y suspensión porque no sabía a qué precio conseguiría los dólares. Redujo el pedido un 25 % para no comprometer el capital.</w:t>
-            </w:r>
-          </w:p>
-        </w:tc>
-        <w:tc>
-          <w:tcPr>
-            <w:tcW w:type="dxa" w:w="2438"/>
-            <w:tcBorders>
-              <w:top w:val="single" w:color="BFBFBF" w:sz="1"/>
-              <w:left w:val="single" w:color="BFBFBF" w:sz="1"/>
-              <w:bottom w:val="single" w:color="BFBFBF" w:sz="1"/>
-              <w:right w:val="single" w:color="BFBFBF" w:sz="1"/>
-            </w:tcBorders>
-            <w:tcMar>
-              <w:top w:type="dxa" w:w="80"/>
-              <w:left w:type="dxa" w:w="120"/>
-              <w:bottom w:type="dxa" w:w="80"/>
-              <w:right w:type="dxa" w:w="120"/>
-            </w:tcMar>
-            <w:vAlign w:val="top"/>
-          </w:tcPr>
-          <w:p>
-            <w:pPr>
-              <w:spacing w:after="0" w:line="276"/>
-            </w:pPr>
-            <w:r>
-              <w:rPr>
-                <w:rFonts w:ascii="Arial" w:cs="Arial" w:eastAsia="Arial" w:hAnsi="Arial"/>
-                <w:sz w:val="18"/>
-                <w:szCs w:val="18"/>
-              </w:rPr>
-              <w:t xml:space="preserve">Bs 9.000 de margen perdido por dos modelos que se agotaron un mes después.</w:t>
-            </w:r>
-          </w:p>
-        </w:tc>
-      </w:tr>
-      <w:tr>
-        <w:tc>
-          <w:tcPr>
-            <w:tcW w:type="dxa" w:w="420"/>
-            <w:tcBorders>
-              <w:top w:val="single" w:color="BFBFBF" w:sz="1"/>
-              <w:left w:val="single" w:color="BFBFBF" w:sz="1"/>
-              <w:bottom w:val="single" w:color="BFBFBF" w:sz="1"/>
-              <w:right w:val="single" w:color="BFBFBF" w:sz="1"/>
-            </w:tcBorders>
-            <w:tcMar>
-              <w:top w:type="dxa" w:w="80"/>
-              <w:left w:type="dxa" w:w="120"/>
-              <w:bottom w:type="dxa" w:w="80"/>
-              <w:right w:type="dxa" w:w="120"/>
-            </w:tcMar>
-            <w:vAlign w:val="top"/>
-          </w:tcPr>
-          <w:p>
-            <w:pPr>
-              <w:spacing w:after="0" w:line="276"/>
-            </w:pPr>
-            <w:r>
-              <w:rPr>
-                <w:rFonts w:ascii="Arial" w:cs="Arial" w:eastAsia="Arial" w:hAnsi="Arial"/>
-                <w:b/>
-                <w:bCs/>
-                <w:sz w:val="20"/>
-                <w:szCs w:val="20"/>
-              </w:rPr>
-              <w:t xml:space="preserve">3</w:t>
-            </w:r>
-          </w:p>
-        </w:tc>
-        <w:tc>
-          <w:tcPr>
-            <w:tcW w:type="dxa" w:w="1880"/>
-            <w:tcBorders>
-              <w:top w:val="single" w:color="BFBFBF" w:sz="1"/>
-              <w:left w:val="single" w:color="BFBFBF" w:sz="1"/>
-              <w:bottom w:val="single" w:color="BFBFBF" w:sz="1"/>
-              <w:right w:val="single" w:color="BFBFBF" w:sz="1"/>
-            </w:tcBorders>
-            <w:tcMar>
-              <w:top w:type="dxa" w:w="80"/>
-              <w:left w:type="dxa" w:w="120"/>
-              <w:bottom w:type="dxa" w:w="80"/>
-              <w:right w:type="dxa" w:w="120"/>
-            </w:tcMar>
-            <w:vAlign w:val="top"/>
-          </w:tcPr>
-          <w:p>
-            <w:pPr>
-              <w:spacing w:after="30" w:line="276"/>
-            </w:pPr>
-            <w:r>
-              <w:rPr>
-                <w:rFonts w:ascii="Arial" w:cs="Arial" w:eastAsia="Arial" w:hAnsi="Arial"/>
-                <w:b/>
-                <w:bCs/>
-                <w:sz w:val="19"/>
-                <w:szCs w:val="19"/>
-              </w:rPr>
-              <w:t xml:space="preserve">José Luis Mercado</w:t>
-            </w:r>
-          </w:p>
-          <w:p>
-            <w:pPr>
-              <w:spacing w:after="0" w:line="276"/>
-            </w:pPr>
-            <w:r>
-              <w:rPr>
-                <w:rFonts w:ascii="Arial" w:cs="Arial" w:eastAsia="Arial" w:hAnsi="Arial"/>
-                <w:color w:val="595959"/>
-                <w:sz w:val="18"/>
-                <w:szCs w:val="18"/>
-              </w:rPr>
-              <w:t xml:space="preserve">Administrador financiero</w:t>
-            </w:r>
-          </w:p>
-        </w:tc>
-        <w:tc>
-          <w:tcPr>
-            <w:tcW w:type="dxa" w:w="1600"/>
-            <w:tcBorders>
-              <w:top w:val="single" w:color="BFBFBF" w:sz="1"/>
-              <w:left w:val="single" w:color="BFBFBF" w:sz="1"/>
-              <w:bottom w:val="single" w:color="BFBFBF" w:sz="1"/>
-              <w:right w:val="single" w:color="BFBFBF" w:sz="1"/>
-            </w:tcBorders>
-            <w:tcMar>
-              <w:top w:type="dxa" w:w="80"/>
-              <w:left w:type="dxa" w:w="120"/>
-              <w:bottom w:type="dxa" w:w="80"/>
-              <w:right w:type="dxa" w:w="120"/>
-            </w:tcMar>
-            <w:vAlign w:val="top"/>
-          </w:tcPr>
-          <w:p>
-            <w:pPr>
-              <w:spacing w:after="0" w:line="276"/>
-            </w:pPr>
-            <w:r>
-              <w:rPr>
-                <w:rFonts w:ascii="Arial" w:cs="Arial" w:eastAsia="Arial" w:hAnsi="Arial"/>
-                <w:sz w:val="18"/>
-                <w:szCs w:val="18"/>
-              </w:rPr>
-              <w:t xml:space="preserve">Importadora mediana, 6 años de experiencia</w:t>
-            </w:r>
-          </w:p>
-        </w:tc>
-        <w:tc>
-          <w:tcPr>
-            <w:tcW w:type="dxa" w:w="3300"/>
-            <w:tcBorders>
-              <w:top w:val="single" w:color="BFBFBF" w:sz="1"/>
-              <w:left w:val="single" w:color="BFBFBF" w:sz="1"/>
-              <w:bottom w:val="single" w:color="BFBFBF" w:sz="1"/>
-              <w:right w:val="single" w:color="BFBFBF" w:sz="1"/>
-            </w:tcBorders>
-            <w:tcMar>
-              <w:top w:type="dxa" w:w="80"/>
-              <w:left w:type="dxa" w:w="120"/>
-              <w:bottom w:type="dxa" w:w="80"/>
-              <w:right w:type="dxa" w:w="120"/>
-            </w:tcMar>
-            <w:vAlign w:val="top"/>
-          </w:tcPr>
-          <w:p>
-            <w:pPr>
-              <w:spacing w:after="0" w:line="276"/>
-            </w:pPr>
-            <w:r>
-              <w:rPr>
-                <w:rFonts w:ascii="Arial" w:cs="Arial" w:eastAsia="Arial" w:hAnsi="Arial"/>
-                <w:sz w:val="18"/>
-                <w:szCs w:val="18"/>
-              </w:rPr>
-              <w:t xml:space="preserve">En agosto preparó tres escenarios cambiarios en Excel y aprobaron sólo el 70 % del pedido de filtros y pastillas, partido en dos envíos para bajar el riesgo.</w:t>
-            </w:r>
-          </w:p>
-        </w:tc>
-        <w:tc>
-          <w:tcPr>
-            <w:tcW w:type="dxa" w:w="2438"/>
-            <w:tcBorders>
-              <w:top w:val="single" w:color="BFBFBF" w:sz="1"/>
-              <w:left w:val="single" w:color="BFBFBF" w:sz="1"/>
-              <w:bottom w:val="single" w:color="BFBFBF" w:sz="1"/>
-              <w:right w:val="single" w:color="BFBFBF" w:sz="1"/>
-            </w:tcBorders>
-            <w:tcMar>
-              <w:top w:type="dxa" w:w="80"/>
-              <w:left w:type="dxa" w:w="120"/>
-              <w:bottom w:type="dxa" w:w="80"/>
-              <w:right w:type="dxa" w:w="120"/>
-            </w:tcMar>
-            <w:vAlign w:val="top"/>
-          </w:tcPr>
-          <w:p>
-            <w:pPr>
-              <w:spacing w:after="0" w:line="276"/>
-            </w:pPr>
-            <w:r>
-              <w:rPr>
-                <w:rFonts w:ascii="Arial" w:cs="Arial" w:eastAsia="Arial" w:hAnsi="Arial"/>
-                <w:sz w:val="18"/>
-                <w:szCs w:val="18"/>
-              </w:rPr>
-              <w:t xml:space="preserve">Bs 6.500 adicionales en transporte y comisiones por duplicar el envío.</w:t>
-            </w:r>
-          </w:p>
-        </w:tc>
-      </w:tr>
-      <w:tr>
-        <w:tc>
-          <w:tcPr>
-            <w:tcW w:type="dxa" w:w="420"/>
-            <w:tcBorders>
-              <w:top w:val="single" w:color="BFBFBF" w:sz="1"/>
-              <w:left w:val="single" w:color="BFBFBF" w:sz="1"/>
-              <w:bottom w:val="single" w:color="BFBFBF" w:sz="1"/>
-              <w:right w:val="single" w:color="BFBFBF" w:sz="1"/>
-            </w:tcBorders>
-            <w:tcMar>
-              <w:top w:type="dxa" w:w="80"/>
-              <w:left w:type="dxa" w:w="120"/>
-              <w:bottom w:type="dxa" w:w="80"/>
-              <w:right w:type="dxa" w:w="120"/>
-            </w:tcMar>
-            <w:vAlign w:val="top"/>
-          </w:tcPr>
-          <w:p>
-            <w:pPr>
-              <w:spacing w:after="0" w:line="276"/>
-            </w:pPr>
-            <w:r>
-              <w:rPr>
-                <w:rFonts w:ascii="Arial" w:cs="Arial" w:eastAsia="Arial" w:hAnsi="Arial"/>
-                <w:b/>
-                <w:bCs/>
-                <w:sz w:val="20"/>
-                <w:szCs w:val="20"/>
-              </w:rPr>
-              <w:t xml:space="preserve">4</w:t>
-            </w:r>
-          </w:p>
-        </w:tc>
-        <w:tc>
-          <w:tcPr>
-            <w:tcW w:type="dxa" w:w="1880"/>
-            <w:tcBorders>
-              <w:top w:val="single" w:color="BFBFBF" w:sz="1"/>
-              <w:left w:val="single" w:color="BFBFBF" w:sz="1"/>
-              <w:bottom w:val="single" w:color="BFBFBF" w:sz="1"/>
-              <w:right w:val="single" w:color="BFBFBF" w:sz="1"/>
-            </w:tcBorders>
-            <w:tcMar>
-              <w:top w:type="dxa" w:w="80"/>
-              <w:left w:type="dxa" w:w="120"/>
-              <w:bottom w:type="dxa" w:w="80"/>
-              <w:right w:type="dxa" w:w="120"/>
-            </w:tcMar>
-            <w:vAlign w:val="top"/>
-          </w:tcPr>
-          <w:p>
-            <w:pPr>
-              <w:spacing w:after="30" w:line="276"/>
-            </w:pPr>
-            <w:r>
-              <w:rPr>
-                <w:rFonts w:ascii="Arial" w:cs="Arial" w:eastAsia="Arial" w:hAnsi="Arial"/>
-                <w:b/>
-                <w:bCs/>
-                <w:sz w:val="19"/>
-                <w:szCs w:val="19"/>
-              </w:rPr>
-              <w:t xml:space="preserve">Mauricio Rojas</w:t>
-            </w:r>
-          </w:p>
-          <w:p>
-            <w:pPr>
-              <w:spacing w:after="0" w:line="276"/>
-            </w:pPr>
-            <w:r>
-              <w:rPr>
-                <w:rFonts w:ascii="Arial" w:cs="Arial" w:eastAsia="Arial" w:hAnsi="Arial"/>
-                <w:color w:val="595959"/>
-                <w:sz w:val="18"/>
-                <w:szCs w:val="18"/>
-              </w:rPr>
-              <w:t xml:space="preserve">Encargado de compras internacionales</w:t>
-            </w:r>
-          </w:p>
-        </w:tc>
-        <w:tc>
-          <w:tcPr>
-            <w:tcW w:type="dxa" w:w="1600"/>
-            <w:tcBorders>
-              <w:top w:val="single" w:color="BFBFBF" w:sz="1"/>
-              <w:left w:val="single" w:color="BFBFBF" w:sz="1"/>
-              <w:bottom w:val="single" w:color="BFBFBF" w:sz="1"/>
-              <w:right w:val="single" w:color="BFBFBF" w:sz="1"/>
-            </w:tcBorders>
-            <w:tcMar>
-              <w:top w:type="dxa" w:w="80"/>
-              <w:left w:type="dxa" w:w="120"/>
-              <w:bottom w:type="dxa" w:w="80"/>
-              <w:right w:type="dxa" w:w="120"/>
-            </w:tcMar>
-            <w:vAlign w:val="top"/>
-          </w:tcPr>
-          <w:p>
-            <w:pPr>
-              <w:spacing w:after="0" w:line="276"/>
-            </w:pPr>
-            <w:r>
-              <w:rPr>
-                <w:rFonts w:ascii="Arial" w:cs="Arial" w:eastAsia="Arial" w:hAnsi="Arial"/>
-                <w:sz w:val="18"/>
-                <w:szCs w:val="18"/>
-              </w:rPr>
-              <w:t xml:space="preserve">Importadora mediana, 4 años de experiencia</w:t>
-            </w:r>
-          </w:p>
-        </w:tc>
-        <w:tc>
-          <w:tcPr>
-            <w:tcW w:type="dxa" w:w="3300"/>
-            <w:tcBorders>
-              <w:top w:val="single" w:color="BFBFBF" w:sz="1"/>
-              <w:left w:val="single" w:color="BFBFBF" w:sz="1"/>
-              <w:bottom w:val="single" w:color="BFBFBF" w:sz="1"/>
-              <w:right w:val="single" w:color="BFBFBF" w:sz="1"/>
-            </w:tcBorders>
-            <w:tcMar>
-              <w:top w:type="dxa" w:w="80"/>
-              <w:left w:type="dxa" w:w="120"/>
-              <w:bottom w:type="dxa" w:w="80"/>
-              <w:right w:type="dxa" w:w="120"/>
-            </w:tcMar>
-            <w:vAlign w:val="top"/>
-          </w:tcPr>
-          <w:p>
-            <w:pPr>
-              <w:spacing w:after="0" w:line="276"/>
-            </w:pPr>
-            <w:r>
-              <w:rPr>
-                <w:rFonts w:ascii="Arial" w:cs="Arial" w:eastAsia="Arial" w:hAnsi="Arial"/>
-                <w:sz w:val="18"/>
-                <w:szCs w:val="18"/>
-              </w:rPr>
-              <w:t xml:space="preserve">En septiembre tenía inventario para un mes y compró por encima de la venta promedio por temor a que el costo de reposición siguiera subiendo. Los rodamientos salieron rápido; los retenes no.</w:t>
-            </w:r>
-          </w:p>
-        </w:tc>
-        <w:tc>
-          <w:tcPr>
-            <w:tcW w:type="dxa" w:w="2438"/>
-            <w:tcBorders>
-              <w:top w:val="single" w:color="BFBFBF" w:sz="1"/>
-              <w:left w:val="single" w:color="BFBFBF" w:sz="1"/>
-              <w:bottom w:val="single" w:color="BFBFBF" w:sz="1"/>
-              <w:right w:val="single" w:color="BFBFBF" w:sz="1"/>
-            </w:tcBorders>
-            <w:tcMar>
-              <w:top w:type="dxa" w:w="80"/>
-              <w:left w:type="dxa" w:w="120"/>
-              <w:bottom w:type="dxa" w:w="80"/>
-              <w:right w:type="dxa" w:w="120"/>
-            </w:tcMar>
-            <w:vAlign w:val="top"/>
-          </w:tcPr>
-          <w:p>
-            <w:pPr>
-              <w:spacing w:after="0" w:line="276"/>
-            </w:pPr>
-            <w:r>
-              <w:rPr>
-                <w:rFonts w:ascii="Arial" w:cs="Arial" w:eastAsia="Arial" w:hAnsi="Arial"/>
-                <w:sz w:val="18"/>
-                <w:szCs w:val="18"/>
-              </w:rPr>
-              <w:t xml:space="preserve">Bs 30.000 inmovilizados en productos que pueden tardar meses.</w:t>
-            </w:r>
-          </w:p>
-        </w:tc>
-      </w:tr>
-      <w:tr>
-        <w:tc>
-          <w:tcPr>
-            <w:tcW w:type="dxa" w:w="420"/>
-            <w:tcBorders>
-              <w:top w:val="single" w:color="BFBFBF" w:sz="1"/>
-              <w:left w:val="single" w:color="BFBFBF" w:sz="1"/>
-              <w:bottom w:val="single" w:color="BFBFBF" w:sz="1"/>
-              <w:right w:val="single" w:color="BFBFBF" w:sz="1"/>
-            </w:tcBorders>
-            <w:tcMar>
-              <w:top w:type="dxa" w:w="80"/>
-              <w:left w:type="dxa" w:w="120"/>
-              <w:bottom w:type="dxa" w:w="80"/>
-              <w:right w:type="dxa" w:w="120"/>
-            </w:tcMar>
-            <w:vAlign w:val="top"/>
-          </w:tcPr>
-          <w:p>
-            <w:pPr>
-              <w:spacing w:after="0" w:line="276"/>
-            </w:pPr>
-            <w:r>
-              <w:rPr>
-                <w:rFonts w:ascii="Arial" w:cs="Arial" w:eastAsia="Arial" w:hAnsi="Arial"/>
-                <w:b/>
-                <w:bCs/>
-                <w:sz w:val="20"/>
-                <w:szCs w:val="20"/>
-              </w:rPr>
-              <w:t xml:space="preserve">5</w:t>
-            </w:r>
-          </w:p>
-        </w:tc>
-        <w:tc>
-          <w:tcPr>
-            <w:tcW w:type="dxa" w:w="1880"/>
-            <w:tcBorders>
-              <w:top w:val="single" w:color="BFBFBF" w:sz="1"/>
-              <w:left w:val="single" w:color="BFBFBF" w:sz="1"/>
-              <w:bottom w:val="single" w:color="BFBFBF" w:sz="1"/>
-              <w:right w:val="single" w:color="BFBFBF" w:sz="1"/>
-            </w:tcBorders>
-            <w:tcMar>
-              <w:top w:type="dxa" w:w="80"/>
-              <w:left w:type="dxa" w:w="120"/>
-              <w:bottom w:type="dxa" w:w="80"/>
-              <w:right w:type="dxa" w:w="120"/>
-            </w:tcMar>
-            <w:vAlign w:val="top"/>
-          </w:tcPr>
-          <w:p>
-            <w:pPr>
-              <w:spacing w:after="30" w:line="276"/>
-            </w:pPr>
-            <w:r>
-              <w:rPr>
-                <w:rFonts w:ascii="Arial" w:cs="Arial" w:eastAsia="Arial" w:hAnsi="Arial"/>
-                <w:b/>
-                <w:bCs/>
-                <w:sz w:val="19"/>
-                <w:szCs w:val="19"/>
-              </w:rPr>
-              <w:t xml:space="preserve">Andrea Suárez</w:t>
-            </w:r>
-          </w:p>
-          <w:p>
-            <w:pPr>
-              <w:spacing w:after="0" w:line="276"/>
-            </w:pPr>
-            <w:r>
-              <w:rPr>
-                <w:rFonts w:ascii="Arial" w:cs="Arial" w:eastAsia="Arial" w:hAnsi="Arial"/>
-                <w:color w:val="595959"/>
-                <w:sz w:val="18"/>
-                <w:szCs w:val="18"/>
-              </w:rPr>
-              <w:t xml:space="preserve">Gerente administrativa</w:t>
-            </w:r>
-          </w:p>
-        </w:tc>
-        <w:tc>
-          <w:tcPr>
-            <w:tcW w:type="dxa" w:w="1600"/>
-            <w:tcBorders>
-              <w:top w:val="single" w:color="BFBFBF" w:sz="1"/>
-              <w:left w:val="single" w:color="BFBFBF" w:sz="1"/>
-              <w:bottom w:val="single" w:color="BFBFBF" w:sz="1"/>
-              <w:right w:val="single" w:color="BFBFBF" w:sz="1"/>
-            </w:tcBorders>
-            <w:tcMar>
-              <w:top w:type="dxa" w:w="80"/>
-              <w:left w:type="dxa" w:w="120"/>
-              <w:bottom w:type="dxa" w:w="80"/>
-              <w:right w:type="dxa" w:w="120"/>
-            </w:tcMar>
-            <w:vAlign w:val="top"/>
-          </w:tcPr>
-          <w:p>
-            <w:pPr>
-              <w:spacing w:after="0" w:line="276"/>
-            </w:pPr>
-            <w:r>
-              <w:rPr>
-                <w:rFonts w:ascii="Arial" w:cs="Arial" w:eastAsia="Arial" w:hAnsi="Arial"/>
-                <w:sz w:val="18"/>
-                <w:szCs w:val="18"/>
-              </w:rPr>
-              <w:t xml:space="preserve">Importadora con registros y clasificación por rotación, 9 años de experiencia</w:t>
-            </w:r>
-          </w:p>
-        </w:tc>
-        <w:tc>
-          <w:tcPr>
-            <w:tcW w:type="dxa" w:w="3300"/>
-            <w:tcBorders>
-              <w:top w:val="single" w:color="BFBFBF" w:sz="1"/>
-              <w:left w:val="single" w:color="BFBFBF" w:sz="1"/>
-              <w:bottom w:val="single" w:color="BFBFBF" w:sz="1"/>
-              <w:right w:val="single" w:color="BFBFBF" w:sz="1"/>
-            </w:tcBorders>
-            <w:tcMar>
-              <w:top w:type="dxa" w:w="80"/>
-              <w:left w:type="dxa" w:w="120"/>
-              <w:bottom w:type="dxa" w:w="80"/>
-              <w:right w:type="dxa" w:w="120"/>
-            </w:tcMar>
-            <w:vAlign w:val="top"/>
-          </w:tcPr>
-          <w:p>
-            <w:pPr>
-              <w:spacing w:after="0" w:line="276"/>
-            </w:pPr>
-            <w:r>
-              <w:rPr>
-                <w:rFonts w:ascii="Arial" w:cs="Arial" w:eastAsia="Arial" w:hAnsi="Arial"/>
-                <w:sz w:val="18"/>
-                <w:szCs w:val="18"/>
-              </w:rPr>
-              <w:t xml:space="preserve">En agosto no dudó de la cantidad: la dificultad fue fijar el precio de venta que recuperara el costo de reposición. Actualizó costos con varios escenarios y aplicó márgenes distintos por rotación.</w:t>
-            </w:r>
-          </w:p>
-        </w:tc>
-        <w:tc>
-          <w:tcPr>
-            <w:tcW w:type="dxa" w:w="2438"/>
-            <w:tcBorders>
-              <w:top w:val="single" w:color="BFBFBF" w:sz="1"/>
-              <w:left w:val="single" w:color="BFBFBF" w:sz="1"/>
-              <w:bottom w:val="single" w:color="BFBFBF" w:sz="1"/>
-              <w:right w:val="single" w:color="BFBFBF" w:sz="1"/>
-            </w:tcBorders>
-            <w:tcMar>
-              <w:top w:type="dxa" w:w="80"/>
-              <w:left w:type="dxa" w:w="120"/>
-              <w:bottom w:type="dxa" w:w="80"/>
-              <w:right w:type="dxa" w:w="120"/>
-            </w:tcMar>
-            <w:vAlign w:val="top"/>
-          </w:tcPr>
-          <w:p>
-            <w:pPr>
-              <w:spacing w:after="0" w:line="276"/>
-            </w:pPr>
-            <w:r>
-              <w:rPr>
-                <w:rFonts w:ascii="Arial" w:cs="Arial" w:eastAsia="Arial" w:hAnsi="Arial"/>
-                <w:sz w:val="18"/>
-                <w:szCs w:val="18"/>
-              </w:rPr>
-              <w:t xml:space="preserve">Las ventas bajaron cerca de 8 % el mes siguiente al ajuste de precios.</w:t>
-            </w:r>
-          </w:p>
-        </w:tc>
-      </w:tr>
-      <w:tr>
-        <w:tc>
-          <w:tcPr>
-            <w:tcW w:type="dxa" w:w="420"/>
-            <w:tcBorders>
-              <w:top w:val="single" w:color="BFBFBF" w:sz="1"/>
-              <w:left w:val="single" w:color="BFBFBF" w:sz="1"/>
-              <w:bottom w:val="single" w:color="BFBFBF" w:sz="1"/>
-              <w:right w:val="single" w:color="BFBFBF" w:sz="1"/>
-            </w:tcBorders>
-            <w:tcMar>
-              <w:top w:type="dxa" w:w="80"/>
-              <w:left w:type="dxa" w:w="120"/>
-              <w:bottom w:type="dxa" w:w="80"/>
-              <w:right w:type="dxa" w:w="120"/>
-            </w:tcMar>
-            <w:vAlign w:val="top"/>
-          </w:tcPr>
-          <w:p>
-            <w:pPr>
-              <w:spacing w:after="0" w:line="276"/>
-            </w:pPr>
-            <w:r>
-              <w:rPr>
-                <w:rFonts w:ascii="Arial" w:cs="Arial" w:eastAsia="Arial" w:hAnsi="Arial"/>
-                <w:b/>
-                <w:bCs/>
-                <w:sz w:val="20"/>
-                <w:szCs w:val="20"/>
-              </w:rPr>
-              <w:t xml:space="preserve">6</w:t>
-            </w:r>
-          </w:p>
-        </w:tc>
-        <w:tc>
-          <w:tcPr>
-            <w:tcW w:type="dxa" w:w="1880"/>
-            <w:tcBorders>
-              <w:top w:val="single" w:color="BFBFBF" w:sz="1"/>
-              <w:left w:val="single" w:color="BFBFBF" w:sz="1"/>
-              <w:bottom w:val="single" w:color="BFBFBF" w:sz="1"/>
-              <w:right w:val="single" w:color="BFBFBF" w:sz="1"/>
-            </w:tcBorders>
-            <w:tcMar>
-              <w:top w:type="dxa" w:w="80"/>
-              <w:left w:type="dxa" w:w="120"/>
-              <w:bottom w:type="dxa" w:w="80"/>
-              <w:right w:type="dxa" w:w="120"/>
-            </w:tcMar>
-            <w:vAlign w:val="top"/>
-          </w:tcPr>
-          <w:p>
-            <w:pPr>
-              <w:spacing w:after="30" w:line="276"/>
-            </w:pPr>
-            <w:r>
-              <w:rPr>
-                <w:rFonts w:ascii="Arial" w:cs="Arial" w:eastAsia="Arial" w:hAnsi="Arial"/>
-                <w:b/>
-                <w:bCs/>
-                <w:sz w:val="19"/>
-                <w:szCs w:val="19"/>
-              </w:rPr>
-              <w:t xml:space="preserve">Ricardo Antelo</w:t>
-            </w:r>
-          </w:p>
-          <w:p>
-            <w:pPr>
-              <w:spacing w:after="0" w:line="276"/>
-            </w:pPr>
-            <w:r>
-              <w:rPr>
-                <w:rFonts w:ascii="Arial" w:cs="Arial" w:eastAsia="Arial" w:hAnsi="Arial"/>
-                <w:color w:val="595959"/>
-                <w:sz w:val="18"/>
-                <w:szCs w:val="18"/>
-              </w:rPr>
-              <w:t xml:space="preserve">Propietario y responsable de importaciones</w:t>
-            </w:r>
-          </w:p>
-        </w:tc>
-        <w:tc>
-          <w:tcPr>
-            <w:tcW w:type="dxa" w:w="1600"/>
-            <w:tcBorders>
-              <w:top w:val="single" w:color="BFBFBF" w:sz="1"/>
-              <w:left w:val="single" w:color="BFBFBF" w:sz="1"/>
-              <w:bottom w:val="single" w:color="BFBFBF" w:sz="1"/>
-              <w:right w:val="single" w:color="BFBFBF" w:sz="1"/>
-            </w:tcBorders>
-            <w:tcMar>
-              <w:top w:type="dxa" w:w="80"/>
-              <w:left w:type="dxa" w:w="120"/>
-              <w:bottom w:type="dxa" w:w="80"/>
-              <w:right w:type="dxa" w:w="120"/>
-            </w:tcMar>
-            <w:vAlign w:val="top"/>
-          </w:tcPr>
-          <w:p>
-            <w:pPr>
-              <w:spacing w:after="0" w:line="276"/>
-            </w:pPr>
-            <w:r>
-              <w:rPr>
-                <w:rFonts w:ascii="Arial" w:cs="Arial" w:eastAsia="Arial" w:hAnsi="Arial"/>
-                <w:sz w:val="18"/>
-                <w:szCs w:val="18"/>
-              </w:rPr>
-              <w:t xml:space="preserve">Importadora pequeña, 15 años de experiencia</w:t>
-            </w:r>
-          </w:p>
-        </w:tc>
-        <w:tc>
-          <w:tcPr>
-            <w:tcW w:type="dxa" w:w="3300"/>
-            <w:tcBorders>
-              <w:top w:val="single" w:color="BFBFBF" w:sz="1"/>
-              <w:left w:val="single" w:color="BFBFBF" w:sz="1"/>
-              <w:bottom w:val="single" w:color="BFBFBF" w:sz="1"/>
-              <w:right w:val="single" w:color="BFBFBF" w:sz="1"/>
-            </w:tcBorders>
-            <w:tcMar>
-              <w:top w:type="dxa" w:w="80"/>
-              <w:left w:type="dxa" w:w="120"/>
-              <w:bottom w:type="dxa" w:w="80"/>
-              <w:right w:type="dxa" w:w="120"/>
-            </w:tcMar>
-            <w:vAlign w:val="top"/>
-          </w:tcPr>
-          <w:p>
-            <w:pPr>
-              <w:spacing w:after="0" w:line="276"/>
-            </w:pPr>
-            <w:r>
-              <w:rPr>
-                <w:rFonts w:ascii="Arial" w:cs="Arial" w:eastAsia="Arial" w:hAnsi="Arial"/>
-                <w:sz w:val="18"/>
-                <w:szCs w:val="18"/>
-              </w:rPr>
-              <w:t xml:space="preserve">Consiguió buen precio en bombas, correas y kits de distribución, pero la mercadería tardó más de lo previsto. Compró sustitutos en el mercado nacional para no dejar sin atender a sus clientes.</w:t>
-            </w:r>
-          </w:p>
-        </w:tc>
-        <w:tc>
-          <w:tcPr>
-            <w:tcW w:type="dxa" w:w="2438"/>
-            <w:tcBorders>
-              <w:top w:val="single" w:color="BFBFBF" w:sz="1"/>
-              <w:left w:val="single" w:color="BFBFBF" w:sz="1"/>
-              <w:bottom w:val="single" w:color="BFBFBF" w:sz="1"/>
-              <w:right w:val="single" w:color="BFBFBF" w:sz="1"/>
-            </w:tcBorders>
-            <w:tcMar>
-              <w:top w:type="dxa" w:w="80"/>
-              <w:left w:type="dxa" w:w="120"/>
-              <w:bottom w:type="dxa" w:w="80"/>
-              <w:right w:type="dxa" w:w="120"/>
-            </w:tcMar>
-            <w:vAlign w:val="top"/>
-          </w:tcPr>
-          <w:p>
-            <w:pPr>
-              <w:spacing w:after="0" w:line="276"/>
-            </w:pPr>
-            <w:r>
-              <w:rPr>
-                <w:rFonts w:ascii="Arial" w:cs="Arial" w:eastAsia="Arial" w:hAnsi="Arial"/>
-                <w:sz w:val="18"/>
-                <w:szCs w:val="18"/>
-              </w:rPr>
-              <w:t xml:space="preserve">Entre Bs 7.000 y Bs 10.000 menos de ganancia por los sustitutos.</w:t>
-            </w:r>
-          </w:p>
-        </w:tc>
-      </w:tr>
-    </w:tbl>
-    <w:p>
-      <w:pPr>
-        <w:spacing w:after="200" w:line="276"/>
-      </w:pPr>
-      <w:r>
-        <w:rPr>
-          <w:rFonts w:ascii="Arial" w:cs="Arial" w:eastAsia="Arial" w:hAnsi="Arial"/>
-          <w:sz w:val="22"/>
-          <w:szCs w:val="22"/>
-        </w:rPr>
-        <w:t xml:space="preserve"/>
-      </w:r>
-    </w:p>
-    <w:tbl>
-      <w:tblPr>
-        <w:tblW w:type="dxa" w:w="9638"/>
-        <w:tblBorders>
-          <w:top w:val="single" w:color="auto" w:sz="4"/>
-          <w:left w:val="single" w:color="auto" w:sz="4"/>
-          <w:bottom w:val="single" w:color="auto" w:sz="4"/>
-          <w:right w:val="single" w:color="auto" w:sz="4"/>
-          <w:insideH w:val="single" w:color="auto" w:sz="4"/>
-          <w:insideV w:val="single" w:color="auto" w:sz="4"/>
-        </w:tblBorders>
-      </w:tblPr>
-      <w:tblGrid>
-        <w:gridCol w:w="9638"/>
-      </w:tblGrid>
-      <w:tr>
-        <w:tc>
-          <w:tcPr>
-            <w:tcW w:type="dxa" w:w="9638"/>
-            <w:tcBorders>
-              <w:top w:val="single" w:color="BFBFBF" w:sz="1"/>
-              <w:left w:val="single" w:color="BFBFBF" w:sz="1"/>
-              <w:bottom w:val="single" w:color="BFBFBF" w:sz="1"/>
-              <w:right w:val="single" w:color="BFBFBF" w:sz="1"/>
-            </w:tcBorders>
-            <w:shd w:fill="F2F2F2" w:val="clear"/>
-            <w:tcMar>
-              <w:top w:type="dxa" w:w="80"/>
-              <w:left w:type="dxa" w:w="120"/>
-              <w:bottom w:type="dxa" w:w="80"/>
-              <w:right w:type="dxa" w:w="120"/>
-            </w:tcMar>
-            <w:vAlign w:val="top"/>
-          </w:tcPr>
-          <w:p>
-            <w:pPr>
-              <w:spacing w:after="80" w:line="276"/>
-            </w:pPr>
-            <w:r>
-              <w:rPr>
-                <w:rFonts w:ascii="Arial" w:cs="Arial" w:eastAsia="Arial" w:hAnsi="Arial"/>
-                <w:b/>
-                <w:bCs/>
-                <w:color w:val="1F4E79"/>
-                <w:sz w:val="21"/>
-                <w:szCs w:val="21"/>
-              </w:rPr>
-              <w:t xml:space="preserve">Un criterio que aplicamos al armar la lista</w:t>
-            </w:r>
-          </w:p>
-          <w:p>
-            <w:pPr>
-              <w:spacing w:after="0" w:line="276"/>
-            </w:pPr>
-            <w:r>
-              <w:rPr>
-                <w:rFonts w:ascii="Arial" w:cs="Arial" w:eastAsia="Arial" w:hAnsi="Arial"/>
-                <w:sz w:val="20"/>
-                <w:szCs w:val="20"/>
-              </w:rPr>
-              <w:t xml:space="preserve">Todas ocupan el mismo puesto en el proceso, porque mezclar perfiles devuelve respuestas que no se pueden comparar. Y ninguna cifra de la última columna es una estimación nuestra: es lo que la persona dijo cuando se le preguntó qué le había costado aquello que acababa de contar.</w:t>
-            </w:r>
-          </w:p>
-        </w:tc>
-      </w:tr>
-    </w:tbl>
-    <w:p>
-      <w:r>
-        <w:br w:type="page"/>
-      </w:r>
-    </w:p>
-    <w:p>
-      <w:pPr>
-        <w:pStyle w:val="Heading1"/>
-      </w:pPr>
-      <w:r>
-        <w:t xml:space="preserve">3. Template «Tu mejor entrevista»</w:t>
+        <w:t xml:space="preserve">2. Template «Tu mejor entrevista»</w:t>
       </w:r>
     </w:p>
     <w:p>
@@ -2204,7 +849,7 @@
         <w:pStyle w:val="Heading2"/>
       </w:pPr>
       <w:r>
-        <w:t xml:space="preserve">3.1 La situación que relató</w:t>
+        <w:t xml:space="preserve">2.1 La situación que relató</w:t>
       </w:r>
     </w:p>
     <w:p>
@@ -2225,7 +870,7 @@
         <w:pStyle w:val="Heading2"/>
       </w:pPr>
       <w:r>
-        <w:t xml:space="preserve">3.2 Las seis preguntas del template</w:t>
+        <w:t xml:space="preserve">2.2 Las seis preguntas del template</w:t>
       </w:r>
     </w:p>
     <w:tbl>
@@ -2774,7 +1419,7 @@
         <w:pStyle w:val="Heading2"/>
       </w:pPr>
       <w:r>
-        <w:t xml:space="preserve">3.3 Qué dejó esta conversación</w:t>
+        <w:t xml:space="preserve">2.3 Qué dejó esta conversación</w:t>
       </w:r>
     </w:p>
     <w:tbl>
@@ -3072,7 +1717,7 @@
         <w:pStyle w:val="Heading1"/>
       </w:pPr>
       <w:r>
-        <w:t xml:space="preserve">4. Contraste contra el Mapa de Propuesta de Valor</w:t>
+        <w:t xml:space="preserve">3. Contraste contra el Mapa de Propuesta de Valor</w:t>
       </w:r>
     </w:p>
     <w:p>
@@ -4677,7 +3322,7 @@
           <w:sz w:val="22"/>
           <w:szCs w:val="22"/>
         </w:rPr>
-        <w:t xml:space="preserve">Captura del mapa de empatía tal como quedó cargado, con la autoría de cada casilla visible. Es la misma entrevista desarrollada en el punto 3.</w:t>
+        <w:t xml:space="preserve">Captura del mapa de empatía tal como quedó cargado, con la autoría de cada casilla visible. Es la misma entrevista desarrollada en el punto 2.</w:t>
       </w:r>
     </w:p>
     <w:p>

</xml_diff>